<commit_message>
planes de clase actualizados al 15 de febrero
</commit_message>
<xml_diff>
--- a/planesDeClaseSegundo.docx
+++ b/planesDeClaseSegundo.docx
@@ -15,44 +15,22 @@
         <w:rPr>
           <w:lang w:val="de-DE"/>
         </w:rPr>
-        <w:t xml:space="preserve">Zweites Niveau, </w:t>
-      </w:r>
-      <w:r>
-        <w:rPr>
-          <w:lang w:val="de-DE"/>
-        </w:rPr>
-        <w:t xml:space="preserve">dritte </w:t>
-      </w:r>
-      <w:r>
-        <w:rPr>
-          <w:lang w:val="de-DE"/>
-        </w:rPr>
-        <w:t xml:space="preserve">Woche, Montag den </w:t>
-      </w:r>
-      <w:r>
-        <w:rPr>
-          <w:lang w:val="de-DE"/>
-        </w:rPr>
-        <w:t>16</w:t>
-      </w:r>
-      <w:r>
-        <w:rPr>
-          <w:lang w:val="de-DE"/>
-        </w:rPr>
-        <w:t>.02.26</w:t>
-      </w:r>
-    </w:p>
-    <w:p>
-      <w:pPr>
-        <w:pStyle w:val="Normal"/>
-        <w:bidi w:val="0"/>
-        <w:jc w:val="start"/>
-        <w:rPr>
-          <w:lang w:val="de-DE"/>
-        </w:rPr>
-      </w:pPr>
-      <w:r>
-        <w:rPr/>
+        <w:t>Zweites Niveau, dritte Woche, Montag den 16.02.26</w:t>
+      </w:r>
+    </w:p>
+    <w:p>
+      <w:pPr>
+        <w:pStyle w:val="Normal"/>
+        <w:bidi w:val="0"/>
+        <w:jc w:val="start"/>
+        <w:rPr>
+          <w:lang w:val="de-DE"/>
+        </w:rPr>
+      </w:pPr>
+      <w:r>
+        <w:rPr>
+          <w:lang w:val="de-DE"/>
+        </w:rPr>
       </w:r>
     </w:p>
     <w:p>
@@ -84,97 +62,789 @@
         <w:rPr>
           <w:lang w:val="de-DE"/>
         </w:rPr>
-        <w:t>20‘ Wörter lernen mit System: Wörter in Paaren lernen.</w:t>
-      </w:r>
-    </w:p>
-    <w:p>
-      <w:pPr>
-        <w:pStyle w:val="Normal"/>
-        <w:bidi w:val="0"/>
-        <w:jc w:val="start"/>
-        <w:rPr>
-          <w:lang w:val="de-DE"/>
-        </w:rPr>
-      </w:pPr>
-      <w:r>
-        <w:rPr>
-          <w:lang w:val="de-DE"/>
-        </w:rPr>
-      </w:r>
-    </w:p>
-    <w:p>
-      <w:pPr>
-        <w:pStyle w:val="Normal"/>
-        <w:bidi w:val="0"/>
-        <w:jc w:val="start"/>
-        <w:rPr>
-          <w:lang w:val="de-DE"/>
-        </w:rPr>
-      </w:pPr>
-      <w:r>
-        <w:rPr/>
-      </w:r>
-    </w:p>
-    <w:p>
-      <w:pPr>
-        <w:pStyle w:val="Normal"/>
-        <w:bidi w:val="0"/>
-        <w:jc w:val="start"/>
-        <w:rPr>
-          <w:lang w:val="de-DE"/>
-        </w:rPr>
-      </w:pPr>
-      <w:r>
-        <w:rPr/>
-      </w:r>
-    </w:p>
-    <w:p>
-      <w:pPr>
-        <w:pStyle w:val="Normal"/>
-        <w:bidi w:val="0"/>
-        <w:jc w:val="start"/>
-        <w:rPr>
-          <w:lang w:val="de-DE"/>
-        </w:rPr>
-      </w:pPr>
-      <w:r>
-        <w:rPr/>
-      </w:r>
-    </w:p>
-    <w:p>
-      <w:pPr>
-        <w:pStyle w:val="Normal"/>
-        <w:bidi w:val="0"/>
-        <w:jc w:val="start"/>
-        <w:rPr>
-          <w:lang w:val="de-DE"/>
-        </w:rPr>
-      </w:pPr>
-      <w:r>
-        <w:rPr/>
-      </w:r>
-    </w:p>
-    <w:p>
-      <w:pPr>
-        <w:pStyle w:val="Normal"/>
-        <w:bidi w:val="0"/>
-        <w:jc w:val="start"/>
-        <w:rPr>
-          <w:lang w:val="de-DE"/>
-        </w:rPr>
-      </w:pPr>
-      <w:r>
-        <w:rPr/>
-      </w:r>
-    </w:p>
-    <w:p>
-      <w:pPr>
-        <w:pStyle w:val="Normal"/>
-        <w:bidi w:val="0"/>
-        <w:jc w:val="start"/>
-        <w:rPr>
-          <w:lang w:val="de-DE"/>
-        </w:rPr>
+        <w:t>1</w:t>
+      </w:r>
+      <w:r>
+        <w:rPr>
+          <w:lang w:val="de-DE"/>
+        </w:rPr>
+        <w:t>0‘ Wörter lernen mit System: Wörter in Paaren lernen.</w:t>
+      </w:r>
+    </w:p>
+    <w:p>
+      <w:pPr>
+        <w:pStyle w:val="Normal"/>
+        <w:bidi w:val="0"/>
+        <w:jc w:val="start"/>
+        <w:rPr>
+          <w:lang w:val="de-DE"/>
+        </w:rPr>
+      </w:pPr>
+      <w:r>
+        <w:rPr>
+          <w:lang w:val="de-DE"/>
+        </w:rPr>
+        <w:t>5‘ Recuerdan para qué sirven los casos gramaticales? Aprendieron la tabla de casos gramaticales que les puse en el classroom como tarea el 11 de febrero?</w:t>
+      </w:r>
+    </w:p>
+    <w:p>
+      <w:pPr>
+        <w:pStyle w:val="Normal"/>
+        <w:bidi w:val="0"/>
+        <w:jc w:val="start"/>
+        <w:rPr>
+          <w:lang w:val="de-DE"/>
+        </w:rPr>
+      </w:pPr>
+      <w:r>
+        <w:rPr>
+          <w:lang w:val="de-DE"/>
+        </w:rPr>
+        <w:t>5‘ Haz un examen de la tabla. Recomendación: tienen que hacer la tarea.</w:t>
+      </w:r>
+    </w:p>
+    <w:p>
+      <w:pPr>
+        <w:pStyle w:val="Normal"/>
+        <w:bidi w:val="0"/>
+        <w:jc w:val="start"/>
+        <w:rPr>
+          <w:lang w:val="de-DE"/>
+        </w:rPr>
+      </w:pPr>
+      <w:r>
+        <w:rPr>
+          <w:lang w:val="de-DE"/>
+        </w:rPr>
+        <w:t>30‘ Die Kommode steht an der Wand.</w:t>
+      </w:r>
+    </w:p>
+    <w:p>
+      <w:pPr>
+        <w:pStyle w:val="Normal"/>
+        <w:bidi w:val="0"/>
+        <w:jc w:val="start"/>
+        <w:rPr>
+          <w:lang w:val="de-DE"/>
+        </w:rPr>
+      </w:pPr>
+      <w:r>
+        <w:rPr>
+          <w:lang w:val="de-DE"/>
+        </w:rPr>
+        <w:t>a) Welches Bild passt? Sehen Sie die Bilder an und ordnen Sie zu.</w:t>
+      </w:r>
+    </w:p>
+    <w:p>
+      <w:pPr>
+        <w:pStyle w:val="Normal"/>
+        <w:bidi w:val="0"/>
+        <w:jc w:val="start"/>
+        <w:rPr>
+          <w:lang w:val="de-DE"/>
+        </w:rPr>
+      </w:pPr>
+      <w:r>
+        <w:rPr>
+          <w:lang w:val="de-DE"/>
+        </w:rPr>
+        <w:t>b) Lesen Sie und sprechen Sie schnell.</w:t>
+      </w:r>
+    </w:p>
+    <w:p>
+      <w:pPr>
+        <w:pStyle w:val="Normal"/>
+        <w:bidi w:val="0"/>
+        <w:jc w:val="start"/>
+        <w:rPr>
+          <w:lang w:val="de-DE"/>
+        </w:rPr>
+      </w:pPr>
+      <w:r>
+        <w:rPr>
+          <w:lang w:val="de-DE"/>
+        </w:rPr>
+        <w:t>c) Beschreiben Sie ein Bild. Die anderen raten.</w:t>
+      </w:r>
+    </w:p>
+    <w:p>
+      <w:pPr>
+        <w:pStyle w:val="Normal"/>
+        <w:bidi w:val="0"/>
+        <w:jc w:val="start"/>
+        <w:rPr>
+          <w:lang w:val="de-DE"/>
+        </w:rPr>
+      </w:pPr>
+      <w:r>
+        <w:rPr>
+          <w:lang w:val="de-DE"/>
+        </w:rPr>
+        <w:t>--------------------</w:t>
+      </w:r>
+    </w:p>
+    <w:p>
+      <w:pPr>
+        <w:pStyle w:val="Normal"/>
+        <w:bidi w:val="0"/>
+        <w:jc w:val="start"/>
+        <w:rPr>
+          <w:lang w:val="de-DE"/>
+        </w:rPr>
+      </w:pPr>
+      <w:r>
+        <w:rPr>
+          <w:lang w:val="de-DE"/>
+        </w:rPr>
+        <w:t>30‘ Zimmer beschreiben.</w:t>
+      </w:r>
+    </w:p>
+    <w:p>
+      <w:pPr>
+        <w:pStyle w:val="Normal"/>
+        <w:bidi w:val="0"/>
+        <w:jc w:val="start"/>
+        <w:rPr>
+          <w:lang w:val="de-DE"/>
+        </w:rPr>
+      </w:pPr>
+      <w:r>
+        <w:rPr>
+          <w:lang w:val="de-DE"/>
+        </w:rPr>
+        <w:t>Die KT teuschen Ihre Fotos und sie schreiben eine Zimmer-Beschreibung. Das Ergebnis in Classroom eingereicht damit alle die verschiedenen Texte lesen können. Welche ist die beste Beschreibung?</w:t>
+      </w:r>
+    </w:p>
+    <w:p>
+      <w:pPr>
+        <w:pStyle w:val="Normal"/>
+        <w:bidi w:val="0"/>
+        <w:jc w:val="start"/>
+        <w:rPr>
+          <w:lang w:val="de-DE"/>
+        </w:rPr>
+      </w:pPr>
+      <w:r>
+        <w:rPr>
+          <w:lang w:val="de-DE"/>
+        </w:rPr>
+        <w:t>20‘ Wir brauchen ein Sofa</w:t>
+      </w:r>
+    </w:p>
+    <w:p>
+      <w:pPr>
+        <w:pStyle w:val="Normal"/>
+        <w:bidi w:val="0"/>
+        <w:jc w:val="start"/>
+        <w:rPr>
+          <w:lang w:val="de-DE"/>
+        </w:rPr>
+      </w:pPr>
+      <w:r>
+        <w:rPr>
+          <w:lang w:val="de-DE"/>
+        </w:rPr>
+        <w:t>a) Was brauchen Ana und Jannis? Hören Sie den Dialog. Notieren Sie.</w:t>
+      </w:r>
+    </w:p>
+    <w:p>
+      <w:pPr>
+        <w:pStyle w:val="Normal"/>
+        <w:bidi w:val="0"/>
+        <w:jc w:val="start"/>
+        <w:rPr>
+          <w:lang w:val="de-DE"/>
+        </w:rPr>
+      </w:pPr>
+      <w:r>
+        <w:rPr>
+          <w:lang w:val="de-DE"/>
+        </w:rPr>
+        <w:t>b) Finden Sie Paare und ordnen Sie zu.</w:t>
+      </w:r>
+    </w:p>
+    <w:p>
+      <w:pPr>
+        <w:pStyle w:val="Normal"/>
+        <w:bidi w:val="0"/>
+        <w:jc w:val="start"/>
+        <w:rPr>
+          <w:lang w:val="de-DE"/>
+        </w:rPr>
+      </w:pPr>
+      <w:r>
+        <w:rPr>
+          <w:lang w:val="de-DE"/>
+        </w:rPr>
+        <w:t>c) Wer sagt was? Hören Sie noch einmal. Anna (A) oder Jannis (J)? Ergänzen Sie.</w:t>
+      </w:r>
+    </w:p>
+    <w:p>
+      <w:pPr>
+        <w:pStyle w:val="Normal"/>
+        <w:bidi w:val="0"/>
+        <w:jc w:val="start"/>
+        <w:rPr>
+          <w:lang w:val="de-DE"/>
+        </w:rPr>
+      </w:pPr>
+      <w:r>
+        <w:rPr>
+          <w:lang w:val="de-DE"/>
+        </w:rPr>
+      </w:r>
+    </w:p>
+    <w:p>
+      <w:pPr>
+        <w:pStyle w:val="Normal"/>
+        <w:bidi w:val="0"/>
+        <w:jc w:val="start"/>
+        <w:rPr>
+          <w:lang w:val="de-DE"/>
+        </w:rPr>
+      </w:pPr>
+      <w:r>
+        <w:rPr>
+          <w:lang w:val="de-DE"/>
+        </w:rPr>
+        <w:t>Hausaufgabe: S. 128, Wie findest du…? S. 129, ein Tiny House beschreiben.</w:t>
+      </w:r>
+    </w:p>
+    <w:p>
+      <w:pPr>
+        <w:pStyle w:val="Normal"/>
+        <w:bidi w:val="0"/>
+        <w:jc w:val="start"/>
+        <w:rPr>
+          <w:lang w:val="de-DE"/>
+        </w:rPr>
+      </w:pPr>
+      <w:r>
+        <w:rPr>
+          <w:lang w:val="de-DE"/>
+        </w:rPr>
+        <w:t>-----------------------------------------------------------------------------------------------------</w:t>
+      </w:r>
+    </w:p>
+    <w:p>
+      <w:pPr>
+        <w:pStyle w:val="Normal"/>
+        <w:bidi w:val="0"/>
+        <w:jc w:val="start"/>
+        <w:rPr>
+          <w:lang w:val="de-DE"/>
+        </w:rPr>
+      </w:pPr>
+      <w:r>
+        <w:rPr/>
+        <w:t>Viert</w:t>
+      </w:r>
+      <w:r>
+        <w:rPr/>
+        <w:t>es Niveau, dritte Woche, Montag den 16.02.26</w:t>
+      </w:r>
+    </w:p>
+    <w:p>
+      <w:pPr>
+        <w:pStyle w:val="Normal"/>
+        <w:bidi w:val="0"/>
+        <w:jc w:val="start"/>
+        <w:rPr>
+          <w:lang w:val="de-DE"/>
+        </w:rPr>
+      </w:pPr>
+      <w:r>
+        <w:rPr/>
+      </w:r>
+    </w:p>
+    <w:p>
+      <w:pPr>
+        <w:pStyle w:val="Normal"/>
+        <w:bidi w:val="0"/>
+        <w:jc w:val="start"/>
+        <w:rPr>
+          <w:lang w:val="de-DE"/>
+        </w:rPr>
+      </w:pPr>
+      <w:r>
+        <w:rPr/>
+        <w:t>60‘ Valentinsparty</w:t>
+      </w:r>
+    </w:p>
+    <w:p>
+      <w:pPr>
+        <w:pStyle w:val="Normal"/>
+        <w:bidi w:val="0"/>
+        <w:jc w:val="start"/>
+        <w:rPr>
+          <w:lang w:val="de-DE"/>
+        </w:rPr>
+      </w:pPr>
+      <w:r>
+        <w:rPr/>
+        <w:t>60‘ Wiederholung von den Themes aus Lektion 5 und 6.</w:t>
+      </w:r>
+    </w:p>
+    <w:p>
+      <w:pPr>
+        <w:pStyle w:val="Normal"/>
+        <w:bidi w:val="0"/>
+        <w:jc w:val="start"/>
+        <w:rPr>
+          <w:lang w:val="de-DE"/>
+        </w:rPr>
+      </w:pPr>
+      <w:r>
+        <w:rPr/>
+      </w:r>
+    </w:p>
+    <w:p>
+      <w:pPr>
+        <w:pStyle w:val="Normal"/>
+        <w:bidi w:val="0"/>
+        <w:jc w:val="start"/>
+        <w:rPr>
+          <w:lang w:val="de-DE"/>
+        </w:rPr>
+      </w:pPr>
+      <w:r>
+        <w:rPr>
+          <w:lang w:val="de-DE"/>
+        </w:rPr>
+        <w:t>-----------------------------------------------------------------------------------------------------</w:t>
+      </w:r>
+    </w:p>
+    <w:p>
+      <w:pPr>
+        <w:pStyle w:val="Normal"/>
+        <w:bidi w:val="0"/>
+        <w:jc w:val="start"/>
+        <w:rPr>
+          <w:lang w:val="de-DE"/>
+        </w:rPr>
+      </w:pPr>
+      <w:r>
+        <w:rPr/>
+        <w:t xml:space="preserve">Sechstes </w:t>
+      </w:r>
+      <w:r>
+        <w:rPr/>
+        <w:t>Niveau, dritte Woche, Montag den 16.02.26</w:t>
+      </w:r>
+    </w:p>
+    <w:p>
+      <w:pPr>
+        <w:pStyle w:val="Normal"/>
+        <w:bidi w:val="0"/>
+        <w:jc w:val="start"/>
+        <w:rPr>
+          <w:lang w:val="de-DE"/>
+        </w:rPr>
+      </w:pPr>
+      <w:r>
+        <w:rPr/>
+      </w:r>
+    </w:p>
+    <w:p>
+      <w:pPr>
+        <w:pStyle w:val="Normal"/>
+        <w:bidi w:val="0"/>
+        <w:jc w:val="start"/>
+        <w:rPr>
+          <w:lang w:val="de-DE"/>
+        </w:rPr>
+      </w:pPr>
+      <w:r>
+        <w:rPr/>
+        <w:t>30‘ Sätze mit „nachdem“. Schreiben Sie drei Sätze mit nachdem. Tauschen Sie dann ihre Sätze mit eienm Partner. Kontrollieren Sie sich gegenseitig.</w:t>
+      </w:r>
+    </w:p>
+    <w:p>
+      <w:pPr>
+        <w:pStyle w:val="Normal"/>
+        <w:bidi w:val="0"/>
+        <w:jc w:val="start"/>
+        <w:rPr>
+          <w:lang w:val="de-DE"/>
+        </w:rPr>
+      </w:pPr>
+      <w:r>
+        <w:rPr/>
+        <w:t>Und ihre Freundschaftsgeschichte? Schreiben Sie einen Text wie in 2b.</w:t>
+      </w:r>
+    </w:p>
+    <w:p>
+      <w:pPr>
+        <w:pStyle w:val="Normal"/>
+        <w:bidi w:val="0"/>
+        <w:jc w:val="start"/>
+        <w:rPr>
+          <w:lang w:val="de-DE"/>
+        </w:rPr>
+      </w:pPr>
+      <w:r>
+        <w:rPr/>
+      </w:r>
+    </w:p>
+    <w:p>
+      <w:pPr>
+        <w:pStyle w:val="Normal"/>
+        <w:bidi w:val="0"/>
+        <w:jc w:val="start"/>
+        <w:rPr>
+          <w:lang w:val="de-DE"/>
+        </w:rPr>
+      </w:pPr>
+      <w:r>
+        <w:rPr/>
+        <w:t>90</w:t>
+      </w:r>
+      <w:r>
+        <w:rPr/>
+        <w:t>‘ Richtig streiten</w:t>
+      </w:r>
+    </w:p>
+    <w:p>
+      <w:pPr>
+        <w:pStyle w:val="Normal"/>
+        <w:bidi w:val="0"/>
+        <w:jc w:val="start"/>
+        <w:rPr>
+          <w:lang w:val="de-DE"/>
+        </w:rPr>
+      </w:pPr>
+      <w:r>
+        <w:rPr/>
+        <w:t>6a sehen Sie die Fotos an. Was könnte hier der Konflikt sein? Kennen Sie andere Konfliktssituationen?</w:t>
+      </w:r>
+    </w:p>
+    <w:p>
+      <w:pPr>
+        <w:pStyle w:val="Normal"/>
+        <w:bidi w:val="0"/>
+        <w:jc w:val="start"/>
+        <w:rPr>
+          <w:lang w:val="de-DE"/>
+        </w:rPr>
+      </w:pPr>
+      <w:r>
+        <w:rPr/>
+        <w:t>6b Hören Sie die Gespräche. Was ist der Konflikt? Waren Ihre Vermutungen richtig?</w:t>
+      </w:r>
+    </w:p>
+    <w:p>
+      <w:pPr>
+        <w:pStyle w:val="Normal"/>
+        <w:bidi w:val="0"/>
+        <w:jc w:val="start"/>
+        <w:rPr>
+          <w:lang w:val="de-DE"/>
+        </w:rPr>
+      </w:pPr>
+      <w:r>
+        <w:rPr/>
+        <w:t>6c Ordnen Sie die Sätze zu. Hören Sie dann noch einmal zur Kontrolle.</w:t>
+      </w:r>
+    </w:p>
+    <w:p>
+      <w:pPr>
+        <w:pStyle w:val="Normal"/>
+        <w:bidi w:val="0"/>
+        <w:jc w:val="start"/>
+        <w:rPr>
+          <w:lang w:val="de-DE"/>
+        </w:rPr>
+      </w:pPr>
+      <w:r>
+        <w:rPr/>
+        <w:t xml:space="preserve">6d Lesen Sie die Regel und schreiben Sie Sätze mit </w:t>
+      </w:r>
+      <w:r>
+        <w:rPr>
+          <w:i/>
+          <w:iCs/>
+        </w:rPr>
+        <w:t>seit</w:t>
+      </w:r>
+      <w:r>
+        <w:rPr>
+          <w:i w:val="false"/>
+          <w:iCs w:val="false"/>
+        </w:rPr>
+        <w:t xml:space="preserve">, </w:t>
+      </w:r>
+      <w:r>
+        <w:rPr>
+          <w:i/>
+          <w:iCs/>
+        </w:rPr>
+        <w:t>während</w:t>
+      </w:r>
+      <w:r>
+        <w:rPr>
+          <w:i w:val="false"/>
+          <w:iCs w:val="false"/>
+        </w:rPr>
+        <w:t xml:space="preserve">, </w:t>
+      </w:r>
+      <w:r>
+        <w:rPr>
+          <w:i/>
+          <w:iCs/>
+        </w:rPr>
+        <w:t>bis</w:t>
+      </w:r>
+      <w:r>
+        <w:rPr>
+          <w:i w:val="false"/>
+          <w:iCs w:val="false"/>
+        </w:rPr>
+        <w:t xml:space="preserve"> und </w:t>
+      </w:r>
+      <w:r>
+        <w:rPr>
+          <w:i/>
+          <w:iCs/>
+        </w:rPr>
+        <w:t>bevor</w:t>
+      </w:r>
+      <w:r>
+        <w:rPr>
+          <w:i w:val="false"/>
+          <w:iCs w:val="false"/>
+        </w:rPr>
+        <w:t>.</w:t>
+      </w:r>
+    </w:p>
+    <w:p>
+      <w:pPr>
+        <w:pStyle w:val="Normal"/>
+        <w:bidi w:val="0"/>
+        <w:jc w:val="start"/>
+        <w:rPr>
+          <w:lang w:val="de-DE"/>
+        </w:rPr>
+      </w:pPr>
+      <w:r>
+        <w:rPr>
+          <w:i w:val="false"/>
+          <w:iCs w:val="false"/>
+        </w:rPr>
+        <w:t>„</w:t>
+      </w:r>
+      <w:r>
+        <w:rPr>
+          <w:i w:val="false"/>
+          <w:iCs w:val="false"/>
+        </w:rPr>
+        <w:t>Bevor wir essen, musst du den Tisch decken.“</w:t>
+      </w:r>
+    </w:p>
+    <w:p>
+      <w:pPr>
+        <w:pStyle w:val="Normal"/>
+        <w:bidi w:val="0"/>
+        <w:jc w:val="start"/>
+        <w:rPr>
+          <w:lang w:val="de-DE"/>
+        </w:rPr>
+      </w:pPr>
+      <w:r>
+        <w:rPr>
+          <w:i w:val="false"/>
+          <w:iCs w:val="false"/>
+        </w:rPr>
+        <w:t>„</w:t>
+      </w:r>
+      <w:r>
+        <w:rPr>
+          <w:i w:val="false"/>
+          <w:iCs w:val="false"/>
+        </w:rPr>
+        <w:t>Kurz bevor er starb, änderte er das Testament.“</w:t>
+      </w:r>
+    </w:p>
+    <w:p>
+      <w:pPr>
+        <w:pStyle w:val="Normal"/>
+        <w:bidi w:val="0"/>
+        <w:jc w:val="start"/>
+        <w:rPr>
+          <w:lang w:val="de-DE"/>
+        </w:rPr>
+      </w:pPr>
+      <w:r>
+        <w:rPr>
+          <w:i w:val="false"/>
+          <w:iCs w:val="false"/>
+        </w:rPr>
+        <w:t>„</w:t>
+      </w:r>
+      <w:r>
+        <w:rPr>
+          <w:i w:val="false"/>
+          <w:iCs w:val="false"/>
+        </w:rPr>
+        <w:t>Bevor du nicht genügend Geld verdienst, kannst du dir kein Auto kaufen.“ (erst musst du genügend Geld verdienen, dann kannst du dir ein Auto kaufen)</w:t>
+      </w:r>
+    </w:p>
+    <w:p>
+      <w:pPr>
+        <w:pStyle w:val="Normal"/>
+        <w:bidi w:val="0"/>
+        <w:jc w:val="start"/>
+        <w:rPr>
+          <w:u w:val="none"/>
+        </w:rPr>
+      </w:pPr>
+      <w:r>
+        <w:rPr>
+          <w:u w:val="none"/>
+        </w:rPr>
+        <w:t>6e Wie heißen die Sätze in 6d in Ihrer Sprache? Vergleichen Sie.</w:t>
+      </w:r>
+    </w:p>
+    <w:p>
+      <w:pPr>
+        <w:pStyle w:val="Normal"/>
+        <w:bidi w:val="0"/>
+        <w:jc w:val="start"/>
+        <w:rPr/>
+      </w:pPr>
+      <w:r>
+        <w:rPr>
+          <w:u w:val="none"/>
+        </w:rPr>
+        <w:t xml:space="preserve">7 Spielen Sie zu viert. Jeder schreibt fünf Nebensätze mit </w:t>
+      </w:r>
+      <w:r>
+        <w:rPr>
+          <w:i/>
+          <w:iCs/>
+          <w:u w:val="none"/>
+        </w:rPr>
+        <w:t>nachdem</w:t>
+      </w:r>
+      <w:r>
+        <w:rPr>
+          <w:i w:val="false"/>
+          <w:iCs w:val="false"/>
+          <w:u w:val="none"/>
+        </w:rPr>
+        <w:t xml:space="preserve">, </w:t>
+      </w:r>
+      <w:r>
+        <w:rPr>
+          <w:i/>
+          <w:iCs/>
+          <w:u w:val="none"/>
+        </w:rPr>
+        <w:t>seit/</w:t>
+      </w:r>
+      <w:r>
+        <w:rPr>
+          <w:i/>
+          <w:iCs/>
+          <w:u w:val="none"/>
+        </w:rPr>
+        <w:t>seitdem,</w:t>
+      </w:r>
+      <w:r>
+        <w:rPr>
+          <w:i w:val="false"/>
+          <w:iCs w:val="false"/>
+          <w:u w:val="none"/>
+        </w:rPr>
+        <w:t xml:space="preserve"> </w:t>
+      </w:r>
+      <w:r>
+        <w:rPr>
+          <w:i/>
+          <w:iCs/>
+          <w:u w:val="none"/>
+        </w:rPr>
+        <w:t>während</w:t>
+      </w:r>
+      <w:r>
+        <w:rPr>
+          <w:i w:val="false"/>
+          <w:iCs w:val="false"/>
+          <w:u w:val="none"/>
+        </w:rPr>
+        <w:t xml:space="preserve">, </w:t>
+      </w:r>
+      <w:r>
+        <w:rPr>
+          <w:i/>
+          <w:iCs/>
+          <w:u w:val="none"/>
+        </w:rPr>
+        <w:t>bis</w:t>
+      </w:r>
+      <w:r>
+        <w:rPr>
+          <w:i w:val="false"/>
+          <w:iCs w:val="false"/>
+          <w:u w:val="none"/>
+        </w:rPr>
+        <w:t xml:space="preserve"> und </w:t>
+      </w:r>
+      <w:r>
+        <w:rPr>
+          <w:i/>
+          <w:iCs/>
+          <w:u w:val="none"/>
+        </w:rPr>
+        <w:t>bevor</w:t>
+      </w:r>
+      <w:r>
+        <w:rPr>
+          <w:i w:val="false"/>
+          <w:iCs w:val="false"/>
+          <w:u w:val="none"/>
+        </w:rPr>
+        <w:t xml:space="preserve"> </w:t>
+      </w:r>
+      <w:r>
+        <w:rPr>
+          <w:i w:val="false"/>
+          <w:iCs w:val="false"/>
+          <w:u w:val="none"/>
+        </w:rPr>
+        <w:t>auf Karten. Mischen Sie alle Karten. Ziehen Sie abwechselnd eine Karte und ergänzen Sie den Satz. Die letzten 30 Minuten werden dem Zertifikat B1 gewidmet.</w:t>
+      </w:r>
+      <w:r>
+        <w:br w:type="page"/>
+      </w:r>
+    </w:p>
+    <w:p>
+      <w:pPr>
+        <w:pStyle w:val="Normal"/>
+        <w:bidi w:val="0"/>
+        <w:jc w:val="start"/>
+        <w:rPr/>
+      </w:pPr>
+      <w:r>
+        <w:rPr/>
+      </w:r>
+    </w:p>
+    <w:p>
+      <w:pPr>
+        <w:pStyle w:val="Normal"/>
+        <w:bidi w:val="0"/>
+        <w:jc w:val="start"/>
+        <w:rPr/>
+      </w:pPr>
+      <w:r>
+        <w:rPr/>
+      </w:r>
+    </w:p>
+    <w:p>
+      <w:pPr>
+        <w:pStyle w:val="Normal"/>
+        <w:bidi w:val="0"/>
+        <w:jc w:val="start"/>
+        <w:rPr/>
       </w:pPr>
       <w:r>
         <w:rPr/>
@@ -858,8 +1528,8 @@
       <w:lang w:val="de-DE" w:eastAsia="zh-CN" w:bidi="hi-IN"/>
     </w:rPr>
   </w:style>
-  <w:style w:type="paragraph" w:styleId="Ttulo">
-    <w:name w:val="Título"/>
+  <w:style w:type="paragraph" w:styleId="Heading">
+    <w:name w:val="Heading"/>
     <w:basedOn w:val="Normal"/>
     <w:next w:val="BodyText"/>
     <w:qFormat/>
@@ -868,7 +1538,7 @@
       <w:spacing w:before="240" w:after="120"/>
     </w:pPr>
     <w:rPr>
-      <w:rFonts w:ascii="Liberation Sans" w:hAnsi="Liberation Sans" w:eastAsia="Noto Sans CJK SC" w:cs="Noto Sans Devanagari"/>
+      <w:rFonts w:ascii="Liberation Sans" w:hAnsi="Liberation Sans" w:eastAsia="Noto Sans CJK SC" w:cs="FreeSans"/>
       <w:sz w:val="28"/>
       <w:szCs w:val="28"/>
     </w:rPr>
@@ -903,6 +1573,32 @@
       <w:iCs/>
       <w:sz w:val="24"/>
       <w:szCs w:val="24"/>
+    </w:rPr>
+  </w:style>
+  <w:style w:type="paragraph" w:styleId="Index">
+    <w:name w:val="Index"/>
+    <w:basedOn w:val="Normal"/>
+    <w:qFormat/>
+    <w:pPr>
+      <w:suppressLineNumbers/>
+    </w:pPr>
+    <w:rPr>
+      <w:rFonts w:cs="FreeSans"/>
+    </w:rPr>
+  </w:style>
+  <w:style w:type="paragraph" w:styleId="Ttulo">
+    <w:name w:val="Título"/>
+    <w:basedOn w:val="Normal"/>
+    <w:next w:val="BodyText"/>
+    <w:qFormat/>
+    <w:pPr>
+      <w:keepNext w:val="true"/>
+      <w:spacing w:before="240" w:after="120"/>
+    </w:pPr>
+    <w:rPr>
+      <w:rFonts w:ascii="Liberation Sans" w:hAnsi="Liberation Sans" w:eastAsia="Noto Sans CJK SC" w:cs="Noto Sans Devanagari"/>
+      <w:sz w:val="28"/>
+      <w:szCs w:val="28"/>
     </w:rPr>
   </w:style>
   <w:style w:type="paragraph" w:styleId="ndice">

</xml_diff>

<commit_message>
Correciones de typos en la planeanción de clase
</commit_message>
<xml_diff>
--- a/planesDeClaseSegundo.docx
+++ b/planesDeClaseSegundo.docx
@@ -1,6 +1,6 @@
 
 <file path=word/document.xml><?xml version="1.0" encoding="utf-8"?>
-<w:document xmlns:o="urn:schemas-microsoft-com:office:office" xmlns:r="http://schemas.openxmlformats.org/officeDocument/2006/relationships" xmlns:v="urn:schemas-microsoft-com:vml" xmlns:w="http://schemas.openxmlformats.org/wordprocessingml/2006/main" xmlns:w10="urn:schemas-microsoft-com:office:word" xmlns:wp="http://schemas.openxmlformats.org/drawingml/2006/wordprocessingDrawing" xmlns:wps="http://schemas.microsoft.com/office/word/2010/wordprocessingShape" xmlns:wpg="http://schemas.microsoft.com/office/word/2010/wordprocessingGroup" xmlns:mc="http://schemas.openxmlformats.org/markup-compatibility/2006" xmlns:wp14="http://schemas.microsoft.com/office/word/2010/wordprocessingDrawing" xmlns:w14="http://schemas.microsoft.com/office/word/2010/wordml" xmlns:w15="http://schemas.microsoft.com/office/word/2012/wordml" mc:Ignorable="w14 wp14 w15">
+<w:document xmlns:o="urn:schemas-microsoft-com:office:office" xmlns:r="http://schemas.openxmlformats.org/officeDocument/2006/relationships" xmlns:v="urn:schemas-microsoft-com:vml" xmlns:w="http://schemas.openxmlformats.org/wordprocessingml/2006/main" xmlns:w10="urn:schemas-microsoft-com:office:word" xmlns:wp="http://schemas.openxmlformats.org/drawingml/2006/wordprocessingDrawing" xmlns:pic="http://schemas.openxmlformats.org/drawingml/2006/picture" xmlns:wps="http://schemas.microsoft.com/office/word/2010/wordprocessingShape" xmlns:wpg="http://schemas.microsoft.com/office/word/2010/wordprocessingGroup" xmlns:mc="http://schemas.openxmlformats.org/markup-compatibility/2006" xmlns:wp14="http://schemas.microsoft.com/office/word/2010/wordprocessingDrawing" xmlns:w14="http://schemas.microsoft.com/office/word/2010/wordml" xmlns:w15="http://schemas.microsoft.com/office/word/2012/wordml" mc:Ignorable="w14 wp14 w15">
   <w:body>
     <w:p>
       <w:pPr>
@@ -62,13 +62,7 @@
         <w:rPr>
           <w:lang w:val="de-DE"/>
         </w:rPr>
-        <w:t>1</w:t>
-      </w:r>
-      <w:r>
-        <w:rPr>
-          <w:lang w:val="de-DE"/>
-        </w:rPr>
-        <w:t>0‘ Wörter lernen mit System: Wörter in Paaren lernen.</w:t>
+        <w:t>10‘ Wörter lernen mit System: Wörter in Paaren lernen.</w:t>
       </w:r>
     </w:p>
     <w:p>
@@ -212,7 +206,43 @@
         <w:rPr>
           <w:lang w:val="de-DE"/>
         </w:rPr>
-        <w:t>Die KT teuschen Ihre Fotos und sie schreiben eine Zimmer-Beschreibung. Das Ergebnis in Classroom eingereicht damit alle die verschiedenen Texte lesen können. Welche ist die beste Beschreibung?</w:t>
+        <w:t>Die KT t</w:t>
+      </w:r>
+      <w:r>
+        <w:rPr>
+          <w:lang w:val="de-DE"/>
+        </w:rPr>
+        <w:t>a</w:t>
+      </w:r>
+      <w:r>
+        <w:rPr>
+          <w:lang w:val="de-DE"/>
+        </w:rPr>
+        <w:t xml:space="preserve">uschen Ihre Fotos und schreiben eine Zimmer-Beschreibung. Das Ergebnis </w:t>
+      </w:r>
+      <w:r>
+        <w:rPr>
+          <w:lang w:val="de-DE"/>
+        </w:rPr>
+        <w:t>wird</w:t>
+      </w:r>
+      <w:r>
+        <w:rPr>
+          <w:lang w:val="de-DE"/>
+        </w:rPr>
+        <w:t xml:space="preserve"> in Classroom eingereicht damit alle </w:t>
+      </w:r>
+      <w:r>
+        <w:rPr>
+          <w:lang w:val="de-DE"/>
+        </w:rPr>
+        <w:t xml:space="preserve">Ktn </w:t>
+      </w:r>
+      <w:r>
+        <w:rPr>
+          <w:lang w:val="de-DE"/>
+        </w:rPr>
+        <w:t>die verschiedenen Texte lesen können. Welche ist die beste Beschreibung?</w:t>
       </w:r>
     </w:p>
     <w:p>
@@ -337,24 +367,22 @@
       </w:pPr>
       <w:r>
         <w:rPr/>
-        <w:t>Viert</w:t>
-      </w:r>
-      <w:r>
-        <w:rPr/>
-        <w:t>es Niveau, dritte Woche, Montag den 16.02.26</w:t>
-      </w:r>
-    </w:p>
-    <w:p>
-      <w:pPr>
-        <w:pStyle w:val="Normal"/>
-        <w:bidi w:val="0"/>
-        <w:jc w:val="start"/>
-        <w:rPr>
-          <w:lang w:val="de-DE"/>
-        </w:rPr>
-      </w:pPr>
-      <w:r>
-        <w:rPr/>
+        <w:t>Viertes Niveau, dritte Woche, Montag den 16.02.26</w:t>
+      </w:r>
+    </w:p>
+    <w:p>
+      <w:pPr>
+        <w:pStyle w:val="Normal"/>
+        <w:bidi w:val="0"/>
+        <w:jc w:val="start"/>
+        <w:rPr>
+          <w:lang w:val="de-DE"/>
+        </w:rPr>
+      </w:pPr>
+      <w:r>
+        <w:rPr>
+          <w:lang w:val="de-DE"/>
+        </w:rPr>
       </w:r>
     </w:p>
     <w:p>
@@ -382,20 +410,30 @@
       </w:pPr>
       <w:r>
         <w:rPr/>
-        <w:t>60‘ Wiederholung von den Themes aus Lektion 5 und 6.</w:t>
-      </w:r>
-    </w:p>
-    <w:p>
-      <w:pPr>
-        <w:pStyle w:val="Normal"/>
-        <w:bidi w:val="0"/>
-        <w:jc w:val="start"/>
-        <w:rPr>
-          <w:lang w:val="de-DE"/>
-        </w:rPr>
-      </w:pPr>
-      <w:r>
-        <w:rPr/>
+        <w:t>60‘ Wiederholung von den Theme</w:t>
+      </w:r>
+      <w:r>
+        <w:rPr/>
+        <w:t>n</w:t>
+      </w:r>
+      <w:r>
+        <w:rPr/>
+        <w:t xml:space="preserve"> aus Lektion 5 und 6.</w:t>
+      </w:r>
+    </w:p>
+    <w:p>
+      <w:pPr>
+        <w:pStyle w:val="Normal"/>
+        <w:bidi w:val="0"/>
+        <w:jc w:val="start"/>
+        <w:rPr>
+          <w:lang w:val="de-DE"/>
+        </w:rPr>
+      </w:pPr>
+      <w:r>
+        <w:rPr>
+          <w:lang w:val="de-DE"/>
+        </w:rPr>
       </w:r>
     </w:p>
     <w:p>
@@ -425,38 +463,44 @@
       </w:pPr>
       <w:r>
         <w:rPr/>
-        <w:t xml:space="preserve">Sechstes </w:t>
-      </w:r>
-      <w:r>
-        <w:rPr/>
-        <w:t>Niveau, dritte Woche, Montag den 16.02.26</w:t>
-      </w:r>
-    </w:p>
-    <w:p>
-      <w:pPr>
-        <w:pStyle w:val="Normal"/>
-        <w:bidi w:val="0"/>
-        <w:jc w:val="start"/>
-        <w:rPr>
-          <w:lang w:val="de-DE"/>
-        </w:rPr>
-      </w:pPr>
-      <w:r>
-        <w:rPr/>
-      </w:r>
-    </w:p>
-    <w:p>
-      <w:pPr>
-        <w:pStyle w:val="Normal"/>
-        <w:bidi w:val="0"/>
-        <w:jc w:val="start"/>
-        <w:rPr>
-          <w:lang w:val="de-DE"/>
-        </w:rPr>
-      </w:pPr>
-      <w:r>
-        <w:rPr/>
-        <w:t>30‘ Sätze mit „nachdem“. Schreiben Sie drei Sätze mit nachdem. Tauschen Sie dann ihre Sätze mit eienm Partner. Kontrollieren Sie sich gegenseitig.</w:t>
+        <w:t>Sechstes Niveau, dritte Woche, Montag den 16.02.26</w:t>
+      </w:r>
+    </w:p>
+    <w:p>
+      <w:pPr>
+        <w:pStyle w:val="Normal"/>
+        <w:bidi w:val="0"/>
+        <w:jc w:val="start"/>
+        <w:rPr>
+          <w:lang w:val="de-DE"/>
+        </w:rPr>
+      </w:pPr>
+      <w:r>
+        <w:rPr>
+          <w:lang w:val="de-DE"/>
+        </w:rPr>
+      </w:r>
+    </w:p>
+    <w:p>
+      <w:pPr>
+        <w:pStyle w:val="Normal"/>
+        <w:bidi w:val="0"/>
+        <w:jc w:val="start"/>
+        <w:rPr>
+          <w:lang w:val="de-DE"/>
+        </w:rPr>
+      </w:pPr>
+      <w:r>
+        <w:rPr/>
+        <w:t>30‘ Sätze mit „nachdem“. Schreiben Sie drei Sätze mit nachdem. Tauschen Sie dann ihre Sätze mit ei</w:t>
+      </w:r>
+      <w:r>
+        <w:rPr/>
+        <w:t>ne</w:t>
+      </w:r>
+      <w:r>
+        <w:rPr/>
+        <w:t>m Partner. Kontrollieren Sie sich gegenseitig.</w:t>
       </w:r>
     </w:p>
     <w:p>
@@ -483,25 +527,23 @@
         </w:rPr>
       </w:pPr>
       <w:r>
-        <w:rPr/>
-      </w:r>
-    </w:p>
-    <w:p>
-      <w:pPr>
-        <w:pStyle w:val="Normal"/>
-        <w:bidi w:val="0"/>
-        <w:jc w:val="start"/>
-        <w:rPr>
-          <w:lang w:val="de-DE"/>
-        </w:rPr>
-      </w:pPr>
-      <w:r>
-        <w:rPr/>
-        <w:t>90</w:t>
-      </w:r>
-      <w:r>
-        <w:rPr/>
-        <w:t>‘ Richtig streiten</w:t>
+        <w:rPr>
+          <w:lang w:val="de-DE"/>
+        </w:rPr>
+      </w:r>
+    </w:p>
+    <w:p>
+      <w:pPr>
+        <w:pStyle w:val="Normal"/>
+        <w:bidi w:val="0"/>
+        <w:jc w:val="start"/>
+        <w:rPr>
+          <w:lang w:val="de-DE"/>
+        </w:rPr>
+      </w:pPr>
+      <w:r>
+        <w:rPr/>
+        <w:t>90‘ Richtig streiten</w:t>
       </w:r>
     </w:p>
     <w:p>
@@ -739,7 +781,15 @@
           <w:iCs/>
           <w:u w:val="none"/>
         </w:rPr>
-        <w:t>seit/</w:t>
+        <w:t>seit/seitdem,</w:t>
+      </w:r>
+      <w:r>
+        <w:rPr>
+          <w:i w:val="false"/>
+          <w:iCs w:val="false"/>
+          <w:u w:val="none"/>
+        </w:rPr>
+        <w:t xml:space="preserve"> </w:t>
       </w:r>
       <w:r>
         <w:rPr>
@@ -747,7 +797,7 @@
           <w:iCs/>
           <w:u w:val="none"/>
         </w:rPr>
-        <w:t>seitdem,</w:t>
+        <w:t>während</w:t>
       </w:r>
       <w:r>
         <w:rPr>
@@ -755,7 +805,7 @@
           <w:iCs w:val="false"/>
           <w:u w:val="none"/>
         </w:rPr>
-        <w:t xml:space="preserve"> </w:t>
+        <w:t xml:space="preserve">, </w:t>
       </w:r>
       <w:r>
         <w:rPr>
@@ -763,7 +813,7 @@
           <w:iCs/>
           <w:u w:val="none"/>
         </w:rPr>
-        <w:t>während</w:t>
+        <w:t>bis</w:t>
       </w:r>
       <w:r>
         <w:rPr>
@@ -771,7 +821,7 @@
           <w:iCs w:val="false"/>
           <w:u w:val="none"/>
         </w:rPr>
-        <w:t xml:space="preserve">, </w:t>
+        <w:t xml:space="preserve"> und </w:t>
       </w:r>
       <w:r>
         <w:rPr>
@@ -779,7 +829,7 @@
           <w:iCs/>
           <w:u w:val="none"/>
         </w:rPr>
-        <w:t>bis</w:t>
+        <w:t>bevor</w:t>
       </w:r>
       <w:r>
         <w:rPr>
@@ -787,31 +837,7 @@
           <w:iCs w:val="false"/>
           <w:u w:val="none"/>
         </w:rPr>
-        <w:t xml:space="preserve"> und </w:t>
-      </w:r>
-      <w:r>
-        <w:rPr>
-          <w:i/>
-          <w:iCs/>
-          <w:u w:val="none"/>
-        </w:rPr>
-        <w:t>bevor</w:t>
-      </w:r>
-      <w:r>
-        <w:rPr>
-          <w:i w:val="false"/>
-          <w:iCs w:val="false"/>
-          <w:u w:val="none"/>
-        </w:rPr>
-        <w:t xml:space="preserve"> </w:t>
-      </w:r>
-      <w:r>
-        <w:rPr>
-          <w:i w:val="false"/>
-          <w:iCs w:val="false"/>
-          <w:u w:val="none"/>
-        </w:rPr>
-        <w:t>auf Karten. Mischen Sie alle Karten. Ziehen Sie abwechselnd eine Karte und ergänzen Sie den Satz. Die letzten 30 Minuten werden dem Zertifikat B1 gewidmet.</w:t>
+        <w:t xml:space="preserve"> auf Karten. Mischen Sie alle Karten. Ziehen Sie abwechselnd eine Karte und ergänzen Sie den Satz. Die letzten 30 Minuten werden dem Zertifikat B1 gewidmet.</w:t>
       </w:r>
       <w:r>
         <w:br w:type="page"/>
@@ -821,6 +847,7 @@
       <w:pPr>
         <w:pStyle w:val="Normal"/>
         <w:bidi w:val="0"/>
+        <w:spacing w:before="0" w:after="0"/>
         <w:jc w:val="start"/>
         <w:rPr/>
       </w:pPr>
@@ -1560,7 +1587,7 @@
     </w:rPr>
   </w:style>
   <w:style w:type="paragraph" w:styleId="Caption">
-    <w:name w:val="Caption"/>
+    <w:name w:val="caption"/>
     <w:basedOn w:val="Normal"/>
     <w:qFormat/>
     <w:pPr>

</xml_diff>

<commit_message>
nuevos agregados al los planes de clase
</commit_message>
<xml_diff>
--- a/planesDeClaseSegundo.docx
+++ b/planesDeClaseSegundo.docx
@@ -15,6 +15,615 @@
         <w:rPr>
           <w:lang w:val="de-DE"/>
         </w:rPr>
+        <w:t>Zweites Niveau, dritte Woche, Montag den 02.03.26</w:t>
+      </w:r>
+    </w:p>
+    <w:p>
+      <w:pPr>
+        <w:pStyle w:val="Normal"/>
+        <w:bidi w:val="0"/>
+        <w:jc w:val="start"/>
+        <w:rPr>
+          <w:lang w:val="de-DE"/>
+        </w:rPr>
+      </w:pPr>
+      <w:r>
+        <w:rPr>
+          <w:lang w:val="de-DE"/>
+        </w:rPr>
+      </w:r>
+    </w:p>
+    <w:p>
+      <w:pPr>
+        <w:pStyle w:val="Normal"/>
+        <w:bidi w:val="0"/>
+        <w:jc w:val="start"/>
+        <w:rPr>
+          <w:lang w:val="de-DE"/>
+        </w:rPr>
+      </w:pPr>
+      <w:r>
+        <w:rPr>
+          <w:lang w:val="de-DE"/>
+        </w:rPr>
+        <w:t>10‘ Wierderholung: was haben wir voriges Mal zum Thema Perfekt gelernt? Wissen die KT noch, wie man die Partizip II-Form eines Verbs entsteht? Aus Welchen zwei Elementen besteht dieses Tempus (Hilfsverb und Verb im Partizip II)? Was gehört zwischen den zwei Verbteilen?</w:t>
+      </w:r>
+    </w:p>
+    <w:p>
+      <w:pPr>
+        <w:pStyle w:val="Normal"/>
+        <w:bidi w:val="0"/>
+        <w:jc w:val="start"/>
+        <w:rPr>
+          <w:lang w:val="de-DE"/>
+        </w:rPr>
+      </w:pPr>
+      <w:r>
+        <w:rPr>
+          <w:lang w:val="de-DE"/>
+        </w:rPr>
+      </w:r>
+    </w:p>
+    <w:p>
+      <w:pPr>
+        <w:pStyle w:val="Normal"/>
+        <w:bidi w:val="0"/>
+        <w:jc w:val="start"/>
+        <w:rPr>
+          <w:lang w:val="de-DE"/>
+        </w:rPr>
+      </w:pPr>
+      <w:r>
+        <w:rPr>
+          <w:lang w:val="de-DE"/>
+        </w:rPr>
+        <w:t>30‘ Tina Schumann</w:t>
+      </w:r>
+    </w:p>
+    <w:p>
+      <w:pPr>
+        <w:pStyle w:val="Normal"/>
+        <w:bidi w:val="0"/>
+        <w:jc w:val="start"/>
+        <w:rPr>
+          <w:lang w:val="de-DE"/>
+        </w:rPr>
+      </w:pPr>
+      <w:r>
+        <w:rPr>
+          <w:lang w:val="de-DE"/>
+        </w:rPr>
+        <w:t>a) was hat Tina wann gemacht? Sehen Sie das Video und ergänzen Sie die Jahreszahlen wie im Beispiel.</w:t>
+      </w:r>
+    </w:p>
+    <w:p>
+      <w:pPr>
+        <w:pStyle w:val="Normal"/>
+        <w:bidi w:val="0"/>
+        <w:jc w:val="start"/>
+        <w:rPr>
+          <w:lang w:val="de-DE"/>
+        </w:rPr>
+      </w:pPr>
+      <w:r>
+        <w:rPr>
+          <w:lang w:val="de-DE"/>
+        </w:rPr>
+        <w:t>b) berichten Sie</w:t>
+      </w:r>
+    </w:p>
+    <w:p>
+      <w:pPr>
+        <w:pStyle w:val="Normal"/>
+        <w:bidi w:val="0"/>
+        <w:jc w:val="start"/>
+        <w:rPr>
+          <w:lang w:val="de-DE"/>
+        </w:rPr>
+      </w:pPr>
+      <w:r>
+        <w:rPr>
+          <w:lang w:val="de-DE"/>
+        </w:rPr>
+        <w:t>c) Wechselspiel. Fragen und antworten Sie.</w:t>
+      </w:r>
+    </w:p>
+    <w:p>
+      <w:pPr>
+        <w:pStyle w:val="Normal"/>
+        <w:bidi w:val="0"/>
+        <w:jc w:val="start"/>
+        <w:rPr>
+          <w:lang w:val="de-DE"/>
+        </w:rPr>
+      </w:pPr>
+      <w:r>
+        <w:rPr>
+          <w:lang w:val="de-DE"/>
+        </w:rPr>
+      </w:r>
+    </w:p>
+    <w:p>
+      <w:pPr>
+        <w:pStyle w:val="Normal"/>
+        <w:bidi w:val="0"/>
+        <w:jc w:val="start"/>
+        <w:rPr>
+          <w:lang w:val="de-DE"/>
+        </w:rPr>
+      </w:pPr>
+      <w:r>
+        <w:rPr>
+          <w:lang w:val="de-DE"/>
+        </w:rPr>
+        <w:t>30‘ Ihre Geschichte.</w:t>
+      </w:r>
+    </w:p>
+    <w:p>
+      <w:pPr>
+        <w:pStyle w:val="Normal"/>
+        <w:bidi w:val="0"/>
+        <w:jc w:val="start"/>
+        <w:rPr>
+          <w:lang w:val="de-DE"/>
+        </w:rPr>
+      </w:pPr>
+      <w:r>
+        <w:rPr>
+          <w:lang w:val="de-DE"/>
+        </w:rPr>
+        <w:t>a) Schreiben Sie Ihre Geschichte.</w:t>
+      </w:r>
+    </w:p>
+    <w:p>
+      <w:pPr>
+        <w:pStyle w:val="Normal"/>
+        <w:bidi w:val="0"/>
+        <w:jc w:val="start"/>
+        <w:rPr>
+          <w:lang w:val="de-DE"/>
+        </w:rPr>
+      </w:pPr>
+      <w:r>
+        <w:rPr>
+          <w:lang w:val="de-DE"/>
+        </w:rPr>
+        <w:t>b) Tauschen Sie die Texte und lesen Sie vor. Wer ist das?</w:t>
+      </w:r>
+    </w:p>
+    <w:p>
+      <w:pPr>
+        <w:pStyle w:val="Normal"/>
+        <w:bidi w:val="0"/>
+        <w:jc w:val="start"/>
+        <w:rPr>
+          <w:lang w:val="de-DE"/>
+        </w:rPr>
+      </w:pPr>
+      <w:r>
+        <w:rPr>
+          <w:lang w:val="de-DE"/>
+        </w:rPr>
+      </w:r>
+    </w:p>
+    <w:p>
+      <w:pPr>
+        <w:pStyle w:val="Normal"/>
+        <w:bidi w:val="0"/>
+        <w:jc w:val="start"/>
+        <w:rPr>
+          <w:lang w:val="de-DE"/>
+        </w:rPr>
+      </w:pPr>
+      <w:r>
+        <w:rPr>
+          <w:lang w:val="de-DE"/>
+        </w:rPr>
+        <w:t xml:space="preserve">10‘ </w:t>
+      </w:r>
+      <w:r>
+        <w:rPr>
+          <w:lang w:val="de-DE"/>
+        </w:rPr>
+        <w:t>Aktive Pause</w:t>
+      </w:r>
+    </w:p>
+    <w:p>
+      <w:pPr>
+        <w:pStyle w:val="Normal"/>
+        <w:bidi w:val="0"/>
+        <w:jc w:val="start"/>
+        <w:rPr>
+          <w:lang w:val="de-DE"/>
+        </w:rPr>
+      </w:pPr>
+      <w:r>
+        <w:rPr>
+          <w:lang w:val="de-DE"/>
+        </w:rPr>
+        <w:t>a) Die KT denken an das zurück, was sie diesen Unterricht zum Thema Perfekt gelernt haben.</w:t>
+      </w:r>
+    </w:p>
+    <w:p>
+      <w:pPr>
+        <w:pStyle w:val="Normal"/>
+        <w:bidi w:val="0"/>
+        <w:jc w:val="start"/>
+        <w:rPr>
+          <w:lang w:val="de-DE"/>
+        </w:rPr>
+      </w:pPr>
+      <w:r>
+        <w:rPr>
+          <w:lang w:val="de-DE"/>
+        </w:rPr>
+        <w:t>b) Sie machen Notizen für sich selbst, damit sie sich später gut an das Thema erinnern können.</w:t>
+      </w:r>
+    </w:p>
+    <w:p>
+      <w:pPr>
+        <w:pStyle w:val="Normal"/>
+        <w:bidi w:val="0"/>
+        <w:jc w:val="start"/>
+        <w:rPr>
+          <w:lang w:val="de-DE"/>
+        </w:rPr>
+      </w:pPr>
+      <w:r>
+        <w:rPr>
+          <w:lang w:val="de-DE"/>
+        </w:rPr>
+        <w:t>c) Sie stellen Fragen an den Klassenkameraden: schaffen sie es, alle Fragen richtig zu beantworten?</w:t>
+      </w:r>
+    </w:p>
+    <w:p>
+      <w:pPr>
+        <w:pStyle w:val="Normal"/>
+        <w:bidi w:val="0"/>
+        <w:jc w:val="start"/>
+        <w:rPr>
+          <w:lang w:val="de-DE"/>
+        </w:rPr>
+      </w:pPr>
+      <w:r>
+        <w:rPr>
+          <w:lang w:val="de-DE"/>
+        </w:rPr>
+      </w:r>
+    </w:p>
+    <w:p>
+      <w:pPr>
+        <w:pStyle w:val="Normal"/>
+        <w:bidi w:val="0"/>
+        <w:jc w:val="start"/>
+        <w:rPr>
+          <w:lang w:val="de-DE"/>
+        </w:rPr>
+      </w:pPr>
+      <w:r>
+        <w:rPr>
+          <w:lang w:val="de-DE"/>
+        </w:rPr>
+        <w:t>20‘ Kaffeklatsch</w:t>
+      </w:r>
+    </w:p>
+    <w:p>
+      <w:pPr>
+        <w:pStyle w:val="Normal"/>
+        <w:bidi w:val="0"/>
+        <w:jc w:val="start"/>
+        <w:rPr>
+          <w:lang w:val="de-DE"/>
+        </w:rPr>
+      </w:pPr>
+      <w:r>
+        <w:rPr>
+          <w:lang w:val="de-DE"/>
+        </w:rPr>
+        <w:t>a) Sprechen Sie schnell</w:t>
+      </w:r>
+    </w:p>
+    <w:p>
+      <w:pPr>
+        <w:pStyle w:val="Normal"/>
+        <w:bidi w:val="0"/>
+        <w:jc w:val="start"/>
+        <w:rPr>
+          <w:lang w:val="de-DE"/>
+        </w:rPr>
+      </w:pPr>
+      <w:r>
+        <w:rPr>
+          <w:lang w:val="de-DE"/>
+        </w:rPr>
+        <w:t>b) Gerda Clausen besucht Ihre Freundin Helga Schumann. Es gibt Kaffee und Kuchen. Über welche Themen sprechen die Freundinnen? Notieren Sie die Ideen.</w:t>
+      </w:r>
+    </w:p>
+    <w:p>
+      <w:pPr>
+        <w:pStyle w:val="Normal"/>
+        <w:bidi w:val="0"/>
+        <w:jc w:val="start"/>
+        <w:rPr>
+          <w:lang w:val="de-DE"/>
+        </w:rPr>
+      </w:pPr>
+      <w:r>
+        <w:rPr>
+          <w:lang w:val="de-DE"/>
+        </w:rPr>
+      </w:r>
+    </w:p>
+    <w:p>
+      <w:pPr>
+        <w:pStyle w:val="Normal"/>
+        <w:bidi w:val="0"/>
+        <w:jc w:val="start"/>
+        <w:rPr>
+          <w:lang w:val="de-DE"/>
+        </w:rPr>
+      </w:pPr>
+      <w:r>
+        <w:rPr>
+          <w:lang w:val="de-DE"/>
+        </w:rPr>
+        <w:t>HAG: Seite 140, Übungen 1c und 1d</w:t>
+      </w:r>
+    </w:p>
+    <w:p>
+      <w:pPr>
+        <w:pStyle w:val="Normal"/>
+        <w:bidi w:val="0"/>
+        <w:jc w:val="start"/>
+        <w:rPr>
+          <w:lang w:val="de-DE"/>
+        </w:rPr>
+      </w:pPr>
+      <w:r>
+        <w:rPr>
+          <w:lang w:val="de-DE"/>
+        </w:rPr>
+        <w:t>******************************************</w:t>
+      </w:r>
+    </w:p>
+    <w:p>
+      <w:pPr>
+        <w:pStyle w:val="Normal"/>
+        <w:bidi w:val="0"/>
+        <w:jc w:val="start"/>
+        <w:rPr>
+          <w:lang w:val="de-DE"/>
+        </w:rPr>
+      </w:pPr>
+      <w:r>
+        <w:rPr>
+          <w:lang w:val="de-DE"/>
+        </w:rPr>
+        <w:t xml:space="preserve">Sechstes </w:t>
+      </w:r>
+      <w:r>
+        <w:rPr>
+          <w:lang w:val="de-DE"/>
+        </w:rPr>
+        <w:t xml:space="preserve">Niveau, </w:t>
+      </w:r>
+      <w:r>
+        <w:rPr>
+          <w:lang w:val="de-DE"/>
+        </w:rPr>
+        <w:t>vierte</w:t>
+      </w:r>
+      <w:r>
+        <w:rPr>
+          <w:lang w:val="de-DE"/>
+        </w:rPr>
+        <w:t xml:space="preserve"> Woche, Montag den 02.03.26</w:t>
+      </w:r>
+    </w:p>
+    <w:p>
+      <w:pPr>
+        <w:pStyle w:val="Normal"/>
+        <w:bidi w:val="0"/>
+        <w:jc w:val="start"/>
+        <w:rPr>
+          <w:lang w:val="de-DE"/>
+        </w:rPr>
+      </w:pPr>
+      <w:r>
+        <w:rPr>
+          <w:lang w:val="de-DE"/>
+        </w:rPr>
+      </w:r>
+    </w:p>
+    <w:p>
+      <w:pPr>
+        <w:pStyle w:val="Normal"/>
+        <w:bidi w:val="0"/>
+        <w:jc w:val="start"/>
+        <w:rPr>
+          <w:lang w:val="de-DE"/>
+        </w:rPr>
+      </w:pPr>
+      <w:r>
+        <w:rPr>
+          <w:lang w:val="de-DE"/>
+        </w:rPr>
+        <w:t>10‘ Wissen die KT noch Vokabeln zum Thema Gesundheit und gesundes Leben? Was für eine „Note“ haben sie erzielt? Was noch können sie tun, um ein besseres Leben zu führen?</w:t>
+      </w:r>
+    </w:p>
+    <w:p>
+      <w:pPr>
+        <w:pStyle w:val="Normal"/>
+        <w:bidi w:val="0"/>
+        <w:jc w:val="start"/>
+        <w:rPr>
+          <w:lang w:val="de-DE"/>
+        </w:rPr>
+      </w:pPr>
+      <w:r>
+        <w:rPr>
+          <w:lang w:val="de-DE"/>
+        </w:rPr>
+      </w:r>
+    </w:p>
+    <w:p>
+      <w:pPr>
+        <w:pStyle w:val="Normal"/>
+        <w:bidi w:val="0"/>
+        <w:jc w:val="start"/>
+        <w:rPr>
+          <w:lang w:val="de-DE"/>
+        </w:rPr>
+      </w:pPr>
+      <w:r>
+        <w:rPr>
+          <w:lang w:val="de-DE"/>
+        </w:rPr>
+        <w:t>Im Krankenh</w:t>
+      </w:r>
+      <w:r>
+        <w:rPr>
+          <w:lang w:val="de-DE"/>
+        </w:rPr>
+        <w:t>aus</w:t>
+      </w:r>
+    </w:p>
+    <w:p>
+      <w:pPr>
+        <w:pStyle w:val="Normal"/>
+        <w:bidi w:val="0"/>
+        <w:jc w:val="start"/>
+        <w:rPr>
+          <w:lang w:val="de-DE"/>
+        </w:rPr>
+      </w:pPr>
+      <w:r>
+        <w:rPr>
+          <w:lang w:val="de-DE"/>
+        </w:rPr>
+        <w:t>10‘ Arbeiten Sie zu zweit. Sehen Sie das Bild an und notieren Sie möglichst viele Wörter. Vergleichen Sie dann im Kurs.</w:t>
+      </w:r>
+    </w:p>
+    <w:p>
+      <w:pPr>
+        <w:pStyle w:val="Normal"/>
+        <w:bidi w:val="0"/>
+        <w:jc w:val="start"/>
+        <w:rPr>
+          <w:lang w:val="de-DE"/>
+        </w:rPr>
+      </w:pPr>
+      <w:r>
+        <w:rPr>
+          <w:lang w:val="de-DE"/>
+        </w:rPr>
+        <w:t>10‘ Hören Sie die Gespräche im Kankenzimmer. Welche Hilfe braucht der Patient? Warum?</w:t>
+      </w:r>
+    </w:p>
+    <w:p>
+      <w:pPr>
+        <w:pStyle w:val="Normal"/>
+        <w:bidi w:val="0"/>
+        <w:jc w:val="start"/>
+        <w:rPr>
+          <w:lang w:val="de-DE"/>
+        </w:rPr>
+      </w:pPr>
+      <w:r>
+        <w:rPr>
+          <w:lang w:val="de-DE"/>
+        </w:rPr>
+        <w:t>10‘ Lesen Sie die Ausdrücke und hören Sie die Gespräche</w:t>
+      </w:r>
+    </w:p>
+    <w:p>
+      <w:pPr>
+        <w:pStyle w:val="Normal"/>
+        <w:bidi w:val="0"/>
+        <w:jc w:val="start"/>
+        <w:rPr>
+          <w:lang w:val="de-DE"/>
+        </w:rPr>
+      </w:pPr>
+      <w:r>
+        <w:rPr>
+          <w:lang w:val="de-DE"/>
+        </w:rPr>
+      </w:r>
+    </w:p>
+    <w:p>
+      <w:pPr>
+        <w:pStyle w:val="Normal"/>
+        <w:bidi w:val="0"/>
+        <w:jc w:val="start"/>
+        <w:rPr>
+          <w:lang w:val="de-DE"/>
+        </w:rPr>
+      </w:pPr>
+      <w:r>
+        <w:rPr>
+          <w:lang w:val="de-DE"/>
+        </w:rPr>
+      </w:r>
+    </w:p>
+    <w:p>
+      <w:pPr>
+        <w:pStyle w:val="Normal"/>
+        <w:bidi w:val="0"/>
+        <w:jc w:val="start"/>
+        <w:rPr>
+          <w:lang w:val="de-DE"/>
+        </w:rPr>
+      </w:pPr>
+      <w:r>
+        <w:rPr>
+          <w:lang w:val="de-DE"/>
+        </w:rPr>
+      </w:r>
+    </w:p>
+    <w:p>
+      <w:pPr>
+        <w:pStyle w:val="Normal"/>
+        <w:bidi w:val="0"/>
+        <w:jc w:val="start"/>
+        <w:rPr>
+          <w:lang w:val="de-DE"/>
+        </w:rPr>
+      </w:pPr>
+      <w:r>
+        <w:rPr>
+          <w:lang w:val="de-DE"/>
+        </w:rPr>
+      </w:r>
+    </w:p>
+    <w:p>
+      <w:pPr>
+        <w:pStyle w:val="Normal"/>
+        <w:bidi w:val="0"/>
+        <w:jc w:val="start"/>
+        <w:rPr>
+          <w:lang w:val="de-DE"/>
+        </w:rPr>
+      </w:pPr>
+      <w:r>
+        <w:rPr>
+          <w:lang w:val="de-DE"/>
+        </w:rPr>
+      </w:r>
+    </w:p>
+    <w:p>
+      <w:pPr>
+        <w:pStyle w:val="Normal"/>
+        <w:bidi w:val="0"/>
+        <w:jc w:val="start"/>
+        <w:rPr>
+          <w:lang w:val="de-DE"/>
+        </w:rPr>
+      </w:pPr>
+      <w:r>
+        <w:rPr>
+          <w:lang w:val="de-DE"/>
+        </w:rPr>
         <w:t>Zweites Niveau, dritte Woche, Montag den 16.02.26</w:t>
       </w:r>
     </w:p>
@@ -206,43 +815,7 @@
         <w:rPr>
           <w:lang w:val="de-DE"/>
         </w:rPr>
-        <w:t>Die KT t</w:t>
-      </w:r>
-      <w:r>
-        <w:rPr>
-          <w:lang w:val="de-DE"/>
-        </w:rPr>
-        <w:t>a</w:t>
-      </w:r>
-      <w:r>
-        <w:rPr>
-          <w:lang w:val="de-DE"/>
-        </w:rPr>
-        <w:t xml:space="preserve">uschen Ihre Fotos und schreiben eine Zimmer-Beschreibung. Das Ergebnis </w:t>
-      </w:r>
-      <w:r>
-        <w:rPr>
-          <w:lang w:val="de-DE"/>
-        </w:rPr>
-        <w:t>wird</w:t>
-      </w:r>
-      <w:r>
-        <w:rPr>
-          <w:lang w:val="de-DE"/>
-        </w:rPr>
-        <w:t xml:space="preserve"> in Classroom eingereicht damit alle </w:t>
-      </w:r>
-      <w:r>
-        <w:rPr>
-          <w:lang w:val="de-DE"/>
-        </w:rPr>
-        <w:t xml:space="preserve">Ktn </w:t>
-      </w:r>
-      <w:r>
-        <w:rPr>
-          <w:lang w:val="de-DE"/>
-        </w:rPr>
-        <w:t>die verschiedenen Texte lesen können. Welche ist die beste Beschreibung?</w:t>
+        <w:t>Die KT tauschen Ihre Fotos und schreiben eine Zimmer-Beschreibung. Das Ergebnis wird in Classroom eingereicht damit alle Ktn die verschiedenen Texte lesen können. Welche ist die beste Beschreibung?</w:t>
       </w:r>
     </w:p>
     <w:p>
@@ -410,15 +983,7 @@
       </w:pPr>
       <w:r>
         <w:rPr/>
-        <w:t>60‘ Wiederholung von den Theme</w:t>
-      </w:r>
-      <w:r>
-        <w:rPr/>
-        <w:t>n</w:t>
-      </w:r>
-      <w:r>
-        <w:rPr/>
-        <w:t xml:space="preserve"> aus Lektion 5 und 6.</w:t>
+        <w:t>60‘ Wiederholung von den Themen aus Lektion 5 und 6.</w:t>
       </w:r>
     </w:p>
     <w:p>
@@ -492,15 +1057,7 @@
       </w:pPr>
       <w:r>
         <w:rPr/>
-        <w:t>30‘ Sätze mit „nachdem“. Schreiben Sie drei Sätze mit nachdem. Tauschen Sie dann ihre Sätze mit ei</w:t>
-      </w:r>
-      <w:r>
-        <w:rPr/>
-        <w:t>ne</w:t>
-      </w:r>
-      <w:r>
-        <w:rPr/>
-        <w:t>m Partner. Kontrollieren Sie sich gegenseitig.</w:t>
+        <w:t>30‘ Sätze mit „nachdem“. Schreiben Sie drei Sätze mit nachdem. Tauschen Sie dann ihre Sätze mit einem Partner. Kontrollieren Sie sich gegenseitig.</w:t>
       </w:r>
     </w:p>
     <w:p>

</xml_diff>

<commit_message>
planes de clase completos para el 2 de marzo 2026
</commit_message>
<xml_diff>
--- a/planesDeClaseSegundo.docx
+++ b/planesDeClaseSegundo.docx
@@ -219,396 +219,837 @@
         <w:rPr>
           <w:lang w:val="de-DE"/>
         </w:rPr>
+        <w:t>10‘ Aktive Pause</w:t>
+      </w:r>
+    </w:p>
+    <w:p>
+      <w:pPr>
+        <w:pStyle w:val="Normal"/>
+        <w:bidi w:val="0"/>
+        <w:jc w:val="start"/>
+        <w:rPr>
+          <w:lang w:val="de-DE"/>
+        </w:rPr>
+      </w:pPr>
+      <w:r>
+        <w:rPr>
+          <w:lang w:val="de-DE"/>
+        </w:rPr>
+        <w:t>a) Die KT denken an das zurück, was sie diesen Unterricht zum Thema Perfekt gelernt haben.</w:t>
+      </w:r>
+    </w:p>
+    <w:p>
+      <w:pPr>
+        <w:pStyle w:val="Normal"/>
+        <w:bidi w:val="0"/>
+        <w:jc w:val="start"/>
+        <w:rPr>
+          <w:lang w:val="de-DE"/>
+        </w:rPr>
+      </w:pPr>
+      <w:r>
+        <w:rPr>
+          <w:lang w:val="de-DE"/>
+        </w:rPr>
+        <w:t>b) Sie machen Notizen für sich selbst, damit sie sich später gut an das Thema erinnern können.</w:t>
+      </w:r>
+    </w:p>
+    <w:p>
+      <w:pPr>
+        <w:pStyle w:val="Normal"/>
+        <w:bidi w:val="0"/>
+        <w:jc w:val="start"/>
+        <w:rPr>
+          <w:lang w:val="de-DE"/>
+        </w:rPr>
+      </w:pPr>
+      <w:r>
+        <w:rPr>
+          <w:lang w:val="de-DE"/>
+        </w:rPr>
+        <w:t>c) Sie stellen Fragen an den Klassenkameraden: schaffen sie es, alle Fragen richtig zu beantworten?</w:t>
+      </w:r>
+    </w:p>
+    <w:p>
+      <w:pPr>
+        <w:pStyle w:val="Normal"/>
+        <w:bidi w:val="0"/>
+        <w:jc w:val="start"/>
+        <w:rPr>
+          <w:lang w:val="de-DE"/>
+        </w:rPr>
+      </w:pPr>
+      <w:r>
+        <w:rPr>
+          <w:lang w:val="de-DE"/>
+        </w:rPr>
+      </w:r>
+    </w:p>
+    <w:p>
+      <w:pPr>
+        <w:pStyle w:val="Normal"/>
+        <w:bidi w:val="0"/>
+        <w:jc w:val="start"/>
+        <w:rPr>
+          <w:lang w:val="de-DE"/>
+        </w:rPr>
+      </w:pPr>
+      <w:r>
+        <w:rPr>
+          <w:lang w:val="de-DE"/>
+        </w:rPr>
+        <w:t>20‘ Kaffeklatsch</w:t>
+      </w:r>
+    </w:p>
+    <w:p>
+      <w:pPr>
+        <w:pStyle w:val="Normal"/>
+        <w:bidi w:val="0"/>
+        <w:jc w:val="start"/>
+        <w:rPr>
+          <w:lang w:val="de-DE"/>
+        </w:rPr>
+      </w:pPr>
+      <w:r>
+        <w:rPr>
+          <w:lang w:val="de-DE"/>
+        </w:rPr>
+        <w:t>a) Sprechen Sie schnell</w:t>
+      </w:r>
+    </w:p>
+    <w:p>
+      <w:pPr>
+        <w:pStyle w:val="Normal"/>
+        <w:bidi w:val="0"/>
+        <w:jc w:val="start"/>
+        <w:rPr>
+          <w:lang w:val="de-DE"/>
+        </w:rPr>
+      </w:pPr>
+      <w:r>
+        <w:rPr>
+          <w:lang w:val="de-DE"/>
+        </w:rPr>
+        <w:t>b) Gerda Clausen besucht Ihre Freundin Helga Schumann. Es gibt Kaffee und Kuchen. Über welche Themen sprechen die Freundinnen? Notieren Sie die Ideen.</w:t>
+      </w:r>
+    </w:p>
+    <w:p>
+      <w:pPr>
+        <w:pStyle w:val="Normal"/>
+        <w:bidi w:val="0"/>
+        <w:jc w:val="start"/>
+        <w:rPr>
+          <w:lang w:val="de-DE"/>
+        </w:rPr>
+      </w:pPr>
+      <w:r>
+        <w:rPr>
+          <w:lang w:val="de-DE"/>
+        </w:rPr>
+      </w:r>
+    </w:p>
+    <w:p>
+      <w:pPr>
+        <w:pStyle w:val="Normal"/>
+        <w:bidi w:val="0"/>
+        <w:jc w:val="start"/>
+        <w:rPr>
+          <w:lang w:val="de-DE"/>
+        </w:rPr>
+      </w:pPr>
+      <w:r>
+        <w:rPr>
+          <w:lang w:val="de-DE"/>
+        </w:rPr>
+        <w:t>HAG: Seite 140, Übungen 1c und 1d</w:t>
+      </w:r>
+    </w:p>
+    <w:p>
+      <w:pPr>
+        <w:pStyle w:val="Normal"/>
+        <w:bidi w:val="0"/>
+        <w:jc w:val="start"/>
+        <w:rPr>
+          <w:lang w:val="de-DE"/>
+        </w:rPr>
+      </w:pPr>
+      <w:r>
+        <w:rPr>
+          <w:lang w:val="de-DE"/>
+        </w:rPr>
+        <w:t>******************************************</w:t>
+      </w:r>
+    </w:p>
+    <w:p>
+      <w:pPr>
+        <w:pStyle w:val="Normal"/>
+        <w:bidi w:val="0"/>
+        <w:jc w:val="start"/>
+        <w:rPr>
+          <w:lang w:val="de-DE"/>
+        </w:rPr>
+      </w:pPr>
+      <w:r>
+        <w:rPr>
+          <w:lang w:val="de-DE"/>
+        </w:rPr>
+        <w:t>Sechstes Niveau, vierte Woche, Montag den 02.03.26</w:t>
+      </w:r>
+    </w:p>
+    <w:p>
+      <w:pPr>
+        <w:pStyle w:val="Normal"/>
+        <w:bidi w:val="0"/>
+        <w:jc w:val="start"/>
+        <w:rPr>
+          <w:lang w:val="de-DE"/>
+        </w:rPr>
+      </w:pPr>
+      <w:r>
+        <w:rPr>
+          <w:lang w:val="de-DE"/>
+        </w:rPr>
+      </w:r>
+    </w:p>
+    <w:p>
+      <w:pPr>
+        <w:pStyle w:val="Normal"/>
+        <w:bidi w:val="0"/>
+        <w:jc w:val="start"/>
+        <w:rPr>
+          <w:lang w:val="de-DE"/>
+        </w:rPr>
+      </w:pPr>
+      <w:r>
+        <w:rPr>
+          <w:lang w:val="de-DE"/>
+        </w:rPr>
+        <w:t>10‘ Wissen die KT noch Vokabeln zum Thema Gesundheit und gesundes Leben? Was für eine „Note“ haben sie erzielt? Was noch können sie tun, um ein besseres Leben zu führen?</w:t>
+      </w:r>
+    </w:p>
+    <w:p>
+      <w:pPr>
+        <w:pStyle w:val="Normal"/>
+        <w:bidi w:val="0"/>
+        <w:jc w:val="start"/>
+        <w:rPr>
+          <w:lang w:val="de-DE"/>
+        </w:rPr>
+      </w:pPr>
+      <w:r>
+        <w:rPr>
+          <w:lang w:val="de-DE"/>
+        </w:rPr>
+      </w:r>
+    </w:p>
+    <w:p>
+      <w:pPr>
+        <w:pStyle w:val="Normal"/>
+        <w:bidi w:val="0"/>
+        <w:jc w:val="start"/>
+        <w:rPr>
+          <w:lang w:val="de-DE"/>
+        </w:rPr>
+      </w:pPr>
+      <w:r>
+        <w:rPr>
+          <w:lang w:val="de-DE"/>
+        </w:rPr>
+        <w:t>Im Krankenhaus</w:t>
+      </w:r>
+    </w:p>
+    <w:p>
+      <w:pPr>
+        <w:pStyle w:val="Normal"/>
+        <w:bidi w:val="0"/>
+        <w:jc w:val="start"/>
+        <w:rPr>
+          <w:lang w:val="de-DE"/>
+        </w:rPr>
+      </w:pPr>
+      <w:r>
+        <w:rPr>
+          <w:lang w:val="de-DE"/>
+        </w:rPr>
+        <w:t>10‘ Arbeiten Sie zu zweit. Sehen Sie das Bild an und notieren Sie möglichst viele Wörter. Vergleichen Sie dann im Kurs.</w:t>
+      </w:r>
+    </w:p>
+    <w:p>
+      <w:pPr>
+        <w:pStyle w:val="Normal"/>
+        <w:bidi w:val="0"/>
+        <w:jc w:val="start"/>
+        <w:rPr>
+          <w:lang w:val="de-DE"/>
+        </w:rPr>
+      </w:pPr>
+      <w:r>
+        <w:rPr>
+          <w:lang w:val="de-DE"/>
+        </w:rPr>
+        <w:t>10‘ Hören Sie die Gespräche im Kankenzimmer. Welche Hilfe braucht der Patient? Warum?</w:t>
+      </w:r>
+    </w:p>
+    <w:p>
+      <w:pPr>
+        <w:pStyle w:val="Normal"/>
+        <w:bidi w:val="0"/>
+        <w:jc w:val="start"/>
+        <w:rPr>
+          <w:lang w:val="de-DE"/>
+        </w:rPr>
+      </w:pPr>
+      <w:r>
+        <w:rPr>
+          <w:lang w:val="de-DE"/>
+        </w:rPr>
+        <w:t>10‘ Lesen Sie die Ausdrücke und hören Sie die Gespräche noch  einmal. Welche Ausdrücke hören Sie? Kreuzen Sie an.</w:t>
+      </w:r>
+    </w:p>
+    <w:p>
+      <w:pPr>
+        <w:pStyle w:val="Normal"/>
+        <w:bidi w:val="0"/>
+        <w:jc w:val="start"/>
+        <w:rPr>
+          <w:lang w:val="de-DE"/>
+        </w:rPr>
+      </w:pPr>
+      <w:r>
+        <w:rPr>
+          <w:lang w:val="de-DE"/>
+        </w:rPr>
+        <w:t>15‘ Grammatik. Was bedeuten die Sätze? Kreuzen Sie an.</w:t>
+      </w:r>
+    </w:p>
+    <w:p>
+      <w:pPr>
+        <w:pStyle w:val="Normal"/>
+        <w:bidi w:val="0"/>
+        <w:jc w:val="start"/>
+        <w:rPr>
+          <w:lang w:val="de-DE"/>
+        </w:rPr>
+      </w:pPr>
+      <w:r>
+        <w:rPr>
+          <w:lang w:val="de-DE"/>
+        </w:rPr>
+        <w:t>20‘ 3b Kein Problem! Schreiben Sie Antworten mit brauchen + zu und lesen Sie die Dialoge dann zu zweit.</w:t>
+      </w:r>
+    </w:p>
+    <w:p>
+      <w:pPr>
+        <w:pStyle w:val="Normal"/>
+        <w:bidi w:val="0"/>
+        <w:jc w:val="start"/>
+        <w:rPr>
+          <w:lang w:val="de-DE"/>
+        </w:rPr>
+      </w:pPr>
+      <w:r>
+        <w:rPr>
+          <w:lang w:val="de-DE"/>
+        </w:rPr>
+        <w:t>„</w:t>
+      </w:r>
+      <w:r>
+        <w:rPr>
+          <w:lang w:val="de-DE"/>
+        </w:rPr>
+        <w:t>Das brauchst du nicht zu machen“ ← You don’t need to do that. / No necesitas hacer eso.</w:t>
+      </w:r>
+    </w:p>
+    <w:p>
+      <w:pPr>
+        <w:pStyle w:val="Normal"/>
+        <w:bidi w:val="0"/>
+        <w:jc w:val="start"/>
+        <w:rPr>
+          <w:lang w:val="de-DE"/>
+        </w:rPr>
+      </w:pPr>
+      <w:r>
+        <w:rPr>
+          <w:lang w:val="de-DE"/>
+        </w:rPr>
+        <w:t>„</w:t>
+      </w:r>
+      <w:r>
+        <w:rPr>
+          <w:lang w:val="de-DE"/>
+        </w:rPr>
+        <w:t>Sie brauchen mich nur zu rufen“ ← You just need to call me. / Sólo tienes que llamarme.</w:t>
+      </w:r>
+    </w:p>
+    <w:p>
+      <w:pPr>
+        <w:pStyle w:val="Normal"/>
+        <w:bidi w:val="0"/>
+        <w:jc w:val="start"/>
+        <w:rPr>
+          <w:lang w:val="de-DE"/>
+        </w:rPr>
+      </w:pPr>
+      <w:r>
+        <w:rPr>
+          <w:lang w:val="de-DE"/>
+        </w:rPr>
+        <w:t>30‘ 3c Arbeiten Sie zu zweit. Wählen Sie eine Situation im Krankenhaus und spielen Sie das Gespräch. Machen Sie vorher Notizen und verwenden Sie auch Ausdrücke aus 2c.</w:t>
+      </w:r>
+    </w:p>
+    <w:p>
+      <w:pPr>
+        <w:pStyle w:val="Normal"/>
+        <w:bidi w:val="0"/>
+        <w:jc w:val="start"/>
+        <w:rPr>
+          <w:lang w:val="de-DE"/>
+        </w:rPr>
+      </w:pPr>
+      <w:r>
+        <w:rPr>
+          <w:lang w:val="de-DE"/>
+        </w:rPr>
+      </w:r>
+    </w:p>
+    <w:p>
+      <w:pPr>
+        <w:pStyle w:val="Normal"/>
+        <w:bidi w:val="0"/>
+        <w:jc w:val="start"/>
+        <w:rPr>
+          <w:lang w:val="de-DE"/>
+        </w:rPr>
+      </w:pPr>
+      <w:r>
+        <w:rPr>
+          <w:lang w:val="de-DE"/>
+        </w:rPr>
+      </w:r>
+    </w:p>
+    <w:p>
+      <w:pPr>
+        <w:pStyle w:val="Normal"/>
+        <w:bidi w:val="0"/>
+        <w:jc w:val="start"/>
+        <w:rPr>
+          <w:lang w:val="de-DE"/>
+        </w:rPr>
+      </w:pPr>
+      <w:r>
+        <w:rPr>
+          <w:lang w:val="de-DE"/>
+        </w:rPr>
+      </w:r>
+    </w:p>
+    <w:p>
+      <w:pPr>
+        <w:pStyle w:val="Normal"/>
+        <w:bidi w:val="0"/>
+        <w:jc w:val="start"/>
+        <w:rPr>
+          <w:lang w:val="de-DE"/>
+        </w:rPr>
+      </w:pPr>
+      <w:r>
+        <w:rPr/>
+        <w:t>******************************************</w:t>
+      </w:r>
+    </w:p>
+    <w:p>
+      <w:pPr>
+        <w:pStyle w:val="Normal"/>
+        <w:bidi w:val="0"/>
+        <w:jc w:val="start"/>
+        <w:rPr>
+          <w:lang w:val="de-DE"/>
+        </w:rPr>
+      </w:pPr>
+      <w:r>
+        <w:rPr/>
+        <w:t>Viertes Niveau, vierte Woche, Montag den 02.03.26</w:t>
+      </w:r>
+    </w:p>
+    <w:p>
+      <w:pPr>
+        <w:pStyle w:val="Normal"/>
+        <w:bidi w:val="0"/>
+        <w:jc w:val="start"/>
+        <w:rPr>
+          <w:lang w:val="de-DE"/>
+        </w:rPr>
+      </w:pPr>
+      <w:r>
+        <w:rPr>
+          <w:lang w:val="de-DE"/>
+        </w:rPr>
+      </w:r>
+    </w:p>
+    <w:p>
+      <w:pPr>
+        <w:pStyle w:val="Normal"/>
+        <w:bidi w:val="0"/>
+        <w:jc w:val="start"/>
+        <w:rPr>
+          <w:lang w:val="de-DE"/>
+        </w:rPr>
+      </w:pPr>
+      <w:r>
+        <w:rPr/>
+        <w:t>10‘ Was haben wir voriges Mal gemacht? Haben Diego und Sofía ihr Buch gelesen? Worum geht es im Text? Wollen die anderen auch einen Reader lesen?</w:t>
+      </w:r>
+    </w:p>
+    <w:p>
+      <w:pPr>
+        <w:pStyle w:val="Normal"/>
+        <w:bidi w:val="0"/>
+        <w:jc w:val="start"/>
+        <w:rPr>
+          <w:lang w:val="de-DE"/>
+        </w:rPr>
+      </w:pPr>
+      <w:r>
+        <w:rPr/>
+        <w:t>20‘ Redemittel zur Diskussion. Die KT lesen die Redemittel. Können Sie alle verstehen? Können Sie sie verwenden? ← A2 Buch kann hier verwendet werden. Was müssen sie während der mündlichen Prüfung machen?</w:t>
+      </w:r>
+    </w:p>
+    <w:p>
+      <w:pPr>
+        <w:pStyle w:val="Normal"/>
+        <w:bidi w:val="0"/>
+        <w:jc w:val="start"/>
+        <w:rPr>
+          <w:lang w:val="de-DE"/>
+        </w:rPr>
+      </w:pPr>
+      <w:r>
+        <w:rPr>
+          <w:lang w:val="de-DE"/>
+        </w:rPr>
+      </w:r>
+    </w:p>
+    <w:p>
+      <w:pPr>
+        <w:pStyle w:val="Normal"/>
+        <w:bidi w:val="0"/>
+        <w:jc w:val="start"/>
+        <w:rPr>
+          <w:lang w:val="de-DE"/>
+        </w:rPr>
+      </w:pPr>
+      <w:r>
+        <w:rPr/>
+        <w:t>Der Weg zur Arbeit in D-A-CH</w:t>
+      </w:r>
+    </w:p>
+    <w:p>
+      <w:pPr>
+        <w:pStyle w:val="Normal"/>
+        <w:bidi w:val="0"/>
+        <w:jc w:val="start"/>
+        <w:rPr>
+          <w:lang w:val="de-DE"/>
+        </w:rPr>
+      </w:pPr>
+      <w:r>
+        <w:rPr/>
+        <w:t>10‘ Intro: Video PENDELN durch die ISAR. Lass die KT das Video sehen. Was macht gerade dieser Mann am Isar? Wohin will er? Würden die KT dasselbe machen? Warum? Warum nicht? Wer brauch am längsten?</w:t>
+      </w:r>
+    </w:p>
+    <w:p>
+      <w:pPr>
+        <w:pStyle w:val="Normal"/>
+        <w:bidi w:val="0"/>
+        <w:jc w:val="start"/>
+        <w:rPr>
+          <w:lang w:val="de-DE"/>
+        </w:rPr>
+      </w:pPr>
+      <w:r>
+        <w:rPr/>
         <w:t xml:space="preserve">10‘ </w:t>
       </w:r>
       <w:r>
-        <w:rPr>
-          <w:lang w:val="de-DE"/>
-        </w:rPr>
-        <w:t>Aktive Pause</w:t>
-      </w:r>
-    </w:p>
-    <w:p>
-      <w:pPr>
-        <w:pStyle w:val="Normal"/>
-        <w:bidi w:val="0"/>
-        <w:jc w:val="start"/>
-        <w:rPr>
-          <w:lang w:val="de-DE"/>
-        </w:rPr>
-      </w:pPr>
-      <w:r>
-        <w:rPr>
-          <w:lang w:val="de-DE"/>
-        </w:rPr>
-        <w:t>a) Die KT denken an das zurück, was sie diesen Unterricht zum Thema Perfekt gelernt haben.</w:t>
-      </w:r>
-    </w:p>
-    <w:p>
-      <w:pPr>
-        <w:pStyle w:val="Normal"/>
-        <w:bidi w:val="0"/>
-        <w:jc w:val="start"/>
-        <w:rPr>
-          <w:lang w:val="de-DE"/>
-        </w:rPr>
-      </w:pPr>
-      <w:r>
-        <w:rPr>
-          <w:lang w:val="de-DE"/>
-        </w:rPr>
-        <w:t>b) Sie machen Notizen für sich selbst, damit sie sich später gut an das Thema erinnern können.</w:t>
-      </w:r>
-    </w:p>
-    <w:p>
-      <w:pPr>
-        <w:pStyle w:val="Normal"/>
-        <w:bidi w:val="0"/>
-        <w:jc w:val="start"/>
-        <w:rPr>
-          <w:lang w:val="de-DE"/>
-        </w:rPr>
-      </w:pPr>
-      <w:r>
-        <w:rPr>
-          <w:lang w:val="de-DE"/>
-        </w:rPr>
-        <w:t>c) Sie stellen Fragen an den Klassenkameraden: schaffen sie es, alle Fragen richtig zu beantworten?</w:t>
-      </w:r>
-    </w:p>
-    <w:p>
-      <w:pPr>
-        <w:pStyle w:val="Normal"/>
-        <w:bidi w:val="0"/>
-        <w:jc w:val="start"/>
-        <w:rPr>
-          <w:lang w:val="de-DE"/>
-        </w:rPr>
-      </w:pPr>
-      <w:r>
-        <w:rPr>
-          <w:lang w:val="de-DE"/>
-        </w:rPr>
-      </w:r>
-    </w:p>
-    <w:p>
-      <w:pPr>
-        <w:pStyle w:val="Normal"/>
-        <w:bidi w:val="0"/>
-        <w:jc w:val="start"/>
-        <w:rPr>
-          <w:lang w:val="de-DE"/>
-        </w:rPr>
-      </w:pPr>
-      <w:r>
-        <w:rPr>
-          <w:lang w:val="de-DE"/>
-        </w:rPr>
-        <w:t>20‘ Kaffeklatsch</w:t>
-      </w:r>
-    </w:p>
-    <w:p>
-      <w:pPr>
-        <w:pStyle w:val="Normal"/>
-        <w:bidi w:val="0"/>
-        <w:jc w:val="start"/>
-        <w:rPr>
-          <w:lang w:val="de-DE"/>
-        </w:rPr>
-      </w:pPr>
-      <w:r>
-        <w:rPr>
-          <w:lang w:val="de-DE"/>
-        </w:rPr>
-        <w:t>a) Sprechen Sie schnell</w:t>
-      </w:r>
-    </w:p>
-    <w:p>
-      <w:pPr>
-        <w:pStyle w:val="Normal"/>
-        <w:bidi w:val="0"/>
-        <w:jc w:val="start"/>
-        <w:rPr>
-          <w:lang w:val="de-DE"/>
-        </w:rPr>
-      </w:pPr>
-      <w:r>
-        <w:rPr>
-          <w:lang w:val="de-DE"/>
-        </w:rPr>
-        <w:t>b) Gerda Clausen besucht Ihre Freundin Helga Schumann. Es gibt Kaffee und Kuchen. Über welche Themen sprechen die Freundinnen? Notieren Sie die Ideen.</w:t>
-      </w:r>
-    </w:p>
-    <w:p>
-      <w:pPr>
-        <w:pStyle w:val="Normal"/>
-        <w:bidi w:val="0"/>
-        <w:jc w:val="start"/>
-        <w:rPr>
-          <w:lang w:val="de-DE"/>
-        </w:rPr>
-      </w:pPr>
-      <w:r>
-        <w:rPr>
-          <w:lang w:val="de-DE"/>
-        </w:rPr>
-      </w:r>
-    </w:p>
-    <w:p>
-      <w:pPr>
-        <w:pStyle w:val="Normal"/>
-        <w:bidi w:val="0"/>
-        <w:jc w:val="start"/>
-        <w:rPr>
-          <w:lang w:val="de-DE"/>
-        </w:rPr>
-      </w:pPr>
-      <w:r>
-        <w:rPr>
-          <w:lang w:val="de-DE"/>
-        </w:rPr>
-        <w:t>HAG: Seite 140, Übungen 1c und 1d</w:t>
-      </w:r>
-    </w:p>
-    <w:p>
-      <w:pPr>
-        <w:pStyle w:val="Normal"/>
-        <w:bidi w:val="0"/>
-        <w:jc w:val="start"/>
-        <w:rPr>
-          <w:lang w:val="de-DE"/>
-        </w:rPr>
-      </w:pPr>
-      <w:r>
-        <w:rPr>
-          <w:lang w:val="de-DE"/>
-        </w:rPr>
+        <w:rPr/>
+        <w:t>11a) Lesen Sie. Wie kommen die drei Personen zur Arbeit? Welche Verkehrsmittel benutzen sie? Wie lange brauchen sie? Notieren Sie.</w:t>
+      </w:r>
+    </w:p>
+    <w:p>
+      <w:pPr>
+        <w:pStyle w:val="Normal"/>
+        <w:bidi w:val="0"/>
+        <w:jc w:val="start"/>
+        <w:rPr>
+          <w:lang w:val="de-DE"/>
+        </w:rPr>
+      </w:pPr>
+      <w:r>
+        <w:rPr/>
+        <w:t xml:space="preserve">15‘ </w:t>
+      </w:r>
+      <w:r>
+        <w:rPr/>
+        <w:t>11b) Wie kommen Sie zum Sprachkurs? Machen Sie eine Schlange.</w:t>
+      </w:r>
+      <w:r>
+        <w:rPr>
+          <w:lang w:val="de-DE"/>
+        </w:rPr>
+        <w:t xml:space="preserve"> </w:t>
+      </w:r>
+      <w:r>
+        <w:rPr>
+          <w:lang w:val="de-DE"/>
+        </w:rPr>
+        <w:t>Wer braucht am längsten? Er/sie steht ganz vorn. Wer braucht am kürzesten? Er/Sie steht ganz hinten.</w:t>
+      </w:r>
+    </w:p>
+    <w:p>
+      <w:pPr>
+        <w:pStyle w:val="Normal"/>
+        <w:bidi w:val="0"/>
+        <w:jc w:val="start"/>
+        <w:rPr>
+          <w:lang w:val="de-DE"/>
+        </w:rPr>
+      </w:pPr>
+      <w:r>
+        <w:rPr>
+          <w:lang w:val="de-DE"/>
+        </w:rPr>
+        <w:t>20‘ Arbeiten Sie zu zweit. Sehen Sie je eine Grafik an und berichten Sie ihrem Partner / Ihrer Partnerin.</w:t>
+      </w:r>
+    </w:p>
+    <w:p>
+      <w:pPr>
+        <w:pStyle w:val="Normal"/>
+        <w:bidi w:val="0"/>
+        <w:jc w:val="start"/>
+        <w:rPr>
+          <w:lang w:val="de-DE"/>
+        </w:rPr>
+      </w:pPr>
+      <w:r>
+        <w:rPr>
+          <w:lang w:val="de-DE"/>
+        </w:rPr>
+        <w:t>10‘ Welche Informationen aus 12a haben Sie überrascht? Vergleichen Sie mit Ihren Ergebnissen aus 11b und 11c.</w:t>
+      </w:r>
+    </w:p>
+    <w:p>
+      <w:pPr>
+        <w:pStyle w:val="Normal"/>
+        <w:bidi w:val="0"/>
+        <w:jc w:val="start"/>
+        <w:rPr>
+          <w:lang w:val="de-DE"/>
+        </w:rPr>
+      </w:pPr>
+      <w:r>
+        <w:rPr>
+          <w:lang w:val="de-DE"/>
+        </w:rPr>
+      </w:r>
+    </w:p>
+    <w:p>
+      <w:pPr>
+        <w:pStyle w:val="Normal"/>
+        <w:bidi w:val="0"/>
+        <w:jc w:val="start"/>
+        <w:rPr>
+          <w:lang w:val="de-DE"/>
+        </w:rPr>
+      </w:pPr>
+      <w:r>
+        <w:rPr>
+          <w:lang w:val="de-DE"/>
+        </w:rPr>
+        <w:t>40‘ Zug-Geschichten</w:t>
+      </w:r>
+    </w:p>
+    <w:p>
+      <w:pPr>
+        <w:pStyle w:val="Normal"/>
+        <w:bidi w:val="0"/>
+        <w:jc w:val="start"/>
+        <w:rPr>
+          <w:lang w:val="de-DE"/>
+        </w:rPr>
+      </w:pPr>
+      <w:r>
+        <w:rPr>
+          <w:lang w:val="de-DE"/>
+        </w:rPr>
+        <w:t>13a) Sehen Sie die Fotos an und notieren Sie zu zweit vier bis fünf Wörter zu jedem Foto. Vergleichen Sie dann im Kurs.</w:t>
+      </w:r>
+    </w:p>
+    <w:p>
+      <w:pPr>
+        <w:pStyle w:val="Normal"/>
+        <w:bidi w:val="0"/>
+        <w:jc w:val="start"/>
+        <w:rPr>
+          <w:lang w:val="de-DE"/>
+        </w:rPr>
+      </w:pPr>
+      <w:r>
+        <w:rPr>
+          <w:lang w:val="de-DE"/>
+        </w:rPr>
+        <w:t>13b) Hören Sie die Zug-Geschichten. Ordnen Sie sie den Fotos zu.</w:t>
+      </w:r>
+    </w:p>
+    <w:p>
+      <w:pPr>
+        <w:pStyle w:val="Normal"/>
+        <w:bidi w:val="0"/>
+        <w:jc w:val="start"/>
+        <w:rPr>
+          <w:lang w:val="de-DE"/>
+        </w:rPr>
+      </w:pPr>
+      <w:r>
+        <w:rPr>
+          <w:lang w:val="de-DE"/>
+        </w:rPr>
+        <w:t>13c) Hören Sie noch einmal und ergänzen Sie die Sätze.</w:t>
+      </w:r>
+    </w:p>
+    <w:p>
+      <w:pPr>
+        <w:pStyle w:val="Normal"/>
+        <w:bidi w:val="0"/>
+        <w:jc w:val="start"/>
+        <w:rPr>
+          <w:lang w:val="de-DE"/>
+        </w:rPr>
+      </w:pPr>
+      <w:r>
+        <w:rPr>
+          <w:lang w:val="de-DE"/>
+        </w:rPr>
+        <w:t>13d) Arbeiten Sie zu dritt. Wählen Sie ein Bild oder eine andere Situation im Zug. Überlegen Sie sich eine Geschichte. Sammeln Sie Ideen und machen Sie Notizen.</w:t>
+      </w:r>
+    </w:p>
+    <w:p>
+      <w:pPr>
+        <w:pStyle w:val="Normal"/>
+        <w:bidi w:val="0"/>
+        <w:jc w:val="start"/>
+        <w:rPr>
+          <w:lang w:val="de-DE"/>
+        </w:rPr>
+      </w:pPr>
+      <w:r>
+        <w:rPr>
+          <w:lang w:val="de-DE"/>
+        </w:rPr>
+      </w:r>
+    </w:p>
+    <w:p>
+      <w:pPr>
+        <w:pStyle w:val="Normal"/>
+        <w:bidi w:val="0"/>
+        <w:jc w:val="start"/>
+        <w:rPr>
+          <w:lang w:val="de-DE"/>
+        </w:rPr>
+      </w:pPr>
+      <w:r>
+        <w:rPr>
+          <w:lang w:val="de-DE"/>
+        </w:rPr>
+        <w:t>HAG: Seite 88, Video: die Netzwerk-WG</w:t>
+      </w:r>
+    </w:p>
+    <w:p>
+      <w:pPr>
+        <w:pStyle w:val="Normal"/>
+        <w:bidi w:val="0"/>
+        <w:jc w:val="start"/>
+        <w:rPr>
+          <w:lang w:val="de-DE"/>
+        </w:rPr>
+      </w:pPr>
+      <w:r>
+        <w:rPr>
+          <w:lang w:val="de-DE"/>
+        </w:rPr>
+      </w:r>
+    </w:p>
+    <w:p>
+      <w:pPr>
+        <w:pStyle w:val="Normal"/>
+        <w:bidi w:val="0"/>
+        <w:jc w:val="start"/>
+        <w:rPr>
+          <w:lang w:val="de-DE"/>
+        </w:rPr>
+      </w:pPr>
+      <w:r>
+        <w:rPr>
+          <w:lang w:val="de-DE"/>
+        </w:rPr>
+      </w:r>
+    </w:p>
+    <w:p>
+      <w:pPr>
+        <w:pStyle w:val="Normal"/>
+        <w:bidi w:val="0"/>
+        <w:jc w:val="start"/>
+        <w:rPr>
+          <w:lang w:val="de-DE"/>
+        </w:rPr>
+      </w:pPr>
+      <w:r>
+        <w:rPr>
+          <w:lang w:val="de-DE"/>
+        </w:rPr>
+      </w:r>
+    </w:p>
+    <w:p>
+      <w:pPr>
+        <w:pStyle w:val="Normal"/>
+        <w:bidi w:val="0"/>
+        <w:jc w:val="start"/>
+        <w:rPr>
+          <w:lang w:val="de-DE"/>
+        </w:rPr>
+      </w:pPr>
+      <w:r>
+        <w:rPr>
+          <w:lang w:val="de-DE"/>
+        </w:rPr>
+      </w:r>
+    </w:p>
+    <w:p>
+      <w:pPr>
+        <w:pStyle w:val="Normal"/>
+        <w:bidi w:val="0"/>
+        <w:jc w:val="start"/>
+        <w:rPr>
+          <w:lang w:val="de-DE"/>
+        </w:rPr>
+      </w:pPr>
+      <w:r>
+        <w:rPr>
+          <w:lang w:val="de-DE"/>
+        </w:rPr>
+      </w:r>
+    </w:p>
+    <w:p>
+      <w:pPr>
+        <w:pStyle w:val="Normal"/>
+        <w:bidi w:val="0"/>
+        <w:jc w:val="start"/>
+        <w:rPr>
+          <w:lang w:val="de-DE"/>
+        </w:rPr>
+      </w:pPr>
+      <w:r>
+        <w:rPr/>
         <w:t>******************************************</w:t>
-      </w:r>
-    </w:p>
-    <w:p>
-      <w:pPr>
-        <w:pStyle w:val="Normal"/>
-        <w:bidi w:val="0"/>
-        <w:jc w:val="start"/>
-        <w:rPr>
-          <w:lang w:val="de-DE"/>
-        </w:rPr>
-      </w:pPr>
-      <w:r>
-        <w:rPr>
-          <w:lang w:val="de-DE"/>
-        </w:rPr>
-        <w:t xml:space="preserve">Sechstes </w:t>
-      </w:r>
-      <w:r>
-        <w:rPr>
-          <w:lang w:val="de-DE"/>
-        </w:rPr>
-        <w:t xml:space="preserve">Niveau, </w:t>
-      </w:r>
-      <w:r>
-        <w:rPr>
-          <w:lang w:val="de-DE"/>
-        </w:rPr>
-        <w:t>vierte</w:t>
-      </w:r>
-      <w:r>
-        <w:rPr>
-          <w:lang w:val="de-DE"/>
-        </w:rPr>
-        <w:t xml:space="preserve"> Woche, Montag den 02.03.26</w:t>
-      </w:r>
-    </w:p>
-    <w:p>
-      <w:pPr>
-        <w:pStyle w:val="Normal"/>
-        <w:bidi w:val="0"/>
-        <w:jc w:val="start"/>
-        <w:rPr>
-          <w:lang w:val="de-DE"/>
-        </w:rPr>
-      </w:pPr>
-      <w:r>
-        <w:rPr>
-          <w:lang w:val="de-DE"/>
-        </w:rPr>
-      </w:r>
-    </w:p>
-    <w:p>
-      <w:pPr>
-        <w:pStyle w:val="Normal"/>
-        <w:bidi w:val="0"/>
-        <w:jc w:val="start"/>
-        <w:rPr>
-          <w:lang w:val="de-DE"/>
-        </w:rPr>
-      </w:pPr>
-      <w:r>
-        <w:rPr>
-          <w:lang w:val="de-DE"/>
-        </w:rPr>
-        <w:t>10‘ Wissen die KT noch Vokabeln zum Thema Gesundheit und gesundes Leben? Was für eine „Note“ haben sie erzielt? Was noch können sie tun, um ein besseres Leben zu führen?</w:t>
-      </w:r>
-    </w:p>
-    <w:p>
-      <w:pPr>
-        <w:pStyle w:val="Normal"/>
-        <w:bidi w:val="0"/>
-        <w:jc w:val="start"/>
-        <w:rPr>
-          <w:lang w:val="de-DE"/>
-        </w:rPr>
-      </w:pPr>
-      <w:r>
-        <w:rPr>
-          <w:lang w:val="de-DE"/>
-        </w:rPr>
-      </w:r>
-    </w:p>
-    <w:p>
-      <w:pPr>
-        <w:pStyle w:val="Normal"/>
-        <w:bidi w:val="0"/>
-        <w:jc w:val="start"/>
-        <w:rPr>
-          <w:lang w:val="de-DE"/>
-        </w:rPr>
-      </w:pPr>
-      <w:r>
-        <w:rPr>
-          <w:lang w:val="de-DE"/>
-        </w:rPr>
-        <w:t>Im Krankenh</w:t>
-      </w:r>
-      <w:r>
-        <w:rPr>
-          <w:lang w:val="de-DE"/>
-        </w:rPr>
-        <w:t>aus</w:t>
-      </w:r>
-    </w:p>
-    <w:p>
-      <w:pPr>
-        <w:pStyle w:val="Normal"/>
-        <w:bidi w:val="0"/>
-        <w:jc w:val="start"/>
-        <w:rPr>
-          <w:lang w:val="de-DE"/>
-        </w:rPr>
-      </w:pPr>
-      <w:r>
-        <w:rPr>
-          <w:lang w:val="de-DE"/>
-        </w:rPr>
-        <w:t>10‘ Arbeiten Sie zu zweit. Sehen Sie das Bild an und notieren Sie möglichst viele Wörter. Vergleichen Sie dann im Kurs.</w:t>
-      </w:r>
-    </w:p>
-    <w:p>
-      <w:pPr>
-        <w:pStyle w:val="Normal"/>
-        <w:bidi w:val="0"/>
-        <w:jc w:val="start"/>
-        <w:rPr>
-          <w:lang w:val="de-DE"/>
-        </w:rPr>
-      </w:pPr>
-      <w:r>
-        <w:rPr>
-          <w:lang w:val="de-DE"/>
-        </w:rPr>
-        <w:t>10‘ Hören Sie die Gespräche im Kankenzimmer. Welche Hilfe braucht der Patient? Warum?</w:t>
-      </w:r>
-    </w:p>
-    <w:p>
-      <w:pPr>
-        <w:pStyle w:val="Normal"/>
-        <w:bidi w:val="0"/>
-        <w:jc w:val="start"/>
-        <w:rPr>
-          <w:lang w:val="de-DE"/>
-        </w:rPr>
-      </w:pPr>
-      <w:r>
-        <w:rPr>
-          <w:lang w:val="de-DE"/>
-        </w:rPr>
-        <w:t>10‘ Lesen Sie die Ausdrücke und hören Sie die Gespräche</w:t>
-      </w:r>
-    </w:p>
-    <w:p>
-      <w:pPr>
-        <w:pStyle w:val="Normal"/>
-        <w:bidi w:val="0"/>
-        <w:jc w:val="start"/>
-        <w:rPr>
-          <w:lang w:val="de-DE"/>
-        </w:rPr>
-      </w:pPr>
-      <w:r>
-        <w:rPr>
-          <w:lang w:val="de-DE"/>
-        </w:rPr>
-      </w:r>
-    </w:p>
-    <w:p>
-      <w:pPr>
-        <w:pStyle w:val="Normal"/>
-        <w:bidi w:val="0"/>
-        <w:jc w:val="start"/>
-        <w:rPr>
-          <w:lang w:val="de-DE"/>
-        </w:rPr>
-      </w:pPr>
-      <w:r>
-        <w:rPr>
-          <w:lang w:val="de-DE"/>
-        </w:rPr>
-      </w:r>
-    </w:p>
-    <w:p>
-      <w:pPr>
-        <w:pStyle w:val="Normal"/>
-        <w:bidi w:val="0"/>
-        <w:jc w:val="start"/>
-        <w:rPr>
-          <w:lang w:val="de-DE"/>
-        </w:rPr>
-      </w:pPr>
-      <w:r>
-        <w:rPr>
-          <w:lang w:val="de-DE"/>
-        </w:rPr>
-      </w:r>
-    </w:p>
-    <w:p>
-      <w:pPr>
-        <w:pStyle w:val="Normal"/>
-        <w:bidi w:val="0"/>
-        <w:jc w:val="start"/>
-        <w:rPr>
-          <w:lang w:val="de-DE"/>
-        </w:rPr>
-      </w:pPr>
-      <w:r>
-        <w:rPr>
-          <w:lang w:val="de-DE"/>
-        </w:rPr>
-      </w:r>
-    </w:p>
-    <w:p>
-      <w:pPr>
-        <w:pStyle w:val="Normal"/>
-        <w:bidi w:val="0"/>
-        <w:jc w:val="start"/>
-        <w:rPr>
-          <w:lang w:val="de-DE"/>
-        </w:rPr>
-      </w:pPr>
-      <w:r>
-        <w:rPr>
-          <w:lang w:val="de-DE"/>
-        </w:rPr>
       </w:r>
     </w:p>
     <w:p>

</xml_diff>

<commit_message>
mini cambios a los planes de clase
</commit_message>
<xml_diff>
--- a/planesDeClaseSegundo.docx
+++ b/planesDeClaseSegundo.docx
@@ -1,6 +1,6 @@
 
 <file path=word/document.xml><?xml version="1.0" encoding="utf-8"?>
-<w:document xmlns:o="urn:schemas-microsoft-com:office:office" xmlns:r="http://schemas.openxmlformats.org/officeDocument/2006/relationships" xmlns:v="urn:schemas-microsoft-com:vml" xmlns:w="http://schemas.openxmlformats.org/wordprocessingml/2006/main" xmlns:w10="urn:schemas-microsoft-com:office:word" xmlns:wp="http://schemas.openxmlformats.org/drawingml/2006/wordprocessingDrawing" xmlns:pic="http://schemas.openxmlformats.org/drawingml/2006/picture" xmlns:wps="http://schemas.microsoft.com/office/word/2010/wordprocessingShape" xmlns:wpg="http://schemas.microsoft.com/office/word/2010/wordprocessingGroup" xmlns:mc="http://schemas.openxmlformats.org/markup-compatibility/2006" xmlns:wp14="http://schemas.microsoft.com/office/word/2010/wordprocessingDrawing" xmlns:w14="http://schemas.microsoft.com/office/word/2010/wordml" xmlns:w15="http://schemas.microsoft.com/office/word/2012/wordml" mc:Ignorable="w14 wp14 w15">
+<w:document xmlns:o="urn:schemas-microsoft-com:office:office" xmlns:r="http://schemas.openxmlformats.org/officeDocument/2006/relationships" xmlns:v="urn:schemas-microsoft-com:vml" xmlns:w="http://schemas.openxmlformats.org/wordprocessingml/2006/main" xmlns:w10="urn:schemas-microsoft-com:office:word" xmlns:wp="http://schemas.openxmlformats.org/drawingml/2006/wordprocessingDrawing" xmlns:wps="http://schemas.microsoft.com/office/word/2010/wordprocessingShape" xmlns:wpg="http://schemas.microsoft.com/office/word/2010/wordprocessingGroup" xmlns:mc="http://schemas.openxmlformats.org/markup-compatibility/2006" xmlns:wp14="http://schemas.microsoft.com/office/word/2010/wordprocessingDrawing" xmlns:w14="http://schemas.microsoft.com/office/word/2010/wordml" xmlns:w15="http://schemas.microsoft.com/office/word/2012/wordml" mc:Ignorable="w14 wp14 w15">
   <w:body>
     <w:p>
       <w:pPr>
@@ -15,7 +15,19 @@
         <w:rPr>
           <w:lang w:val="de-DE"/>
         </w:rPr>
-        <w:t>Zweites Niveau, dritte Woche, Montag den 02.03.26</w:t>
+        <w:t xml:space="preserve">Zweites Niveau, </w:t>
+      </w:r>
+      <w:r>
+        <w:rPr>
+          <w:lang w:val="de-DE"/>
+        </w:rPr>
+        <w:t>vierte</w:t>
+      </w:r>
+      <w:r>
+        <w:rPr>
+          <w:lang w:val="de-DE"/>
+        </w:rPr>
+        <w:t xml:space="preserve"> Woche, Montag den 02.03.26</w:t>
       </w:r>
     </w:p>
     <w:p>
@@ -768,41 +780,27 @@
       </w:pPr>
       <w:r>
         <w:rPr/>
-        <w:t xml:space="preserve">10‘ </w:t>
-      </w:r>
-      <w:r>
-        <w:rPr/>
-        <w:t>11a) Lesen Sie. Wie kommen die drei Personen zur Arbeit? Welche Verkehrsmittel benutzen sie? Wie lange brauchen sie? Notieren Sie.</w:t>
-      </w:r>
-    </w:p>
-    <w:p>
-      <w:pPr>
-        <w:pStyle w:val="Normal"/>
-        <w:bidi w:val="0"/>
-        <w:jc w:val="start"/>
-        <w:rPr>
-          <w:lang w:val="de-DE"/>
-        </w:rPr>
-      </w:pPr>
-      <w:r>
-        <w:rPr/>
-        <w:t xml:space="preserve">15‘ </w:t>
-      </w:r>
-      <w:r>
-        <w:rPr/>
-        <w:t>11b) Wie kommen Sie zum Sprachkurs? Machen Sie eine Schlange.</w:t>
-      </w:r>
-      <w:r>
-        <w:rPr>
-          <w:lang w:val="de-DE"/>
-        </w:rPr>
-        <w:t xml:space="preserve"> </w:t>
-      </w:r>
-      <w:r>
-        <w:rPr>
-          <w:lang w:val="de-DE"/>
-        </w:rPr>
-        <w:t>Wer braucht am längsten? Er/sie steht ganz vorn. Wer braucht am kürzesten? Er/Sie steht ganz hinten.</w:t>
+        <w:t>10‘ 11a) Lesen Sie. Wie kommen die drei Personen zur Arbeit? Welche Verkehrsmittel benutzen sie? Wie lange brauchen sie? Notieren Sie.</w:t>
+      </w:r>
+    </w:p>
+    <w:p>
+      <w:pPr>
+        <w:pStyle w:val="Normal"/>
+        <w:bidi w:val="0"/>
+        <w:jc w:val="start"/>
+        <w:rPr>
+          <w:lang w:val="de-DE"/>
+        </w:rPr>
+      </w:pPr>
+      <w:r>
+        <w:rPr/>
+        <w:t>15‘ 11b) Wie kommen Sie zum Sprachkurs? Machen Sie eine Schlange.</w:t>
+      </w:r>
+      <w:r>
+        <w:rPr>
+          <w:lang w:val="de-DE"/>
+        </w:rPr>
+        <w:t xml:space="preserve"> Wer braucht am längsten? Er/sie steht ganz vorn. Wer braucht am kürzesten? Er/Sie steht ganz hinten.</w:t>
       </w:r>
     </w:p>
     <w:p>
@@ -2585,7 +2583,7 @@
     </w:rPr>
   </w:style>
   <w:style w:type="paragraph" w:styleId="Caption">
-    <w:name w:val="caption"/>
+    <w:name w:val="Caption"/>
     <w:basedOn w:val="Normal"/>
     <w:qFormat/>
     <w:pPr>

</xml_diff>

<commit_message>
nuevos agregados al plan de segundo
</commit_message>
<xml_diff>
--- a/planesDeClaseSegundo.docx
+++ b/planesDeClaseSegundo.docx
@@ -2,6 +2,151 @@
 <file path=word/document.xml><?xml version="1.0" encoding="utf-8"?>
 <w:document xmlns:o="urn:schemas-microsoft-com:office:office" xmlns:r="http://schemas.openxmlformats.org/officeDocument/2006/relationships" xmlns:v="urn:schemas-microsoft-com:vml" xmlns:w="http://schemas.openxmlformats.org/wordprocessingml/2006/main" xmlns:w10="urn:schemas-microsoft-com:office:word" xmlns:wp="http://schemas.openxmlformats.org/drawingml/2006/wordprocessingDrawing" xmlns:wps="http://schemas.microsoft.com/office/word/2010/wordprocessingShape" xmlns:wpg="http://schemas.microsoft.com/office/word/2010/wordprocessingGroup" xmlns:mc="http://schemas.openxmlformats.org/markup-compatibility/2006" xmlns:wp14="http://schemas.microsoft.com/office/word/2010/wordprocessingDrawing" xmlns:w14="http://schemas.microsoft.com/office/word/2010/wordml" xmlns:w15="http://schemas.microsoft.com/office/word/2012/wordml" mc:Ignorable="w14 wp14 w15">
   <w:body>
+    <w:p>
+      <w:pPr>
+        <w:pStyle w:val="Normal"/>
+        <w:bidi w:val="0"/>
+        <w:jc w:val="start"/>
+        <w:rPr>
+          <w:lang w:val="de-DE"/>
+        </w:rPr>
+      </w:pPr>
+      <w:r>
+        <w:rPr>
+          <w:lang w:val="de-DE"/>
+        </w:rPr>
+        <w:t xml:space="preserve">Zweites Niveau, vierte Woche, </w:t>
+      </w:r>
+      <w:r>
+        <w:rPr>
+          <w:lang w:val="de-DE"/>
+        </w:rPr>
+        <w:t>Mittwoch</w:t>
+      </w:r>
+      <w:r>
+        <w:rPr>
+          <w:lang w:val="de-DE"/>
+        </w:rPr>
+        <w:t xml:space="preserve"> den 0</w:t>
+      </w:r>
+      <w:r>
+        <w:rPr>
+          <w:lang w:val="de-DE"/>
+        </w:rPr>
+        <w:t>4</w:t>
+      </w:r>
+      <w:r>
+        <w:rPr>
+          <w:lang w:val="de-DE"/>
+        </w:rPr>
+        <w:t>.03.26</w:t>
+      </w:r>
+    </w:p>
+    <w:p>
+      <w:pPr>
+        <w:pStyle w:val="Normal"/>
+        <w:bidi w:val="0"/>
+        <w:jc w:val="start"/>
+        <w:rPr>
+          <w:lang w:val="de-DE"/>
+        </w:rPr>
+      </w:pPr>
+      <w:r>
+        <w:rPr/>
+      </w:r>
+    </w:p>
+    <w:p>
+      <w:pPr>
+        <w:pStyle w:val="Normal"/>
+        <w:bidi w:val="0"/>
+        <w:jc w:val="start"/>
+        <w:rPr>
+          <w:lang w:val="de-DE"/>
+        </w:rPr>
+      </w:pPr>
+      <w:r>
+        <w:rPr>
+          <w:lang w:val="de-DE"/>
+        </w:rPr>
+        <w:t>40‘ Kaffeklatsch</w:t>
+      </w:r>
+    </w:p>
+    <w:p>
+      <w:pPr>
+        <w:pStyle w:val="Normal"/>
+        <w:bidi w:val="0"/>
+        <w:jc w:val="start"/>
+        <w:rPr>
+          <w:lang w:val="de-DE"/>
+        </w:rPr>
+      </w:pPr>
+      <w:r>
+        <w:rPr>
+          <w:lang w:val="de-DE"/>
+        </w:rPr>
+        <w:t>1d) Meinen Mann, seine Freunde, … lesen Sie und markieren Sie die Possessivartikel und Nomen im Akkusativ.</w:t>
+      </w:r>
+    </w:p>
+    <w:p>
+      <w:pPr>
+        <w:pStyle w:val="Normal"/>
+        <w:bidi w:val="0"/>
+        <w:jc w:val="start"/>
+        <w:rPr>
+          <w:lang w:val="de-DE"/>
+        </w:rPr>
+      </w:pPr>
+      <w:r>
+        <w:rPr>
+          <w:lang w:val="de-DE"/>
+        </w:rPr>
+        <w:t>1e) Andere Personen, andere Themen. Variieren Sie den Dialog.</w:t>
+      </w:r>
+    </w:p>
+    <w:p>
+      <w:pPr>
+        <w:pStyle w:val="Normal"/>
+        <w:bidi w:val="0"/>
+        <w:jc w:val="start"/>
+        <w:rPr>
+          <w:lang w:val="de-DE"/>
+        </w:rPr>
+      </w:pPr>
+      <w:r>
+        <w:rPr>
+          <w:lang w:val="de-DE"/>
+        </w:rPr>
+      </w:r>
+    </w:p>
+    <w:p>
+      <w:pPr>
+        <w:pStyle w:val="Normal"/>
+        <w:bidi w:val="0"/>
+        <w:jc w:val="start"/>
+        <w:rPr>
+          <w:lang w:val="de-DE"/>
+        </w:rPr>
+      </w:pPr>
+      <w:r>
+        <w:rPr>
+          <w:lang w:val="de-DE"/>
+        </w:rPr>
+        <w:t>******************************************</w:t>
+      </w:r>
+    </w:p>
+    <w:p>
+      <w:pPr>
+        <w:pStyle w:val="Normal"/>
+        <w:bidi w:val="0"/>
+        <w:jc w:val="start"/>
+        <w:rPr>
+          <w:lang w:val="de-DE"/>
+        </w:rPr>
+      </w:pPr>
+      <w:r>
+        <w:rPr/>
+      </w:r>
+    </w:p>
     <w:p>
       <w:pPr>
         <w:pStyle w:val="Normal"/>

</xml_diff>

<commit_message>
planes de clase para el viernes 6 de marzo
</commit_message>
<xml_diff>
--- a/planesDeClaseSegundo.docx
+++ b/planesDeClaseSegundo.docx
@@ -15,6 +15,972 @@
         <w:rPr>
           <w:lang w:val="de-DE"/>
         </w:rPr>
+        <w:t xml:space="preserve">Zweites Niveau, vierte Woche, </w:t>
+      </w:r>
+      <w:r>
+        <w:rPr>
+          <w:lang w:val="de-DE"/>
+        </w:rPr>
+        <w:t>Freitag</w:t>
+      </w:r>
+      <w:r>
+        <w:rPr>
+          <w:lang w:val="de-DE"/>
+        </w:rPr>
+        <w:t xml:space="preserve"> den 0</w:t>
+      </w:r>
+      <w:r>
+        <w:rPr>
+          <w:lang w:val="de-DE"/>
+        </w:rPr>
+        <w:t>6</w:t>
+      </w:r>
+      <w:r>
+        <w:rPr>
+          <w:lang w:val="de-DE"/>
+        </w:rPr>
+        <w:t>.03.26</w:t>
+      </w:r>
+    </w:p>
+    <w:p>
+      <w:pPr>
+        <w:pStyle w:val="Normal"/>
+        <w:bidi w:val="0"/>
+        <w:jc w:val="start"/>
+        <w:rPr>
+          <w:lang w:val="de-DE"/>
+        </w:rPr>
+      </w:pPr>
+      <w:r>
+        <w:rPr>
+          <w:lang w:val="de-DE"/>
+        </w:rPr>
+        <w:t>15‘ Die Kursteilnehmer lesen die ich-Texte von ihren Partnern: „Meine Familie“. Danach sprechen sie über die Familien ihrer Partner.</w:t>
+      </w:r>
+    </w:p>
+    <w:p>
+      <w:pPr>
+        <w:pStyle w:val="Normal"/>
+        <w:bidi w:val="0"/>
+        <w:jc w:val="start"/>
+        <w:rPr>
+          <w:lang w:val="de-DE"/>
+        </w:rPr>
+      </w:pPr>
+      <w:r>
+        <w:rPr>
+          <w:lang w:val="de-DE"/>
+        </w:rPr>
+      </w:r>
+    </w:p>
+    <w:p>
+      <w:pPr>
+        <w:pStyle w:val="Normal"/>
+        <w:bidi w:val="0"/>
+        <w:jc w:val="start"/>
+        <w:rPr>
+          <w:lang w:val="de-DE"/>
+        </w:rPr>
+      </w:pPr>
+      <w:r>
+        <w:rPr>
+          <w:lang w:val="de-DE"/>
+        </w:rPr>
+        <w:t>45</w:t>
+      </w:r>
+      <w:r>
+        <w:rPr>
+          <w:lang w:val="de-DE"/>
+        </w:rPr>
+        <w:t>‘ Grammatikübungen</w:t>
+      </w:r>
+    </w:p>
+    <w:p>
+      <w:pPr>
+        <w:pStyle w:val="Normal"/>
+        <w:bidi w:val="0"/>
+        <w:jc w:val="start"/>
+        <w:rPr>
+          <w:lang w:val="de-DE"/>
+        </w:rPr>
+      </w:pPr>
+      <w:r>
+        <w:rPr>
+          <w:lang w:val="de-DE"/>
+        </w:rPr>
+        <w:t>1, 3c, 7a, 7b, 7c, 9</w:t>
+      </w:r>
+    </w:p>
+    <w:p>
+      <w:pPr>
+        <w:pStyle w:val="Normal"/>
+        <w:bidi w:val="0"/>
+        <w:jc w:val="start"/>
+        <w:rPr>
+          <w:lang w:val="de-DE"/>
+        </w:rPr>
+      </w:pPr>
+      <w:r>
+        <w:rPr>
+          <w:lang w:val="de-DE"/>
+        </w:rPr>
+      </w:r>
+    </w:p>
+    <w:p>
+      <w:pPr>
+        <w:pStyle w:val="Normal"/>
+        <w:bidi w:val="0"/>
+        <w:jc w:val="start"/>
+        <w:rPr>
+          <w:lang w:val="de-DE"/>
+        </w:rPr>
+      </w:pPr>
+      <w:r>
+        <w:rPr>
+          <w:lang w:val="de-DE"/>
+        </w:rPr>
+        <w:t>10‘ Seite 147 Fit für Einheit 11?</w:t>
+      </w:r>
+    </w:p>
+    <w:p>
+      <w:pPr>
+        <w:pStyle w:val="Normal"/>
+        <w:bidi w:val="0"/>
+        <w:jc w:val="start"/>
+        <w:rPr>
+          <w:lang w:val="de-DE"/>
+        </w:rPr>
+      </w:pPr>
+      <w:r>
+        <w:rPr>
+          <w:lang w:val="de-DE"/>
+        </w:rPr>
+        <w:t>Die KT sehen sich die ganzen Themen an und bewerten sie nach Beherrschungsgrad.</w:t>
+      </w:r>
+    </w:p>
+    <w:p>
+      <w:pPr>
+        <w:pStyle w:val="Normal"/>
+        <w:bidi w:val="0"/>
+        <w:jc w:val="start"/>
+        <w:rPr>
+          <w:lang w:val="de-DE"/>
+        </w:rPr>
+      </w:pPr>
+      <w:r>
+        <w:rPr>
+          <w:lang w:val="de-DE"/>
+        </w:rPr>
+        <w:t>20‘ Ein Paar Themen, die von den Kursteilnehmer gewählt wurden werden besprochen.</w:t>
+      </w:r>
+    </w:p>
+    <w:p>
+      <w:pPr>
+        <w:pStyle w:val="Normal"/>
+        <w:bidi w:val="0"/>
+        <w:jc w:val="start"/>
+        <w:rPr>
+          <w:lang w:val="de-DE"/>
+        </w:rPr>
+      </w:pPr>
+      <w:r>
+        <w:rPr>
+          <w:lang w:val="de-DE"/>
+        </w:rPr>
+        <w:t>30‘ Einleitung in Lektion 11</w:t>
+      </w:r>
+    </w:p>
+    <w:p>
+      <w:pPr>
+        <w:pStyle w:val="Normal"/>
+        <w:bidi w:val="0"/>
+        <w:jc w:val="start"/>
+        <w:rPr>
+          <w:lang w:val="de-DE"/>
+        </w:rPr>
+      </w:pPr>
+      <w:r>
+        <w:rPr>
+          <w:lang w:val="de-DE"/>
+        </w:rPr>
+      </w:r>
+    </w:p>
+    <w:p>
+      <w:pPr>
+        <w:pStyle w:val="Normal"/>
+        <w:bidi w:val="0"/>
+        <w:jc w:val="start"/>
+        <w:rPr>
+          <w:lang w:val="de-DE"/>
+        </w:rPr>
+      </w:pPr>
+      <w:r>
+        <w:rPr>
+          <w:lang w:val="de-DE"/>
+        </w:rPr>
+        <w:t>******************************************</w:t>
+      </w:r>
+    </w:p>
+    <w:p>
+      <w:pPr>
+        <w:pStyle w:val="Normal"/>
+        <w:bidi w:val="0"/>
+        <w:jc w:val="start"/>
+        <w:rPr>
+          <w:lang w:val="de-DE"/>
+        </w:rPr>
+      </w:pPr>
+      <w:r>
+        <w:rPr>
+          <w:lang w:val="de-DE"/>
+        </w:rPr>
+        <w:t>Sechstes</w:t>
+      </w:r>
+      <w:r>
+        <w:rPr>
+          <w:lang w:val="de-DE"/>
+        </w:rPr>
+        <w:t xml:space="preserve"> Niveau, vierte Woche, </w:t>
+      </w:r>
+      <w:r>
+        <w:rPr>
+          <w:lang w:val="de-DE"/>
+        </w:rPr>
+        <w:t>Freitag</w:t>
+      </w:r>
+      <w:r>
+        <w:rPr>
+          <w:lang w:val="de-DE"/>
+        </w:rPr>
+        <w:t xml:space="preserve"> den 0</w:t>
+      </w:r>
+      <w:r>
+        <w:rPr>
+          <w:lang w:val="de-DE"/>
+        </w:rPr>
+        <w:t>6</w:t>
+      </w:r>
+      <w:r>
+        <w:rPr>
+          <w:lang w:val="de-DE"/>
+        </w:rPr>
+        <w:t>.03.26</w:t>
+      </w:r>
+    </w:p>
+    <w:p>
+      <w:pPr>
+        <w:pStyle w:val="Normal"/>
+        <w:bidi w:val="0"/>
+        <w:jc w:val="start"/>
+        <w:rPr>
+          <w:lang w:val="de-DE"/>
+        </w:rPr>
+      </w:pPr>
+      <w:r>
+        <w:rPr>
+          <w:lang w:val="de-DE"/>
+        </w:rPr>
+      </w:r>
+    </w:p>
+    <w:p>
+      <w:pPr>
+        <w:pStyle w:val="Normal"/>
+        <w:bidi w:val="0"/>
+        <w:jc w:val="start"/>
+        <w:rPr>
+          <w:lang w:val="de-DE"/>
+        </w:rPr>
+      </w:pPr>
+      <w:r>
+        <w:rPr>
+          <w:lang w:val="de-DE"/>
+        </w:rPr>
+        <w:t xml:space="preserve">15‘ Vokabeltest </w:t>
+      </w:r>
+    </w:p>
+    <w:p>
+      <w:pPr>
+        <w:pStyle w:val="Normal"/>
+        <w:bidi w:val="0"/>
+        <w:jc w:val="start"/>
+        <w:rPr>
+          <w:lang w:val="de-DE"/>
+        </w:rPr>
+      </w:pPr>
+      <w:r>
+        <w:rPr>
+          <w:lang w:val="de-DE"/>
+        </w:rPr>
+        <w:t>Der KT sagt verschiedene Wörter oder Phrasen auf Spanisch. Die KT suchen sie im Text auf Seite 93 (informationen für Ihren Aufenthalt in unserer Klinik). Immer muss man versuchen sich durchs Lesen neue Vokabeln anzueignen.</w:t>
+      </w:r>
+    </w:p>
+    <w:p>
+      <w:pPr>
+        <w:pStyle w:val="Normal"/>
+        <w:bidi w:val="0"/>
+        <w:jc w:val="start"/>
+        <w:rPr>
+          <w:lang w:val="de-DE"/>
+        </w:rPr>
+      </w:pPr>
+      <w:r>
+        <w:rPr>
+          <w:lang w:val="de-DE"/>
+        </w:rPr>
+      </w:r>
+    </w:p>
+    <w:p>
+      <w:pPr>
+        <w:pStyle w:val="Normal"/>
+        <w:bidi w:val="0"/>
+        <w:jc w:val="start"/>
+        <w:rPr>
+          <w:lang w:val="de-DE"/>
+        </w:rPr>
+      </w:pPr>
+      <w:r>
+        <w:rPr>
+          <w:lang w:val="de-DE"/>
+        </w:rPr>
+        <w:t>10‘ Die KT erzählen von den Texten, die sie gerade lesen. Haben sie die Texte interessant gefunden? Sind die einfach zu lesen?</w:t>
+      </w:r>
+    </w:p>
+    <w:p>
+      <w:pPr>
+        <w:pStyle w:val="Normal"/>
+        <w:bidi w:val="0"/>
+        <w:jc w:val="start"/>
+        <w:rPr>
+          <w:lang w:val="de-DE"/>
+        </w:rPr>
+      </w:pPr>
+      <w:r>
+        <w:rPr>
+          <w:lang w:val="de-DE"/>
+        </w:rPr>
+      </w:r>
+    </w:p>
+    <w:p>
+      <w:pPr>
+        <w:pStyle w:val="Normal"/>
+        <w:bidi w:val="0"/>
+        <w:jc w:val="start"/>
+        <w:rPr>
+          <w:lang w:val="de-DE"/>
+        </w:rPr>
+      </w:pPr>
+      <w:r>
+        <w:rPr>
+          <w:lang w:val="de-DE"/>
+        </w:rPr>
+        <w:t>30‘ Die Kursteilnehmer spielen Ihre Lieblingssongs vor</w:t>
+      </w:r>
+    </w:p>
+    <w:p>
+      <w:pPr>
+        <w:pStyle w:val="Normal"/>
+        <w:bidi w:val="0"/>
+        <w:jc w:val="start"/>
+        <w:rPr>
+          <w:lang w:val="de-DE"/>
+        </w:rPr>
+      </w:pPr>
+      <w:r>
+        <w:rPr>
+          <w:lang w:val="de-DE"/>
+        </w:rPr>
+        <w:t>- Die KT erklären, warum sie die Lieder lieben, und was für Emotionen sie in ihnen erwecken.</w:t>
+      </w:r>
+    </w:p>
+    <w:p>
+      <w:pPr>
+        <w:pStyle w:val="Normal"/>
+        <w:bidi w:val="0"/>
+        <w:jc w:val="start"/>
+        <w:rPr>
+          <w:lang w:val="de-DE"/>
+        </w:rPr>
+      </w:pPr>
+      <w:r>
+        <w:rPr>
+          <w:lang w:val="de-DE"/>
+        </w:rPr>
+        <w:t>- Die Klassenkameraden stellen den Ktn Fragen zum Thema.</w:t>
+      </w:r>
+    </w:p>
+    <w:p>
+      <w:pPr>
+        <w:pStyle w:val="Normal"/>
+        <w:bidi w:val="0"/>
+        <w:jc w:val="start"/>
+        <w:rPr>
+          <w:lang w:val="de-DE"/>
+        </w:rPr>
+      </w:pPr>
+      <w:r>
+        <w:rPr>
+          <w:lang w:val="de-DE"/>
+        </w:rPr>
+      </w:r>
+    </w:p>
+    <w:p>
+      <w:pPr>
+        <w:pStyle w:val="Normal"/>
+        <w:bidi w:val="0"/>
+        <w:jc w:val="start"/>
+        <w:rPr>
+          <w:lang w:val="de-DE"/>
+        </w:rPr>
+      </w:pPr>
+      <w:r>
+        <w:rPr>
+          <w:lang w:val="de-DE"/>
+        </w:rPr>
+        <w:t>10‘6a In Welchen Situationen oder Stimmungen hören Sie welche Musik? Sprechen Sie im Kurs.</w:t>
+      </w:r>
+    </w:p>
+    <w:p>
+      <w:pPr>
+        <w:pStyle w:val="Normal"/>
+        <w:bidi w:val="0"/>
+        <w:jc w:val="start"/>
+        <w:rPr>
+          <w:lang w:val="de-DE"/>
+        </w:rPr>
+      </w:pPr>
+      <w:r>
+        <w:rPr>
+          <w:lang w:val="de-DE"/>
+        </w:rPr>
+      </w:r>
+    </w:p>
+    <w:p>
+      <w:pPr>
+        <w:pStyle w:val="Normal"/>
+        <w:bidi w:val="0"/>
+        <w:jc w:val="start"/>
+        <w:rPr>
+          <w:lang w:val="de-DE"/>
+        </w:rPr>
+      </w:pPr>
+      <w:r>
+        <w:rPr>
+          <w:lang w:val="de-DE"/>
+        </w:rPr>
+        <w:t>20‘ Lesen Sie den Zeitungsartikel über Musik. Welche Themen kommen im Text vor? Markieren Sie.</w:t>
+      </w:r>
+    </w:p>
+    <w:p>
+      <w:pPr>
+        <w:pStyle w:val="Normal"/>
+        <w:bidi w:val="0"/>
+        <w:jc w:val="start"/>
+        <w:rPr>
+          <w:lang w:val="de-DE"/>
+        </w:rPr>
+      </w:pPr>
+      <w:r>
+        <w:rPr>
+          <w:lang w:val="de-DE"/>
+        </w:rPr>
+      </w:r>
+    </w:p>
+    <w:p>
+      <w:pPr>
+        <w:pStyle w:val="Normal"/>
+        <w:bidi w:val="0"/>
+        <w:jc w:val="start"/>
+        <w:rPr>
+          <w:lang w:val="de-DE"/>
+        </w:rPr>
+      </w:pPr>
+      <w:r>
+        <w:rPr>
+          <w:lang w:val="de-DE"/>
+        </w:rPr>
+        <w:t>10‘ Lesen Sie den Text noch einmal. Welche Sätze sind richtig? Kreuzen Sie an.</w:t>
+      </w:r>
+    </w:p>
+    <w:p>
+      <w:pPr>
+        <w:pStyle w:val="Normal"/>
+        <w:bidi w:val="0"/>
+        <w:jc w:val="start"/>
+        <w:rPr>
+          <w:lang w:val="de-DE"/>
+        </w:rPr>
+      </w:pPr>
+      <w:r>
+        <w:rPr>
+          <w:lang w:val="de-DE"/>
+        </w:rPr>
+      </w:r>
+    </w:p>
+    <w:p>
+      <w:pPr>
+        <w:pStyle w:val="Normal"/>
+        <w:bidi w:val="0"/>
+        <w:jc w:val="start"/>
+        <w:rPr>
+          <w:lang w:val="de-DE"/>
+        </w:rPr>
+      </w:pPr>
+      <w:r>
+        <w:rPr>
+          <w:lang w:val="de-DE"/>
+        </w:rPr>
+      </w:r>
+    </w:p>
+    <w:p>
+      <w:pPr>
+        <w:pStyle w:val="Normal"/>
+        <w:bidi w:val="0"/>
+        <w:jc w:val="start"/>
+        <w:rPr>
+          <w:lang w:val="de-DE"/>
+        </w:rPr>
+      </w:pPr>
+      <w:r>
+        <w:rPr>
+          <w:lang w:val="de-DE"/>
+        </w:rPr>
+        <w:t>25‘ Video: Tanzen ist Leidenschaft: https://www.youtube.com/watch?v=0w4179R9CiY</w:t>
+      </w:r>
+    </w:p>
+    <w:p>
+      <w:pPr>
+        <w:pStyle w:val="Normal"/>
+        <w:bidi w:val="0"/>
+        <w:jc w:val="start"/>
+        <w:rPr>
+          <w:lang w:val="de-DE"/>
+        </w:rPr>
+      </w:pPr>
+      <w:r>
+        <w:rPr>
+          <w:lang w:val="de-DE"/>
+        </w:rPr>
+      </w:r>
+    </w:p>
+    <w:p>
+      <w:pPr>
+        <w:pStyle w:val="Normal"/>
+        <w:bidi w:val="0"/>
+        <w:jc w:val="start"/>
+        <w:rPr>
+          <w:lang w:val="de-DE"/>
+        </w:rPr>
+      </w:pPr>
+      <w:r>
+        <w:rPr>
+          <w:lang w:val="de-DE"/>
+        </w:rPr>
+        <w:t>******************************************</w:t>
+      </w:r>
+    </w:p>
+    <w:p>
+      <w:pPr>
+        <w:pStyle w:val="Normal"/>
+        <w:bidi w:val="0"/>
+        <w:jc w:val="start"/>
+        <w:rPr>
+          <w:lang w:val="de-DE"/>
+        </w:rPr>
+      </w:pPr>
+      <w:r>
+        <w:rPr>
+          <w:lang w:val="de-DE"/>
+        </w:rPr>
+        <w:t>Viertes</w:t>
+      </w:r>
+      <w:r>
+        <w:rPr>
+          <w:lang w:val="de-DE"/>
+        </w:rPr>
+        <w:t xml:space="preserve"> Niveau, vierte Woche, </w:t>
+      </w:r>
+      <w:r>
+        <w:rPr>
+          <w:lang w:val="de-DE"/>
+        </w:rPr>
+        <w:t>Freitag</w:t>
+      </w:r>
+      <w:r>
+        <w:rPr>
+          <w:lang w:val="de-DE"/>
+        </w:rPr>
+        <w:t xml:space="preserve"> den 0</w:t>
+      </w:r>
+      <w:r>
+        <w:rPr>
+          <w:lang w:val="de-DE"/>
+        </w:rPr>
+        <w:t>6</w:t>
+      </w:r>
+      <w:r>
+        <w:rPr>
+          <w:lang w:val="de-DE"/>
+        </w:rPr>
+        <w:t>.03.26</w:t>
+      </w:r>
+    </w:p>
+    <w:p>
+      <w:pPr>
+        <w:pStyle w:val="Normal"/>
+        <w:bidi w:val="0"/>
+        <w:jc w:val="start"/>
+        <w:rPr>
+          <w:lang w:val="de-DE"/>
+        </w:rPr>
+      </w:pPr>
+      <w:r>
+        <w:rPr>
+          <w:lang w:val="de-DE"/>
+        </w:rPr>
+      </w:r>
+    </w:p>
+    <w:p>
+      <w:pPr>
+        <w:pStyle w:val="Normal"/>
+        <w:bidi w:val="0"/>
+        <w:jc w:val="start"/>
+        <w:rPr>
+          <w:lang w:val="de-DE"/>
+        </w:rPr>
+      </w:pPr>
+      <w:r>
+        <w:rPr>
+          <w:lang w:val="de-DE"/>
+        </w:rPr>
+        <w:t>10‘ Haben die KT weitergelesen? Was neues haben sie dabei gelernt?</w:t>
+      </w:r>
+    </w:p>
+    <w:p>
+      <w:pPr>
+        <w:pStyle w:val="Normal"/>
+        <w:bidi w:val="0"/>
+        <w:jc w:val="start"/>
+        <w:rPr>
+          <w:lang w:val="de-DE"/>
+        </w:rPr>
+      </w:pPr>
+      <w:r>
+        <w:rPr>
+          <w:lang w:val="de-DE"/>
+        </w:rPr>
+      </w:r>
+    </w:p>
+    <w:p>
+      <w:pPr>
+        <w:pStyle w:val="Normal"/>
+        <w:bidi w:val="0"/>
+        <w:jc w:val="start"/>
+        <w:rPr>
+          <w:lang w:val="de-DE"/>
+        </w:rPr>
+      </w:pPr>
+      <w:r>
+        <w:rPr>
+          <w:lang w:val="de-DE"/>
+        </w:rPr>
+        <w:t>20‘ Sprechen (12a) Arbeiten Sie zu zweit. Sehen Sie je eine Grafik an und berichten Sie Ihrem Partner / Ihrer Partnerin.</w:t>
+      </w:r>
+    </w:p>
+    <w:p>
+      <w:pPr>
+        <w:pStyle w:val="Normal"/>
+        <w:bidi w:val="0"/>
+        <w:jc w:val="start"/>
+        <w:rPr>
+          <w:lang w:val="de-DE"/>
+        </w:rPr>
+      </w:pPr>
+      <w:r>
+        <w:rPr>
+          <w:lang w:val="de-DE"/>
+        </w:rPr>
+      </w:r>
+    </w:p>
+    <w:p>
+      <w:pPr>
+        <w:pStyle w:val="Normal"/>
+        <w:bidi w:val="0"/>
+        <w:jc w:val="start"/>
+        <w:rPr>
+          <w:lang w:val="de-DE"/>
+        </w:rPr>
+      </w:pPr>
+      <w:r>
+        <w:rPr>
+          <w:lang w:val="de-DE"/>
+        </w:rPr>
+        <w:t>20‘ Welche Informationen aus 12a haben Sie überrascht? ← Hier werden die Redemittel vorgestellt und möglichst miteinbezogen.</w:t>
+      </w:r>
+    </w:p>
+    <w:p>
+      <w:pPr>
+        <w:pStyle w:val="Normal"/>
+        <w:bidi w:val="0"/>
+        <w:jc w:val="start"/>
+        <w:rPr>
+          <w:lang w:val="de-DE"/>
+        </w:rPr>
+      </w:pPr>
+      <w:r>
+        <w:rPr>
+          <w:lang w:val="de-DE"/>
+        </w:rPr>
+      </w:r>
+    </w:p>
+    <w:p>
+      <w:pPr>
+        <w:pStyle w:val="Normal"/>
+        <w:bidi w:val="0"/>
+        <w:jc w:val="start"/>
+        <w:rPr>
+          <w:lang w:val="de-DE"/>
+        </w:rPr>
+      </w:pPr>
+      <w:r>
+        <w:rPr>
+          <w:lang w:val="de-DE"/>
+        </w:rPr>
+        <w:t>HAG: Ihr Weg zum Kurs. Machen Sie fünf typische Fotos und beschreiben Sie den Weg. Präsentieren Sie in Gruppen.</w:t>
+      </w:r>
+    </w:p>
+    <w:p>
+      <w:pPr>
+        <w:pStyle w:val="Normal"/>
+        <w:bidi w:val="0"/>
+        <w:jc w:val="start"/>
+        <w:rPr>
+          <w:lang w:val="de-DE"/>
+        </w:rPr>
+      </w:pPr>
+      <w:r>
+        <w:rPr>
+          <w:lang w:val="de-DE"/>
+        </w:rPr>
+      </w:r>
+    </w:p>
+    <w:p>
+      <w:pPr>
+        <w:pStyle w:val="Normal"/>
+        <w:bidi w:val="0"/>
+        <w:jc w:val="start"/>
+        <w:rPr/>
+      </w:pPr>
+      <w:r>
+        <w:rPr>
+          <w:lang w:val="de-DE"/>
+        </w:rPr>
+        <w:t xml:space="preserve">30‘ Video: Die Netzwerk-WG: </w:t>
+      </w:r>
+      <w:hyperlink r:id="rId3">
+        <w:r>
+          <w:rPr>
+            <w:rStyle w:val="Hyperlink"/>
+            <w:lang w:val="de-DE"/>
+          </w:rPr>
+          <w:t>https://www.youtube.com/watch?v=WX0alsfPEAU</w:t>
+        </w:r>
+      </w:hyperlink>
+    </w:p>
+    <w:p>
+      <w:pPr>
+        <w:pStyle w:val="Normal"/>
+        <w:bidi w:val="0"/>
+        <w:jc w:val="start"/>
+        <w:rPr>
+          <w:lang w:val="de-DE"/>
+        </w:rPr>
+      </w:pPr>
+      <w:r>
+        <w:rPr>
+          <w:lang w:val="de-DE"/>
+        </w:rPr>
+      </w:r>
+    </w:p>
+    <w:p>
+      <w:pPr>
+        <w:pStyle w:val="Normal"/>
+        <w:bidi w:val="0"/>
+        <w:jc w:val="start"/>
+        <w:rPr>
+          <w:lang w:val="de-DE"/>
+        </w:rPr>
+      </w:pPr>
+      <w:r>
+        <w:rPr>
+          <w:lang w:val="de-DE"/>
+        </w:rPr>
+        <w:t>40‘ kurz und klar: Redemittel und Grammatik</w:t>
+      </w:r>
+    </w:p>
+    <w:p>
+      <w:pPr>
+        <w:pStyle w:val="Normal"/>
+        <w:bidi w:val="0"/>
+        <w:jc w:val="start"/>
+        <w:rPr>
+          <w:lang w:val="de-DE"/>
+        </w:rPr>
+      </w:pPr>
+      <w:r>
+        <w:rPr>
+          <w:lang w:val="de-DE"/>
+        </w:rPr>
+      </w:r>
+    </w:p>
+    <w:p>
+      <w:pPr>
+        <w:pStyle w:val="Normal"/>
+        <w:bidi w:val="0"/>
+        <w:jc w:val="start"/>
+        <w:rPr>
+          <w:lang w:val="de-DE"/>
+        </w:rPr>
+      </w:pPr>
+      <w:r>
+        <w:rPr>
+          <w:lang w:val="de-DE"/>
+        </w:rPr>
+      </w:r>
+    </w:p>
+    <w:p>
+      <w:pPr>
+        <w:pStyle w:val="Normal"/>
+        <w:bidi w:val="0"/>
+        <w:jc w:val="start"/>
+        <w:rPr>
+          <w:lang w:val="de-DE"/>
+        </w:rPr>
+      </w:pPr>
+      <w:r>
+        <w:rPr>
+          <w:lang w:val="de-DE"/>
+        </w:rPr>
+      </w:r>
+    </w:p>
+    <w:p>
+      <w:pPr>
+        <w:pStyle w:val="Normal"/>
+        <w:bidi w:val="0"/>
+        <w:jc w:val="start"/>
+        <w:rPr>
+          <w:lang w:val="de-DE"/>
+        </w:rPr>
+      </w:pPr>
+      <w:r>
+        <w:rPr>
+          <w:lang w:val="de-DE"/>
+        </w:rPr>
+      </w:r>
+    </w:p>
+    <w:p>
+      <w:pPr>
+        <w:pStyle w:val="Normal"/>
+        <w:bidi w:val="0"/>
+        <w:jc w:val="start"/>
+        <w:rPr>
+          <w:lang w:val="de-DE"/>
+        </w:rPr>
+      </w:pPr>
+      <w:r>
+        <w:rPr>
+          <w:lang w:val="de-DE"/>
+        </w:rPr>
+      </w:r>
+    </w:p>
+    <w:p>
+      <w:pPr>
+        <w:pStyle w:val="Normal"/>
+        <w:bidi w:val="0"/>
+        <w:jc w:val="start"/>
+        <w:rPr>
+          <w:lang w:val="de-DE"/>
+        </w:rPr>
+      </w:pPr>
+      <w:r>
+        <w:rPr>
+          <w:lang w:val="de-DE"/>
+        </w:rPr>
+      </w:r>
+    </w:p>
+    <w:p>
+      <w:pPr>
+        <w:pStyle w:val="Normal"/>
+        <w:bidi w:val="0"/>
+        <w:jc w:val="start"/>
+        <w:rPr>
+          <w:lang w:val="de-DE"/>
+        </w:rPr>
+      </w:pPr>
+      <w:r>
+        <w:rPr>
+          <w:lang w:val="de-DE"/>
+        </w:rPr>
+      </w:r>
+    </w:p>
+    <w:p>
+      <w:pPr>
+        <w:pStyle w:val="Normal"/>
+        <w:bidi w:val="0"/>
+        <w:jc w:val="start"/>
+        <w:rPr>
+          <w:lang w:val="de-DE"/>
+        </w:rPr>
+      </w:pPr>
+      <w:r>
+        <w:rPr>
+          <w:lang w:val="de-DE"/>
+        </w:rPr>
+      </w:r>
+    </w:p>
+    <w:p>
+      <w:pPr>
+        <w:pStyle w:val="Normal"/>
+        <w:bidi w:val="0"/>
+        <w:jc w:val="start"/>
+        <w:rPr>
+          <w:lang w:val="de-DE"/>
+        </w:rPr>
+      </w:pPr>
+      <w:r>
+        <w:rPr>
+          <w:lang w:val="de-DE"/>
+        </w:rPr>
+      </w:r>
+    </w:p>
+    <w:p>
+      <w:pPr>
+        <w:pStyle w:val="Normal"/>
+        <w:bidi w:val="0"/>
+        <w:jc w:val="start"/>
+        <w:rPr>
+          <w:lang w:val="de-DE"/>
+        </w:rPr>
+      </w:pPr>
+      <w:r>
+        <w:rPr>
+          <w:lang w:val="de-DE"/>
+        </w:rPr>
+        <w:t>******************************************</w:t>
+      </w:r>
+    </w:p>
+    <w:p>
+      <w:pPr>
+        <w:pStyle w:val="Normal"/>
+        <w:bidi w:val="0"/>
+        <w:jc w:val="start"/>
+        <w:rPr>
+          <w:lang w:val="de-DE"/>
+        </w:rPr>
+      </w:pPr>
+      <w:r>
+        <w:rPr>
+          <w:lang w:val="de-DE"/>
+        </w:rPr>
         <w:t>Zweites Niveau, vierte Woche, Mittwoch den 04.03.26</w:t>
       </w:r>
     </w:p>
@@ -778,7 +1744,9 @@
         </w:rPr>
       </w:pPr>
       <w:r>
-        <w:rPr/>
+        <w:rPr>
+          <w:lang w:val="de-DE"/>
+        </w:rPr>
         <w:t>******************************************</w:t>
       </w:r>
     </w:p>
@@ -792,7 +1760,9 @@
         </w:rPr>
       </w:pPr>
       <w:r>
-        <w:rPr/>
+        <w:rPr>
+          <w:lang w:val="de-DE"/>
+        </w:rPr>
         <w:t>Viertes Niveau, vierte Woche, Montag den 02.03.26</w:t>
       </w:r>
     </w:p>
@@ -821,7 +1791,9 @@
         </w:rPr>
       </w:pPr>
       <w:r>
-        <w:rPr/>
+        <w:rPr>
+          <w:lang w:val="de-DE"/>
+        </w:rPr>
         <w:t>10‘ Was haben wir voriges Mal gemacht? Haben Diego und Sofía ihr Buch gelesen? Worum geht es im Text? Wollen die anderen auch einen Reader lesen?</w:t>
       </w:r>
     </w:p>
@@ -835,7 +1807,9 @@
         </w:rPr>
       </w:pPr>
       <w:r>
-        <w:rPr/>
+        <w:rPr>
+          <w:lang w:val="de-DE"/>
+        </w:rPr>
         <w:t>20‘ Redemittel zur Diskussion. Die KT lesen die Redemittel. Können Sie alle verstehen? Können Sie sie verwenden? ← A2 Buch kann hier verwendet werden. Was müssen sie während der mündlichen Prüfung machen?</w:t>
       </w:r>
     </w:p>
@@ -864,7 +1838,9 @@
         </w:rPr>
       </w:pPr>
       <w:r>
-        <w:rPr/>
+        <w:rPr>
+          <w:lang w:val="de-DE"/>
+        </w:rPr>
         <w:t>Der Weg zur Arbeit in D-A-CH</w:t>
       </w:r>
     </w:p>
@@ -878,7 +1854,9 @@
         </w:rPr>
       </w:pPr>
       <w:r>
-        <w:rPr/>
+        <w:rPr>
+          <w:lang w:val="de-DE"/>
+        </w:rPr>
         <w:t>10‘ Intro: Video PENDELN durch die ISAR. Lass die KT das Video sehen. Was macht gerade dieser Mann am Isar? Wohin will er? Würden die KT dasselbe machen? Warum? Warum nicht? Wer brauch am längsten?</w:t>
       </w:r>
     </w:p>
@@ -892,7 +1870,9 @@
         </w:rPr>
       </w:pPr>
       <w:r>
-        <w:rPr/>
+        <w:rPr>
+          <w:lang w:val="de-DE"/>
+        </w:rPr>
         <w:t>10‘ 11a) Lesen Sie. Wie kommen die drei Personen zur Arbeit? Welche Verkehrsmittel benutzen sie? Wie lange brauchen sie? Notieren Sie.</w:t>
       </w:r>
     </w:p>
@@ -906,14 +1886,10 @@
         </w:rPr>
       </w:pPr>
       <w:r>
-        <w:rPr/>
-        <w:t>15‘ 11b) Wie kommen Sie zum Sprachkurs? Machen Sie eine Schlange.</w:t>
-      </w:r>
-      <w:r>
-        <w:rPr>
-          <w:lang w:val="de-DE"/>
-        </w:rPr>
-        <w:t xml:space="preserve"> Wer braucht am längsten? Er/sie steht ganz vorn. Wer braucht am kürzesten? Er/Sie steht ganz hinten.</w:t>
+        <w:rPr>
+          <w:lang w:val="de-DE"/>
+        </w:rPr>
+        <w:t>15‘ 11b) Wie kommen Sie zum Sprachkurs? Machen Sie eine Schlange. Wer braucht am längsten? Er/sie steht ganz vorn. Wer braucht am kürzesten? Er/Sie steht ganz hinten.</w:t>
       </w:r>
     </w:p>
     <w:p>
@@ -1159,7 +2135,9 @@
         </w:rPr>
       </w:pPr>
       <w:r>
-        <w:rPr/>
+        <w:rPr>
+          <w:lang w:val="de-DE"/>
+        </w:rPr>
         <w:t>******************************************</w:t>
       </w:r>
     </w:p>
@@ -1491,7 +2469,9 @@
         </w:rPr>
       </w:pPr>
       <w:r>
-        <w:rPr/>
+        <w:rPr>
+          <w:lang w:val="de-DE"/>
+        </w:rPr>
         <w:t>Viertes Niveau, dritte Woche, Montag den 16.02.26</w:t>
       </w:r>
     </w:p>
@@ -1520,7 +2500,9 @@
         </w:rPr>
       </w:pPr>
       <w:r>
-        <w:rPr/>
+        <w:rPr>
+          <w:lang w:val="de-DE"/>
+        </w:rPr>
         <w:t>60‘ Valentinsparty</w:t>
       </w:r>
     </w:p>
@@ -1534,7 +2516,9 @@
         </w:rPr>
       </w:pPr>
       <w:r>
-        <w:rPr/>
+        <w:rPr>
+          <w:lang w:val="de-DE"/>
+        </w:rPr>
         <w:t>60‘ Wiederholung von den Themen aus Lektion 5 und 6.</w:t>
       </w:r>
     </w:p>
@@ -1579,7 +2563,9 @@
         </w:rPr>
       </w:pPr>
       <w:r>
-        <w:rPr/>
+        <w:rPr>
+          <w:lang w:val="de-DE"/>
+        </w:rPr>
         <w:t>Sechstes Niveau, dritte Woche, Montag den 16.02.26</w:t>
       </w:r>
     </w:p>
@@ -1608,7 +2594,9 @@
         </w:rPr>
       </w:pPr>
       <w:r>
-        <w:rPr/>
+        <w:rPr>
+          <w:lang w:val="de-DE"/>
+        </w:rPr>
         <w:t>30‘ Sätze mit „nachdem“. Schreiben Sie drei Sätze mit nachdem. Tauschen Sie dann ihre Sätze mit einem Partner. Kontrollieren Sie sich gegenseitig.</w:t>
       </w:r>
     </w:p>
@@ -1622,7 +2610,9 @@
         </w:rPr>
       </w:pPr>
       <w:r>
-        <w:rPr/>
+        <w:rPr>
+          <w:lang w:val="de-DE"/>
+        </w:rPr>
         <w:t>Und ihre Freundschaftsgeschichte? Schreiben Sie einen Text wie in 2b.</w:t>
       </w:r>
     </w:p>
@@ -1651,7 +2641,9 @@
         </w:rPr>
       </w:pPr>
       <w:r>
-        <w:rPr/>
+        <w:rPr>
+          <w:lang w:val="de-DE"/>
+        </w:rPr>
         <w:t>90‘ Richtig streiten</w:t>
       </w:r>
     </w:p>
@@ -1665,7 +2657,9 @@
         </w:rPr>
       </w:pPr>
       <w:r>
-        <w:rPr/>
+        <w:rPr>
+          <w:lang w:val="de-DE"/>
+        </w:rPr>
         <w:t>6a sehen Sie die Fotos an. Was könnte hier der Konflikt sein? Kennen Sie andere Konfliktssituationen?</w:t>
       </w:r>
     </w:p>
@@ -1679,7 +2673,9 @@
         </w:rPr>
       </w:pPr>
       <w:r>
-        <w:rPr/>
+        <w:rPr>
+          <w:lang w:val="de-DE"/>
+        </w:rPr>
         <w:t>6b Hören Sie die Gespräche. Was ist der Konflikt? Waren Ihre Vermutungen richtig?</w:t>
       </w:r>
     </w:p>
@@ -1693,7 +2689,9 @@
         </w:rPr>
       </w:pPr>
       <w:r>
-        <w:rPr/>
+        <w:rPr>
+          <w:lang w:val="de-DE"/>
+        </w:rPr>
         <w:t>6c Ordnen Sie die Sätze zu. Hören Sie dann noch einmal zur Kontrolle.</w:t>
       </w:r>
     </w:p>
@@ -1707,13 +2705,16 @@
         </w:rPr>
       </w:pPr>
       <w:r>
-        <w:rPr/>
+        <w:rPr>
+          <w:lang w:val="de-DE"/>
+        </w:rPr>
         <w:t xml:space="preserve">6d Lesen Sie die Regel und schreiben Sie Sätze mit </w:t>
       </w:r>
       <w:r>
         <w:rPr>
           <w:i/>
           <w:iCs/>
+          <w:lang w:val="de-DE"/>
         </w:rPr>
         <w:t>seit</w:t>
       </w:r>
@@ -1721,6 +2722,7 @@
         <w:rPr>
           <w:i w:val="false"/>
           <w:iCs w:val="false"/>
+          <w:lang w:val="de-DE"/>
         </w:rPr>
         <w:t xml:space="preserve">, </w:t>
       </w:r>
@@ -1728,6 +2730,7 @@
         <w:rPr>
           <w:i/>
           <w:iCs/>
+          <w:lang w:val="de-DE"/>
         </w:rPr>
         <w:t>während</w:t>
       </w:r>
@@ -1735,6 +2738,7 @@
         <w:rPr>
           <w:i w:val="false"/>
           <w:iCs w:val="false"/>
+          <w:lang w:val="de-DE"/>
         </w:rPr>
         <w:t xml:space="preserve">, </w:t>
       </w:r>
@@ -1742,6 +2746,7 @@
         <w:rPr>
           <w:i/>
           <w:iCs/>
+          <w:lang w:val="de-DE"/>
         </w:rPr>
         <w:t>bis</w:t>
       </w:r>
@@ -1749,6 +2754,7 @@
         <w:rPr>
           <w:i w:val="false"/>
           <w:iCs w:val="false"/>
+          <w:lang w:val="de-DE"/>
         </w:rPr>
         <w:t xml:space="preserve"> und </w:t>
       </w:r>
@@ -1756,6 +2762,7 @@
         <w:rPr>
           <w:i/>
           <w:iCs/>
+          <w:lang w:val="de-DE"/>
         </w:rPr>
         <w:t>bevor</w:t>
       </w:r>
@@ -1763,6 +2770,7 @@
         <w:rPr>
           <w:i w:val="false"/>
           <w:iCs w:val="false"/>
+          <w:lang w:val="de-DE"/>
         </w:rPr>
         <w:t>.</w:t>
       </w:r>
@@ -1780,6 +2788,7 @@
         <w:rPr>
           <w:i w:val="false"/>
           <w:iCs w:val="false"/>
+          <w:lang w:val="de-DE"/>
         </w:rPr>
         <w:t>„</w:t>
       </w:r>
@@ -1787,6 +2796,7 @@
         <w:rPr>
           <w:i w:val="false"/>
           <w:iCs w:val="false"/>
+          <w:lang w:val="de-DE"/>
         </w:rPr>
         <w:t>Bevor wir essen, musst du den Tisch decken.“</w:t>
       </w:r>
@@ -1804,6 +2814,7 @@
         <w:rPr>
           <w:i w:val="false"/>
           <w:iCs w:val="false"/>
+          <w:lang w:val="de-DE"/>
         </w:rPr>
         <w:t>„</w:t>
       </w:r>
@@ -1811,6 +2822,7 @@
         <w:rPr>
           <w:i w:val="false"/>
           <w:iCs w:val="false"/>
+          <w:lang w:val="de-DE"/>
         </w:rPr>
         <w:t>Kurz bevor er starb, änderte er das Testament.“</w:t>
       </w:r>
@@ -1828,6 +2840,7 @@
         <w:rPr>
           <w:i w:val="false"/>
           <w:iCs w:val="false"/>
+          <w:lang w:val="de-DE"/>
         </w:rPr>
         <w:t>„</w:t>
       </w:r>
@@ -1835,6 +2848,7 @@
         <w:rPr>
           <w:i w:val="false"/>
           <w:iCs w:val="false"/>
+          <w:lang w:val="de-DE"/>
         </w:rPr>
         <w:t>Bevor du nicht genügend Geld verdienst, kannst du dir kein Auto kaufen.“ (erst musst du genügend Geld verdienen, dann kannst du dir ein Auto kaufen)</w:t>
       </w:r>
@@ -1845,26 +2859,30 @@
         <w:bidi w:val="0"/>
         <w:jc w:val="start"/>
         <w:rPr>
+          <w:lang w:val="de-DE"/>
+        </w:rPr>
+      </w:pPr>
+      <w:r>
+        <w:rPr>
           <w:u w:val="none"/>
+          <w:lang w:val="de-DE"/>
+        </w:rPr>
+        <w:t>6e Wie heißen die Sätze in 6d in Ihrer Sprache? Vergleichen Sie.</w:t>
+      </w:r>
+    </w:p>
+    <w:p>
+      <w:pPr>
+        <w:pStyle w:val="Normal"/>
+        <w:bidi w:val="0"/>
+        <w:jc w:val="start"/>
+        <w:rPr>
+          <w:lang w:val="de-DE"/>
         </w:rPr>
       </w:pPr>
       <w:r>
         <w:rPr>
           <w:u w:val="none"/>
-        </w:rPr>
-        <w:t>6e Wie heißen die Sätze in 6d in Ihrer Sprache? Vergleichen Sie.</w:t>
-      </w:r>
-    </w:p>
-    <w:p>
-      <w:pPr>
-        <w:pStyle w:val="Normal"/>
-        <w:bidi w:val="0"/>
-        <w:jc w:val="start"/>
-        <w:rPr/>
-      </w:pPr>
-      <w:r>
-        <w:rPr>
-          <w:u w:val="none"/>
+          <w:lang w:val="de-DE"/>
         </w:rPr>
         <w:t xml:space="preserve">7 Spielen Sie zu viert. Jeder schreibt fünf Nebensätze mit </w:t>
       </w:r>
@@ -1873,6 +2891,7 @@
           <w:i/>
           <w:iCs/>
           <w:u w:val="none"/>
+          <w:lang w:val="de-DE"/>
         </w:rPr>
         <w:t>nachdem</w:t>
       </w:r>
@@ -1881,6 +2900,7 @@
           <w:i w:val="false"/>
           <w:iCs w:val="false"/>
           <w:u w:val="none"/>
+          <w:lang w:val="de-DE"/>
         </w:rPr>
         <w:t xml:space="preserve">, </w:t>
       </w:r>
@@ -1889,6 +2909,7 @@
           <w:i/>
           <w:iCs/>
           <w:u w:val="none"/>
+          <w:lang w:val="de-DE"/>
         </w:rPr>
         <w:t>seit/seitdem,</w:t>
       </w:r>
@@ -1897,6 +2918,7 @@
           <w:i w:val="false"/>
           <w:iCs w:val="false"/>
           <w:u w:val="none"/>
+          <w:lang w:val="de-DE"/>
         </w:rPr>
         <w:t xml:space="preserve"> </w:t>
       </w:r>
@@ -1905,6 +2927,7 @@
           <w:i/>
           <w:iCs/>
           <w:u w:val="none"/>
+          <w:lang w:val="de-DE"/>
         </w:rPr>
         <w:t>während</w:t>
       </w:r>
@@ -1913,6 +2936,7 @@
           <w:i w:val="false"/>
           <w:iCs w:val="false"/>
           <w:u w:val="none"/>
+          <w:lang w:val="de-DE"/>
         </w:rPr>
         <w:t xml:space="preserve">, </w:t>
       </w:r>
@@ -1921,6 +2945,7 @@
           <w:i/>
           <w:iCs/>
           <w:u w:val="none"/>
+          <w:lang w:val="de-DE"/>
         </w:rPr>
         <w:t>bis</w:t>
       </w:r>
@@ -1929,6 +2954,7 @@
           <w:i w:val="false"/>
           <w:iCs w:val="false"/>
           <w:u w:val="none"/>
+          <w:lang w:val="de-DE"/>
         </w:rPr>
         <w:t xml:space="preserve"> und </w:t>
       </w:r>
@@ -1937,6 +2963,7 @@
           <w:i/>
           <w:iCs/>
           <w:u w:val="none"/>
+          <w:lang w:val="de-DE"/>
         </w:rPr>
         <w:t>bevor</w:t>
       </w:r>
@@ -1945,6 +2972,7 @@
           <w:i w:val="false"/>
           <w:iCs w:val="false"/>
           <w:u w:val="none"/>
+          <w:lang w:val="de-DE"/>
         </w:rPr>
         <w:t xml:space="preserve"> auf Karten. Mischen Sie alle Karten. Ziehen Sie abwechselnd eine Karte und ergänzen Sie den Satz. Die letzten 30 Minuten werden dem Zertifikat B1 gewidmet.</w:t>
       </w:r>
@@ -1958,32 +2986,44 @@
         <w:bidi w:val="0"/>
         <w:spacing w:before="0" w:after="0"/>
         <w:jc w:val="start"/>
-        <w:rPr/>
-      </w:pPr>
-      <w:r>
-        <w:rPr/>
-      </w:r>
-    </w:p>
-    <w:p>
-      <w:pPr>
-        <w:pStyle w:val="Normal"/>
-        <w:bidi w:val="0"/>
-        <w:jc w:val="start"/>
-        <w:rPr/>
-      </w:pPr>
-      <w:r>
-        <w:rPr/>
-      </w:r>
-    </w:p>
-    <w:p>
-      <w:pPr>
-        <w:pStyle w:val="Normal"/>
-        <w:bidi w:val="0"/>
-        <w:jc w:val="start"/>
-        <w:rPr/>
-      </w:pPr>
-      <w:r>
-        <w:rPr/>
+        <w:rPr>
+          <w:lang w:val="de-DE"/>
+        </w:rPr>
+      </w:pPr>
+      <w:r>
+        <w:rPr>
+          <w:lang w:val="de-DE"/>
+        </w:rPr>
+      </w:r>
+    </w:p>
+    <w:p>
+      <w:pPr>
+        <w:pStyle w:val="Normal"/>
+        <w:bidi w:val="0"/>
+        <w:jc w:val="start"/>
+        <w:rPr>
+          <w:lang w:val="de-DE"/>
+        </w:rPr>
+      </w:pPr>
+      <w:r>
+        <w:rPr>
+          <w:lang w:val="de-DE"/>
+        </w:rPr>
+      </w:r>
+    </w:p>
+    <w:p>
+      <w:pPr>
+        <w:pStyle w:val="Normal"/>
+        <w:bidi w:val="0"/>
+        <w:jc w:val="start"/>
+        <w:rPr>
+          <w:lang w:val="de-DE"/>
+        </w:rPr>
+      </w:pPr>
+      <w:r>
+        <w:rPr>
+          <w:lang w:val="de-DE"/>
+        </w:rPr>
       </w:r>
     </w:p>
     <w:p>
@@ -2243,259 +3283,254 @@
         <w:bidi w:val="0"/>
         <w:jc w:val="start"/>
         <w:rPr>
+          <w:lang w:val="de-DE"/>
+        </w:rPr>
+      </w:pPr>
+      <w:r>
+        <w:rPr>
           <w:u w:val="none"/>
           <w:lang w:val="de-DE"/>
         </w:rPr>
+        <w:t>2) 5‘ Sehen Sie das Bild an und sprechen Sie zu zweit. Wo sind die Personen? Was machen Sie?</w:t>
+      </w:r>
+    </w:p>
+    <w:p>
+      <w:pPr>
+        <w:pStyle w:val="Normal"/>
+        <w:bidi w:val="0"/>
+        <w:jc w:val="start"/>
+        <w:rPr>
+          <w:lang w:val="de-DE"/>
+        </w:rPr>
       </w:pPr>
       <w:r>
         <w:rPr>
           <w:u w:val="none"/>
           <w:lang w:val="de-DE"/>
         </w:rPr>
-        <w:t>2) 5‘ Sehen Sie das Bild an und sprechen Sie zu zweit. Wo sind die Personen? Was machen Sie?</w:t>
-      </w:r>
-    </w:p>
-    <w:p>
-      <w:pPr>
-        <w:pStyle w:val="Normal"/>
-        <w:bidi w:val="0"/>
-        <w:jc w:val="start"/>
+        <w:t>3) 10‘ Gut gesagt: Sie sind ungeduldig.</w:t>
+      </w:r>
+    </w:p>
+    <w:p>
+      <w:pPr>
+        <w:pStyle w:val="Normal"/>
+        <w:bidi w:val="0"/>
+        <w:jc w:val="start"/>
+        <w:rPr>
+          <w:lang w:val="de-DE"/>
+        </w:rPr>
+      </w:pPr>
+      <w:r>
         <w:rPr>
           <w:u w:val="none"/>
           <w:lang w:val="de-DE"/>
         </w:rPr>
+        <w:t>4) 30‘ Indirekte Fragesätze: Redewiedergabe. Was sagt die Frau am Handy? Ergänzen Sie die Sätze.</w:t>
+      </w:r>
+    </w:p>
+    <w:p>
+      <w:pPr>
+        <w:pStyle w:val="Normal"/>
+        <w:bidi w:val="0"/>
+        <w:jc w:val="start"/>
+        <w:rPr>
+          <w:lang w:val="de-DE"/>
+        </w:rPr>
       </w:pPr>
       <w:r>
         <w:rPr>
           <w:u w:val="none"/>
           <w:lang w:val="de-DE"/>
         </w:rPr>
-        <w:t>3) 10‘ Gut gesagt: Sie sind ungeduldig.</w:t>
-      </w:r>
-    </w:p>
-    <w:p>
-      <w:pPr>
-        <w:pStyle w:val="Normal"/>
-        <w:bidi w:val="0"/>
-        <w:jc w:val="start"/>
+        <w:t>5) MA 30‘ Was wollen die Leute wissen? Formulieren Sie indirekte Fragesätze.</w:t>
+      </w:r>
+    </w:p>
+    <w:p>
+      <w:pPr>
+        <w:pStyle w:val="Normal"/>
+        <w:bidi w:val="0"/>
+        <w:jc w:val="start"/>
+        <w:rPr>
+          <w:lang w:val="de-DE"/>
+        </w:rPr>
+      </w:pPr>
+      <w:r>
         <w:rPr>
           <w:u w:val="none"/>
           <w:lang w:val="de-DE"/>
         </w:rPr>
-      </w:pPr>
-      <w:r>
+        <w:t>6) 20‘ Auf Reisen. Spielen Sie zu zweit. Jeder schreibt drei W-Fragen auf verschiedene Zettel. Mischen Sie die Zettel. A zieht einen Zettel und bildet einen indirekten Fragesatz. B antwortet und zieht den nächsten Zettel.</w:t>
+      </w:r>
+    </w:p>
+    <w:p>
+      <w:pPr>
+        <w:pStyle w:val="Normal"/>
+        <w:bidi w:val="0"/>
+        <w:jc w:val="start"/>
         <w:rPr>
           <w:u w:val="none"/>
           <w:lang w:val="de-DE"/>
         </w:rPr>
-        <w:t>4) 30‘ Indirekte Fragesätze: Redewiedergabe. Was sagt die Frau am Handy? Ergänzen Sie die Sätze.</w:t>
-      </w:r>
-    </w:p>
-    <w:p>
-      <w:pPr>
-        <w:pStyle w:val="Normal"/>
-        <w:bidi w:val="0"/>
-        <w:jc w:val="start"/>
+      </w:pPr>
+      <w:r>
         <w:rPr>
           <w:u w:val="none"/>
           <w:lang w:val="de-DE"/>
         </w:rPr>
-      </w:pPr>
+      </w:r>
+    </w:p>
+    <w:p>
+      <w:pPr>
+        <w:pStyle w:val="Normal"/>
+        <w:bidi w:val="0"/>
+        <w:jc w:val="start"/>
+        <w:rPr>
+          <w:lang w:val="de-DE"/>
+        </w:rPr>
+      </w:pPr>
+      <w:r>
+        <w:rPr>
+          <w:lang w:val="de-DE"/>
+        </w:rPr>
+        <w:t>Sechstes Niveau, zweite Woche, Montag den 9.02.26</w:t>
+      </w:r>
+    </w:p>
+    <w:p>
+      <w:pPr>
+        <w:pStyle w:val="Normal"/>
+        <w:bidi w:val="0"/>
+        <w:jc w:val="start"/>
+        <w:rPr>
+          <w:lang w:val="de-DE"/>
+        </w:rPr>
+      </w:pPr>
+      <w:r>
+        <w:rPr>
+          <w:lang w:val="de-DE"/>
+        </w:rPr>
+      </w:r>
+    </w:p>
+    <w:p>
+      <w:pPr>
+        <w:pStyle w:val="Normal"/>
+        <w:bidi w:val="0"/>
+        <w:jc w:val="start"/>
+        <w:rPr>
+          <w:lang w:val="de-DE"/>
+        </w:rPr>
+      </w:pPr>
+      <w:r>
+        <w:rPr>
+          <w:lang w:val="de-DE"/>
+        </w:rPr>
+        <w:t>0) 10‘ Haben die Kursteilnehmer die Redemittel gefunden?</w:t>
+      </w:r>
+    </w:p>
+    <w:p>
+      <w:pPr>
+        <w:pStyle w:val="Normal"/>
+        <w:bidi w:val="0"/>
+        <w:jc w:val="start"/>
+        <w:rPr>
+          <w:lang w:val="de-DE"/>
+        </w:rPr>
+      </w:pPr>
+      <w:r>
+        <w:rPr>
+          <w:lang w:val="de-DE"/>
+        </w:rPr>
+        <w:t>1) 10‘ Mithilfe von den Notizen, die sie voriges Mal gemacht haben, versuchen Die KT wiederzugeben, was die Personen in den Texten erzählen.</w:t>
+      </w:r>
       <w:r>
         <w:rPr>
           <w:u w:val="none"/>
           <w:lang w:val="de-DE"/>
         </w:rPr>
-        <w:t>5) MA 30‘ Was wollen die Leute wissen? Formulieren Sie indirekte Fragesätze.</w:t>
-      </w:r>
-    </w:p>
-    <w:p>
-      <w:pPr>
-        <w:pStyle w:val="Normal"/>
-        <w:bidi w:val="0"/>
-        <w:jc w:val="start"/>
+        <w:t xml:space="preserve"> (Sie sollten ja vielleicht freier sprechen).</w:t>
+      </w:r>
+    </w:p>
+    <w:p>
+      <w:pPr>
+        <w:pStyle w:val="Normal"/>
+        <w:bidi w:val="0"/>
+        <w:jc w:val="start"/>
+        <w:rPr>
+          <w:lang w:val="de-DE"/>
+        </w:rPr>
+      </w:pPr>
+      <w:r>
         <w:rPr>
           <w:u w:val="none"/>
           <w:lang w:val="de-DE"/>
         </w:rPr>
+        <w:t>2) 30‘ Plusquamperfekt. Lesen Sie die Regel und markieren Sie in 2b alle Verben im Plusquamperfekt. Wie bildet man das Plusquamperfekt? Ergänzen Sie.</w:t>
+      </w:r>
+    </w:p>
+    <w:p>
+      <w:pPr>
+        <w:pStyle w:val="Normal"/>
+        <w:bidi w:val="0"/>
+        <w:jc w:val="start"/>
+        <w:rPr>
+          <w:lang w:val="de-DE"/>
+        </w:rPr>
       </w:pPr>
       <w:r>
         <w:rPr>
           <w:u w:val="none"/>
           <w:lang w:val="de-DE"/>
         </w:rPr>
-        <w:t>6) 20‘ Auf Reisen. Spielen Sie zu zweit. Jeder schreibt drei W-Fragen auf verschiedene Zettel. Mischen Sie die Zettel. A zieht einen Zettel und bildet einen indirekten Fragesatz. B antwortet und zieht den nächsten Zettel.</w:t>
-      </w:r>
-    </w:p>
-    <w:p>
-      <w:pPr>
-        <w:pStyle w:val="Normal"/>
-        <w:bidi w:val="0"/>
-        <w:jc w:val="start"/>
+        <w:t>3) 30‘ Was war vorher? Ordnen Sie zu und schreiben Sie die Sätze im Plusquamperfekt.</w:t>
+      </w:r>
+    </w:p>
+    <w:p>
+      <w:pPr>
+        <w:pStyle w:val="Normal"/>
+        <w:bidi w:val="0"/>
+        <w:jc w:val="start"/>
+        <w:rPr>
+          <w:lang w:val="de-DE"/>
+        </w:rPr>
+      </w:pPr>
+      <w:r>
         <w:rPr>
           <w:u w:val="none"/>
           <w:lang w:val="de-DE"/>
         </w:rPr>
+        <w:t>4) 30‘ Wie und wo kann man neue Freunde kennenlernen? Sammeln Sie im Kurs.</w:t>
+      </w:r>
+    </w:p>
+    <w:p>
+      <w:pPr>
+        <w:pStyle w:val="Normal"/>
+        <w:bidi w:val="0"/>
+        <w:jc w:val="start"/>
+        <w:rPr>
+          <w:lang w:val="de-DE"/>
+        </w:rPr>
       </w:pPr>
       <w:r>
         <w:rPr>
           <w:u w:val="none"/>
           <w:lang w:val="de-DE"/>
         </w:rPr>
-      </w:r>
-    </w:p>
-    <w:p>
-      <w:pPr>
-        <w:pStyle w:val="Normal"/>
-        <w:bidi w:val="0"/>
-        <w:jc w:val="start"/>
-        <w:rPr>
-          <w:lang w:val="de-DE"/>
-        </w:rPr>
-      </w:pPr>
-      <w:r>
-        <w:rPr>
-          <w:lang w:val="de-DE"/>
-        </w:rPr>
-        <w:t>Sechstes Niveau, zweite Woche, Montag den 9.02.26</w:t>
-      </w:r>
-    </w:p>
-    <w:p>
-      <w:pPr>
-        <w:pStyle w:val="Normal"/>
-        <w:bidi w:val="0"/>
-        <w:jc w:val="start"/>
-        <w:rPr>
-          <w:lang w:val="de-DE"/>
-        </w:rPr>
-      </w:pPr>
-      <w:r>
-        <w:rPr>
-          <w:lang w:val="de-DE"/>
-        </w:rPr>
-      </w:r>
-    </w:p>
-    <w:p>
-      <w:pPr>
-        <w:pStyle w:val="Normal"/>
-        <w:bidi w:val="0"/>
-        <w:jc w:val="start"/>
-        <w:rPr>
-          <w:lang w:val="de-DE"/>
-        </w:rPr>
-      </w:pPr>
-      <w:r>
-        <w:rPr>
-          <w:lang w:val="de-DE"/>
-        </w:rPr>
-        <w:t>0) 10‘ Haben die Kursteilnehmer die Redemittel gefunden?</w:t>
-      </w:r>
-    </w:p>
-    <w:p>
-      <w:pPr>
-        <w:pStyle w:val="Normal"/>
-        <w:bidi w:val="0"/>
-        <w:jc w:val="start"/>
-        <w:rPr>
-          <w:lang w:val="de-DE"/>
-        </w:rPr>
-      </w:pPr>
-      <w:r>
-        <w:rPr>
-          <w:lang w:val="de-DE"/>
-        </w:rPr>
-        <w:t>1) 10‘ Mithilfe von den Notizen, die sie voriges Mal gemacht haben, versuchen Die KT wiederzugeben, was die Personen in den Texten erzählen.</w:t>
-      </w:r>
+        <w:t>Hören Sie das Gespräch. Wie hat Matilda in Freiburg Leute kennengelernt? Notieren Sie und vergleichen Sie im Kurs.</w:t>
+      </w:r>
+    </w:p>
+    <w:p>
+      <w:pPr>
+        <w:pStyle w:val="Normal"/>
+        <w:bidi w:val="0"/>
+        <w:jc w:val="start"/>
+        <w:rPr>
+          <w:lang w:val="de-DE"/>
+        </w:rPr>
+      </w:pPr>
       <w:r>
         <w:rPr>
           <w:u w:val="none"/>
           <w:lang w:val="de-DE"/>
         </w:rPr>
-        <w:t xml:space="preserve"> (Sie sollten ja vielleicht freier sprechen).</w:t>
-      </w:r>
-    </w:p>
-    <w:p>
-      <w:pPr>
-        <w:pStyle w:val="Normal"/>
-        <w:bidi w:val="0"/>
-        <w:jc w:val="start"/>
-        <w:rPr>
-          <w:lang w:val="de-DE"/>
-        </w:rPr>
-      </w:pPr>
-      <w:r>
-        <w:rPr>
-          <w:u w:val="none"/>
-          <w:lang w:val="de-DE"/>
-        </w:rPr>
-        <w:t>2) 30‘ Plusquamperfekt. Lesen Sie die Regel und markieren Sie in 2b alle Verben im Plusquamperfekt. Wie bildet man das Plusquamperfekt? Ergänzen Sie.</w:t>
-      </w:r>
-    </w:p>
-    <w:p>
-      <w:pPr>
-        <w:pStyle w:val="Normal"/>
-        <w:bidi w:val="0"/>
-        <w:jc w:val="start"/>
-        <w:rPr>
-          <w:lang w:val="de-DE"/>
-        </w:rPr>
-      </w:pPr>
-      <w:r>
-        <w:rPr>
-          <w:u w:val="none"/>
-          <w:lang w:val="de-DE"/>
-        </w:rPr>
-        <w:t>3) 30‘ Was war vorher? Ordnen Sie zu und schreiben Sie die Sätze im Plusquamperfekt.</w:t>
-      </w:r>
-    </w:p>
-    <w:p>
-      <w:pPr>
-        <w:pStyle w:val="Normal"/>
-        <w:bidi w:val="0"/>
-        <w:jc w:val="start"/>
-        <w:rPr>
-          <w:lang w:val="de-DE"/>
-        </w:rPr>
-      </w:pPr>
-      <w:r>
-        <w:rPr>
-          <w:u w:val="none"/>
-          <w:lang w:val="de-DE"/>
-        </w:rPr>
-        <w:t>4) 30‘ Wie und wo kann man neue Freunde kennenlernen? Sammeln Sie im Kurs.</w:t>
-      </w:r>
-    </w:p>
-    <w:p>
-      <w:pPr>
-        <w:pStyle w:val="Normal"/>
-        <w:bidi w:val="0"/>
-        <w:jc w:val="start"/>
-        <w:rPr>
-          <w:lang w:val="de-DE"/>
-        </w:rPr>
-      </w:pPr>
-      <w:r>
-        <w:rPr>
-          <w:u w:val="none"/>
-          <w:lang w:val="de-DE"/>
-        </w:rPr>
-        <w:t>Hören Sie das Gespräch. Wie hat Matilda in Freiburg Leute kennengelernt? Notieren Sie und vergleichen Sie im Kurs.</w:t>
-      </w:r>
-    </w:p>
-    <w:p>
-      <w:pPr>
-        <w:pStyle w:val="Normal"/>
-        <w:bidi w:val="0"/>
-        <w:jc w:val="start"/>
-        <w:rPr>
-          <w:u w:val="none"/>
-        </w:rPr>
-      </w:pPr>
-      <w:r>
-        <w:rPr>
-          <w:u w:val="none"/>
-          <w:lang w:val="de-DE"/>
-        </w:rPr>
         <w:t>Bringen Sie die Sätze in die richtige Reihenfolge.</w:t>
       </w:r>
     </w:p>
@@ -2539,7 +3574,9 @@
         </w:rPr>
       </w:pPr>
       <w:r>
-        <w:rPr/>
+        <w:rPr>
+          <w:lang w:val="de-DE"/>
+        </w:rPr>
         <w:t>Zweites Niveau, zweite Woche, Freitag den 13.02.26</w:t>
       </w:r>
     </w:p>
@@ -2568,7 +3605,9 @@
         </w:rPr>
       </w:pPr>
       <w:r>
-        <w:rPr/>
+        <w:rPr>
+          <w:lang w:val="de-DE"/>
+        </w:rPr>
         <w:t xml:space="preserve">10‘ die Kursteilnehmer lesen die Regel für Komposita </w:t>
       </w:r>
     </w:p>
@@ -2582,7 +3621,9 @@
         </w:rPr>
       </w:pPr>
       <w:r>
-        <w:rPr/>
+        <w:rPr>
+          <w:lang w:val="de-DE"/>
+        </w:rPr>
         <w:t>20‘ Die KT sehen die Webseite von IKEA und finden neue Komposita und erklären, wie sie funktionieren.</w:t>
       </w:r>
     </w:p>
@@ -2596,7 +3637,9 @@
         </w:rPr>
       </w:pPr>
       <w:r>
-        <w:rPr/>
+        <w:rPr>
+          <w:lang w:val="de-DE"/>
+        </w:rPr>
         <w:t>30‘ Die KT lesen die ersten Kapitel von Eva, Wien.</w:t>
       </w:r>
     </w:p>
@@ -2610,7 +3653,9 @@
         </w:rPr>
       </w:pPr>
       <w:r>
-        <w:rPr/>
+        <w:rPr>
+          <w:lang w:val="de-DE"/>
+        </w:rPr>
         <w:t>Können</w:t>
       </w:r>
     </w:p>
@@ -2662,6 +3707,13 @@
       <w:sz w:val="24"/>
       <w:szCs w:val="24"/>
       <w:lang w:val="de-DE" w:eastAsia="zh-CN" w:bidi="hi-IN"/>
+    </w:rPr>
+  </w:style>
+  <w:style w:type="character" w:styleId="Hyperlink">
+    <w:name w:val="Hyperlink"/>
+    <w:rPr>
+      <w:color w:val="000080"/>
+      <w:u w:val="single"/>
     </w:rPr>
   </w:style>
   <w:style w:type="paragraph" w:styleId="Heading">

</xml_diff>

<commit_message>
cambios en los planes de clase para el lunes 9 de marzo
</commit_message>
<xml_diff>
--- a/planesDeClaseSegundo.docx
+++ b/planesDeClaseSegundo.docx
@@ -2,6 +2,687 @@
 <file path=word/document.xml><?xml version="1.0" encoding="utf-8"?>
 <w:document xmlns:o="urn:schemas-microsoft-com:office:office" xmlns:r="http://schemas.openxmlformats.org/officeDocument/2006/relationships" xmlns:v="urn:schemas-microsoft-com:vml" xmlns:w="http://schemas.openxmlformats.org/wordprocessingml/2006/main" xmlns:w10="urn:schemas-microsoft-com:office:word" xmlns:wp="http://schemas.openxmlformats.org/drawingml/2006/wordprocessingDrawing" xmlns:wps="http://schemas.microsoft.com/office/word/2010/wordprocessingShape" xmlns:wpg="http://schemas.microsoft.com/office/word/2010/wordprocessingGroup" xmlns:mc="http://schemas.openxmlformats.org/markup-compatibility/2006" xmlns:wp14="http://schemas.microsoft.com/office/word/2010/wordprocessingDrawing" xmlns:w14="http://schemas.microsoft.com/office/word/2010/wordml" xmlns:w15="http://schemas.microsoft.com/office/word/2012/wordml" mc:Ignorable="w14 wp14 w15">
   <w:body>
+    <w:p>
+      <w:pPr>
+        <w:pStyle w:val="Normal"/>
+        <w:bidi w:val="0"/>
+        <w:jc w:val="start"/>
+        <w:rPr>
+          <w:lang w:val="de-DE"/>
+        </w:rPr>
+      </w:pPr>
+      <w:r>
+        <w:rPr>
+          <w:lang w:val="de-DE"/>
+        </w:rPr>
+        <w:t xml:space="preserve">Zweites Niveau, </w:t>
+      </w:r>
+      <w:r>
+        <w:rPr>
+          <w:lang w:val="de-DE"/>
+        </w:rPr>
+        <w:t xml:space="preserve">fünfte </w:t>
+      </w:r>
+      <w:r>
+        <w:rPr>
+          <w:lang w:val="de-DE"/>
+        </w:rPr>
+        <w:t xml:space="preserve">Woche, </w:t>
+      </w:r>
+      <w:r>
+        <w:rPr>
+          <w:lang w:val="de-DE"/>
+        </w:rPr>
+        <w:t xml:space="preserve">Montag </w:t>
+      </w:r>
+      <w:r>
+        <w:rPr>
+          <w:lang w:val="de-DE"/>
+        </w:rPr>
+        <w:t>den 0</w:t>
+      </w:r>
+      <w:r>
+        <w:rPr>
+          <w:lang w:val="de-DE"/>
+        </w:rPr>
+        <w:t>9</w:t>
+      </w:r>
+      <w:r>
+        <w:rPr>
+          <w:lang w:val="de-DE"/>
+        </w:rPr>
+        <w:t>.03.26</w:t>
+      </w:r>
+    </w:p>
+    <w:p>
+      <w:pPr>
+        <w:pStyle w:val="Normal"/>
+        <w:bidi w:val="0"/>
+        <w:jc w:val="start"/>
+        <w:rPr>
+          <w:lang w:val="de-DE"/>
+        </w:rPr>
+      </w:pPr>
+      <w:r>
+        <w:rPr/>
+      </w:r>
+    </w:p>
+    <w:p>
+      <w:pPr>
+        <w:pStyle w:val="Normal"/>
+        <w:bidi w:val="0"/>
+        <w:jc w:val="start"/>
+        <w:rPr>
+          <w:lang w:val="de-DE"/>
+        </w:rPr>
+      </w:pPr>
+      <w:r>
+        <w:rPr>
+          <w:lang w:val="de-DE"/>
+        </w:rPr>
+        <w:t>10‘ Welche Berufe kennen Sie? Sammeln Sie.</w:t>
+      </w:r>
+    </w:p>
+    <w:p>
+      <w:pPr>
+        <w:pStyle w:val="Normal"/>
+        <w:bidi w:val="0"/>
+        <w:jc w:val="start"/>
+        <w:rPr>
+          <w:lang w:val="de-DE"/>
+        </w:rPr>
+      </w:pPr>
+      <w:r>
+        <w:rPr/>
+      </w:r>
+    </w:p>
+    <w:p>
+      <w:pPr>
+        <w:pStyle w:val="Normal"/>
+        <w:bidi w:val="0"/>
+        <w:jc w:val="start"/>
+        <w:rPr>
+          <w:lang w:val="de-DE"/>
+        </w:rPr>
+      </w:pPr>
+      <w:r>
+        <w:rPr>
+          <w:lang w:val="de-DE"/>
+        </w:rPr>
+        <w:t>15</w:t>
+      </w:r>
+      <w:r>
+        <w:rPr>
+          <w:lang w:val="de-DE"/>
+        </w:rPr>
+        <w:t>‘ Berufsprofil Altenpfleger. Was machen Altenpflegerinnen und Altenpfleger? Wo arbeiten Sie und wie lange dauert die Berufsausbildung? Lesen Sie und berichten Sie.</w:t>
+      </w:r>
+    </w:p>
+    <w:p>
+      <w:pPr>
+        <w:pStyle w:val="Normal"/>
+        <w:bidi w:val="0"/>
+        <w:jc w:val="start"/>
+        <w:rPr>
+          <w:lang w:val="de-DE"/>
+        </w:rPr>
+      </w:pPr>
+      <w:r>
+        <w:rPr/>
+      </w:r>
+    </w:p>
+    <w:p>
+      <w:pPr>
+        <w:pStyle w:val="Normal"/>
+        <w:bidi w:val="0"/>
+        <w:jc w:val="start"/>
+        <w:rPr>
+          <w:lang w:val="de-DE"/>
+        </w:rPr>
+      </w:pPr>
+      <w:r>
+        <w:rPr>
+          <w:lang w:val="de-DE"/>
+        </w:rPr>
+        <w:t>15‘ Lesen Sie den Lesebrief und sammeln Sie die Redemittel.</w:t>
+      </w:r>
+    </w:p>
+    <w:p>
+      <w:pPr>
+        <w:pStyle w:val="Normal"/>
+        <w:bidi w:val="0"/>
+        <w:jc w:val="start"/>
+        <w:rPr>
+          <w:lang w:val="de-DE"/>
+        </w:rPr>
+      </w:pPr>
+      <w:r>
+        <w:rPr/>
+      </w:r>
+    </w:p>
+    <w:p>
+      <w:pPr>
+        <w:pStyle w:val="Normal"/>
+        <w:bidi w:val="0"/>
+        <w:jc w:val="start"/>
+        <w:rPr>
+          <w:lang w:val="de-DE"/>
+        </w:rPr>
+      </w:pPr>
+      <w:r>
+        <w:rPr>
+          <w:lang w:val="de-DE"/>
+        </w:rPr>
+        <w:t>10‘ Max Cordes, Informatikkaufmann. Was macht er wann? Lesen Sie und sprechen Sie über seinen Tagesablauf.</w:t>
+      </w:r>
+    </w:p>
+    <w:p>
+      <w:pPr>
+        <w:pStyle w:val="Normal"/>
+        <w:bidi w:val="0"/>
+        <w:jc w:val="start"/>
+        <w:rPr>
+          <w:lang w:val="de-DE"/>
+        </w:rPr>
+      </w:pPr>
+      <w:r>
+        <w:rPr/>
+      </w:r>
+    </w:p>
+    <w:p>
+      <w:pPr>
+        <w:pStyle w:val="Normal"/>
+        <w:bidi w:val="0"/>
+        <w:jc w:val="start"/>
+        <w:rPr>
+          <w:lang w:val="de-DE"/>
+        </w:rPr>
+      </w:pPr>
+      <w:r>
+        <w:rPr>
+          <w:lang w:val="de-DE"/>
+        </w:rPr>
+        <w:t>10‘ Die KT machen eine Liste von Wörtern, die sie im ersten Teil des Unterrichts gelernt haben.</w:t>
+      </w:r>
+    </w:p>
+    <w:p>
+      <w:pPr>
+        <w:pStyle w:val="Normal"/>
+        <w:bidi w:val="0"/>
+        <w:jc w:val="start"/>
+        <w:rPr>
+          <w:lang w:val="de-DE"/>
+        </w:rPr>
+      </w:pPr>
+      <w:r>
+        <w:rPr/>
+      </w:r>
+    </w:p>
+    <w:p>
+      <w:pPr>
+        <w:pStyle w:val="Normal"/>
+        <w:bidi w:val="0"/>
+        <w:jc w:val="start"/>
+        <w:rPr>
+          <w:lang w:val="de-DE"/>
+        </w:rPr>
+      </w:pPr>
+      <w:r>
+        <w:rPr>
+          <w:lang w:val="de-DE"/>
+        </w:rPr>
+        <w:t>---</w:t>
+      </w:r>
+    </w:p>
+    <w:p>
+      <w:pPr>
+        <w:pStyle w:val="Normal"/>
+        <w:bidi w:val="0"/>
+        <w:jc w:val="start"/>
+        <w:rPr>
+          <w:lang w:val="de-DE"/>
+        </w:rPr>
+      </w:pPr>
+      <w:r>
+        <w:rPr/>
+      </w:r>
+    </w:p>
+    <w:p>
+      <w:pPr>
+        <w:pStyle w:val="Normal"/>
+        <w:bidi w:val="0"/>
+        <w:jc w:val="start"/>
+        <w:rPr>
+          <w:lang w:val="de-DE"/>
+        </w:rPr>
+      </w:pPr>
+      <w:r>
+        <w:rPr>
+          <w:lang w:val="de-DE"/>
+        </w:rPr>
+        <w:t>20‘ Über Erfahrungen sprechen. Fragen und antworten Sie.</w:t>
+      </w:r>
+    </w:p>
+    <w:p>
+      <w:pPr>
+        <w:pStyle w:val="Normal"/>
+        <w:bidi w:val="0"/>
+        <w:jc w:val="start"/>
+        <w:rPr>
+          <w:lang w:val="de-DE"/>
+        </w:rPr>
+      </w:pPr>
+      <w:r>
+        <w:rPr>
+          <w:lang w:val="de-DE"/>
+        </w:rPr>
+        <w:t xml:space="preserve">30‘ </w:t>
+      </w:r>
+    </w:p>
+    <w:p>
+      <w:pPr>
+        <w:pStyle w:val="Normal"/>
+        <w:bidi w:val="0"/>
+        <w:jc w:val="start"/>
+        <w:rPr>
+          <w:lang w:val="de-DE"/>
+        </w:rPr>
+      </w:pPr>
+      <w:r>
+        <w:rPr>
+          <w:lang w:val="de-DE"/>
+        </w:rPr>
+        <w:t>a) Zwei Berufsportäts. Wählen Sie ein Berufsporträt. Lesen Sie und sammeln Sie Informationen in der Tabelle</w:t>
+      </w:r>
+    </w:p>
+    <w:p>
+      <w:pPr>
+        <w:pStyle w:val="Normal"/>
+        <w:bidi w:val="0"/>
+        <w:jc w:val="start"/>
+        <w:rPr>
+          <w:lang w:val="de-DE"/>
+        </w:rPr>
+      </w:pPr>
+      <w:r>
+        <w:rPr>
+          <w:lang w:val="de-DE"/>
+        </w:rPr>
+        <w:t>b) Berichten Sie über Lena und Wladimir.</w:t>
+      </w:r>
+    </w:p>
+    <w:p>
+      <w:pPr>
+        <w:pStyle w:val="Normal"/>
+        <w:bidi w:val="0"/>
+        <w:jc w:val="start"/>
+        <w:rPr>
+          <w:lang w:val="de-DE"/>
+        </w:rPr>
+      </w:pPr>
+      <w:r>
+        <w:rPr/>
+      </w:r>
+    </w:p>
+    <w:p>
+      <w:pPr>
+        <w:pStyle w:val="Normal"/>
+        <w:bidi w:val="0"/>
+        <w:jc w:val="start"/>
+        <w:rPr>
+          <w:lang w:val="de-DE"/>
+        </w:rPr>
+      </w:pPr>
+      <w:r>
+        <w:rPr/>
+      </w:r>
+    </w:p>
+    <w:p>
+      <w:pPr>
+        <w:pStyle w:val="Normal"/>
+        <w:bidi w:val="0"/>
+        <w:jc w:val="start"/>
+        <w:rPr>
+          <w:lang w:val="de-DE"/>
+        </w:rPr>
+      </w:pPr>
+      <w:r>
+        <w:rPr>
+          <w:lang w:val="de-DE"/>
+        </w:rPr>
+        <w:t>******************************************</w:t>
+      </w:r>
+    </w:p>
+    <w:p>
+      <w:pPr>
+        <w:pStyle w:val="Normal"/>
+        <w:bidi w:val="0"/>
+        <w:jc w:val="start"/>
+        <w:rPr>
+          <w:lang w:val="de-DE"/>
+        </w:rPr>
+      </w:pPr>
+      <w:r>
+        <w:rPr>
+          <w:lang w:val="de-DE"/>
+        </w:rPr>
+        <w:t>Sechstes Niveau, vierte Woche, Freitag den 06.03.26</w:t>
+      </w:r>
+    </w:p>
+    <w:p>
+      <w:pPr>
+        <w:pStyle w:val="Normal"/>
+        <w:bidi w:val="0"/>
+        <w:jc w:val="start"/>
+        <w:rPr>
+          <w:lang w:val="de-DE"/>
+        </w:rPr>
+      </w:pPr>
+      <w:r>
+        <w:rPr/>
+      </w:r>
+    </w:p>
+    <w:p>
+      <w:pPr>
+        <w:pStyle w:val="Normal"/>
+        <w:bidi w:val="0"/>
+        <w:jc w:val="start"/>
+        <w:rPr>
+          <w:lang w:val="de-DE"/>
+        </w:rPr>
+      </w:pPr>
+      <w:r>
+        <w:rPr>
+          <w:lang w:val="de-DE"/>
+        </w:rPr>
+        <w:t>10‘ Haben die KT den Text gelesen? Welche Sätze sind richtig?</w:t>
+      </w:r>
+    </w:p>
+    <w:p>
+      <w:pPr>
+        <w:pStyle w:val="Normal"/>
+        <w:bidi w:val="0"/>
+        <w:jc w:val="start"/>
+        <w:rPr>
+          <w:lang w:val="de-DE"/>
+        </w:rPr>
+      </w:pPr>
+      <w:r>
+        <w:rPr>
+          <w:lang w:val="de-DE"/>
+        </w:rPr>
+        <w:t>10‘ Jemand aus Ihrem Kurs hat den Text nicht gut verstanden. Welche Informationen aus dem Text finden Sie am wichtigsten? Erklären Sie diese in einfachen Worten.</w:t>
+      </w:r>
+    </w:p>
+    <w:p>
+      <w:pPr>
+        <w:pStyle w:val="Normal"/>
+        <w:bidi w:val="0"/>
+        <w:jc w:val="start"/>
+        <w:rPr>
+          <w:lang w:val="de-DE"/>
+        </w:rPr>
+      </w:pPr>
+      <w:r>
+        <w:rPr/>
+      </w:r>
+    </w:p>
+    <w:p>
+      <w:pPr>
+        <w:pStyle w:val="Normal"/>
+        <w:bidi w:val="0"/>
+        <w:jc w:val="start"/>
+        <w:rPr>
+          <w:lang w:val="de-DE"/>
+        </w:rPr>
+      </w:pPr>
+      <w:r>
+        <w:rPr>
+          <w:lang w:val="de-DE"/>
+        </w:rPr>
+        <w:t>20‘ Lesen Sie die Regel und markieren Sie die zweiteiligen Konnektoren in 6b.</w:t>
+      </w:r>
+    </w:p>
+    <w:p>
+      <w:pPr>
+        <w:pStyle w:val="Normal"/>
+        <w:bidi w:val="0"/>
+        <w:jc w:val="start"/>
+        <w:rPr>
+          <w:lang w:val="de-DE"/>
+        </w:rPr>
+      </w:pPr>
+      <w:r>
+        <w:rPr>
+          <w:lang w:val="de-DE"/>
+        </w:rPr>
+        <w:t>20</w:t>
+      </w:r>
+      <w:r>
+        <w:rPr>
+          <w:lang w:val="de-DE"/>
+        </w:rPr>
+        <w:t>‘ 7b) Ordnen Sie die Satzteile zu und schreiben Sie die Sätze.</w:t>
+      </w:r>
+    </w:p>
+    <w:p>
+      <w:pPr>
+        <w:pStyle w:val="Normal"/>
+        <w:bidi w:val="0"/>
+        <w:jc w:val="start"/>
+        <w:rPr>
+          <w:lang w:val="de-DE"/>
+        </w:rPr>
+      </w:pPr>
+      <w:r>
+        <w:rPr>
+          <w:lang w:val="de-DE"/>
+        </w:rPr>
+        <w:t xml:space="preserve">20‘ </w:t>
+      </w:r>
+      <w:r>
+        <w:rPr>
+          <w:lang w:val="de-DE"/>
+        </w:rPr>
+        <w:t>Spielen Sie in Gruppen. Jeder würfelt und bildet einen Satz. Wer hat als Erstes zu jedem Konnektor einen Satz gebildet?</w:t>
+      </w:r>
+    </w:p>
+    <w:p>
+      <w:pPr>
+        <w:pStyle w:val="Normal"/>
+        <w:bidi w:val="0"/>
+        <w:jc w:val="start"/>
+        <w:rPr>
+          <w:lang w:val="de-DE"/>
+        </w:rPr>
+      </w:pPr>
+      <w:r>
+        <w:rPr>
+          <w:lang w:val="de-DE"/>
+        </w:rPr>
+        <w:t>30‘ Musik in Ihrem Kopf. Welche Lieder verbinden Sie mit besonderen Erinnerungen? Welches Lied geht Ihnen oft durch den Kopf? Welches Lied mögen Sie gar nicht?</w:t>
+      </w:r>
+    </w:p>
+    <w:p>
+      <w:pPr>
+        <w:pStyle w:val="Normal"/>
+        <w:bidi w:val="0"/>
+        <w:jc w:val="start"/>
+        <w:rPr>
+          <w:lang w:val="de-DE"/>
+        </w:rPr>
+      </w:pPr>
+      <w:r>
+        <w:rPr/>
+      </w:r>
+    </w:p>
+    <w:p>
+      <w:pPr>
+        <w:pStyle w:val="Normal"/>
+        <w:bidi w:val="0"/>
+        <w:jc w:val="start"/>
+        <w:rPr>
+          <w:lang w:val="de-DE"/>
+        </w:rPr>
+      </w:pPr>
+      <w:r>
+        <w:rPr>
+          <w:lang w:val="de-DE"/>
+        </w:rPr>
+        <w:t>10‘ Aussprache: Satzmelodie</w:t>
+      </w:r>
+    </w:p>
+    <w:p>
+      <w:pPr>
+        <w:pStyle w:val="Normal"/>
+        <w:bidi w:val="0"/>
+        <w:jc w:val="start"/>
+        <w:rPr>
+          <w:lang w:val="de-DE"/>
+        </w:rPr>
+      </w:pPr>
+      <w:r>
+        <w:rPr>
+          <w:lang w:val="de-DE"/>
+        </w:rPr>
+        <w:t>HAG: die ganze Seite 98: Tanzen ist Leidenschaft</w:t>
+      </w:r>
+    </w:p>
+    <w:p>
+      <w:pPr>
+        <w:pStyle w:val="Normal"/>
+        <w:bidi w:val="0"/>
+        <w:jc w:val="start"/>
+        <w:rPr>
+          <w:lang w:val="de-DE"/>
+        </w:rPr>
+      </w:pPr>
+      <w:r>
+        <w:rPr/>
+      </w:r>
+    </w:p>
+    <w:p>
+      <w:pPr>
+        <w:pStyle w:val="Normal"/>
+        <w:bidi w:val="0"/>
+        <w:jc w:val="start"/>
+        <w:rPr>
+          <w:lang w:val="de-DE"/>
+        </w:rPr>
+      </w:pPr>
+      <w:r>
+        <w:rPr>
+          <w:lang w:val="de-DE"/>
+        </w:rPr>
+        <w:t>******************************************</w:t>
+      </w:r>
+    </w:p>
+    <w:p>
+      <w:pPr>
+        <w:pStyle w:val="Normal"/>
+        <w:bidi w:val="0"/>
+        <w:jc w:val="start"/>
+        <w:rPr>
+          <w:lang w:val="de-DE"/>
+        </w:rPr>
+      </w:pPr>
+      <w:r>
+        <w:rPr>
+          <w:lang w:val="de-DE"/>
+        </w:rPr>
+        <w:t>Viertes</w:t>
+      </w:r>
+      <w:r>
+        <w:rPr>
+          <w:lang w:val="de-DE"/>
+        </w:rPr>
+        <w:t xml:space="preserve"> Niveau, vierte Woche, Freitag den 06.03.26</w:t>
+      </w:r>
+    </w:p>
+    <w:p>
+      <w:pPr>
+        <w:pStyle w:val="Normal"/>
+        <w:bidi w:val="0"/>
+        <w:jc w:val="start"/>
+        <w:rPr>
+          <w:lang w:val="de-DE"/>
+        </w:rPr>
+      </w:pPr>
+      <w:r>
+        <w:rPr/>
+      </w:r>
+    </w:p>
+    <w:p>
+      <w:pPr>
+        <w:pStyle w:val="Normal"/>
+        <w:bidi w:val="0"/>
+        <w:jc w:val="start"/>
+        <w:rPr>
+          <w:lang w:val="de-DE"/>
+        </w:rPr>
+      </w:pPr>
+      <w:r>
+        <w:rPr>
+          <w:lang w:val="de-DE"/>
+        </w:rPr>
+        <w:t>10‘ Was haben wir voriges Mal gemacht? Was für Vokabeln haben Sie gelernt? Erinnern sie sich noch an die Geschichten, die sie gespielt haben?</w:t>
+      </w:r>
+    </w:p>
+    <w:p>
+      <w:pPr>
+        <w:pStyle w:val="Normal"/>
+        <w:bidi w:val="0"/>
+        <w:jc w:val="start"/>
+        <w:rPr>
+          <w:lang w:val="de-DE"/>
+        </w:rPr>
+      </w:pPr>
+      <w:r>
+        <w:rPr/>
+      </w:r>
+    </w:p>
+    <w:p>
+      <w:pPr>
+        <w:pStyle w:val="Normal"/>
+        <w:bidi w:val="0"/>
+        <w:jc w:val="start"/>
+        <w:rPr>
+          <w:lang w:val="de-DE"/>
+        </w:rPr>
+      </w:pPr>
+      <w:r>
+        <w:rPr/>
+      </w:r>
+    </w:p>
+    <w:p>
+      <w:pPr>
+        <w:pStyle w:val="Normal"/>
+        <w:bidi w:val="0"/>
+        <w:jc w:val="start"/>
+        <w:rPr>
+          <w:lang w:val="de-DE"/>
+        </w:rPr>
+      </w:pPr>
+      <w:r>
+        <w:rPr/>
+      </w:r>
+    </w:p>
+    <w:p>
+      <w:pPr>
+        <w:pStyle w:val="Normal"/>
+        <w:bidi w:val="0"/>
+        <w:jc w:val="start"/>
+        <w:rPr>
+          <w:lang w:val="de-DE"/>
+        </w:rPr>
+      </w:pPr>
+      <w:r>
+        <w:rPr>
+          <w:lang w:val="de-DE"/>
+        </w:rPr>
+        <w:t>******************************************</w:t>
+      </w:r>
+    </w:p>
     <w:p>
       <w:pPr>
         <w:pStyle w:val="Normal"/>

</xml_diff>

<commit_message>
cambios a planes de clase
</commit_message>
<xml_diff>
--- a/planesDeClaseSegundo.docx
+++ b/planesDeClaseSegundo.docx
@@ -1,6 +1,6 @@
 
 <file path=word/document.xml><?xml version="1.0" encoding="utf-8"?>
-<w:document xmlns:o="urn:schemas-microsoft-com:office:office" xmlns:r="http://schemas.openxmlformats.org/officeDocument/2006/relationships" xmlns:v="urn:schemas-microsoft-com:vml" xmlns:w="http://schemas.openxmlformats.org/wordprocessingml/2006/main" xmlns:w10="urn:schemas-microsoft-com:office:word" xmlns:wp="http://schemas.openxmlformats.org/drawingml/2006/wordprocessingDrawing" xmlns:wps="http://schemas.microsoft.com/office/word/2010/wordprocessingShape" xmlns:wpg="http://schemas.microsoft.com/office/word/2010/wordprocessingGroup" xmlns:mc="http://schemas.openxmlformats.org/markup-compatibility/2006" xmlns:wp14="http://schemas.microsoft.com/office/word/2010/wordprocessingDrawing" xmlns:w14="http://schemas.microsoft.com/office/word/2010/wordml" xmlns:w15="http://schemas.microsoft.com/office/word/2012/wordml" mc:Ignorable="w14 wp14 w15">
+<w:document xmlns:o="urn:schemas-microsoft-com:office:office" xmlns:r="http://schemas.openxmlformats.org/officeDocument/2006/relationships" xmlns:v="urn:schemas-microsoft-com:vml" xmlns:w="http://schemas.openxmlformats.org/wordprocessingml/2006/main" xmlns:w10="urn:schemas-microsoft-com:office:word" xmlns:wp="http://schemas.openxmlformats.org/drawingml/2006/wordprocessingDrawing" xmlns:pic="http://schemas.openxmlformats.org/drawingml/2006/picture" xmlns:wps="http://schemas.microsoft.com/office/word/2010/wordprocessingShape" xmlns:wpg="http://schemas.microsoft.com/office/word/2010/wordprocessingGroup" xmlns:mc="http://schemas.openxmlformats.org/markup-compatibility/2006" xmlns:wp14="http://schemas.microsoft.com/office/word/2010/wordprocessingDrawing" xmlns:w14="http://schemas.microsoft.com/office/word/2010/wordml" xmlns:w15="http://schemas.microsoft.com/office/word/2012/wordml" mc:Ignorable="w14 wp14 w15">
   <w:body>
     <w:p>
       <w:pPr>
@@ -342,7 +342,7 @@
         <w:rPr>
           <w:lang w:val="de-DE"/>
         </w:rPr>
-        <w:t>Sechstes Niveau, vierte Woche, Freitag den 06.03.26</w:t>
+        <w:t>Sechstes Niveau, vierte Woche, Montag den 09.03.26</w:t>
       </w:r>
     </w:p>
     <w:p>
@@ -562,7 +562,7 @@
         <w:rPr>
           <w:lang w:val="de-DE"/>
         </w:rPr>
-        <w:t>Viertes Niveau, vierte Woche, Freitag den 06.03.26</w:t>
+        <w:t>Viertes Niveau, vierte Woche, Montag den 09.03.26</w:t>
       </w:r>
     </w:p>
     <w:p>
@@ -4375,7 +4375,7 @@
     </w:rPr>
   </w:style>
   <w:style w:type="paragraph" w:styleId="Caption">
-    <w:name w:val="Caption"/>
+    <w:name w:val="caption"/>
     <w:basedOn w:val="Normal"/>
     <w:qFormat/>
     <w:pPr>

</xml_diff>

<commit_message>
agregados a los planes de clase
</commit_message>
<xml_diff>
--- a/planesDeClaseSegundo.docx
+++ b/planesDeClaseSegundo.docx
@@ -245,6 +245,439 @@
           <w:lang w:val="de-DE"/>
         </w:rPr>
         <w:t>20‘ Was bin ich? Spiel</w:t>
+      </w:r>
+    </w:p>
+    <w:p>
+      <w:pPr>
+        <w:pStyle w:val="Normal"/>
+        <w:bidi w:val="0"/>
+        <w:jc w:val="start"/>
+        <w:rPr>
+          <w:lang w:val="de-DE"/>
+        </w:rPr>
+      </w:pPr>
+      <w:r>
+        <w:rPr>
+          <w:lang w:val="de-DE"/>
+        </w:rPr>
+        <w:t>******************************************</w:t>
+      </w:r>
+    </w:p>
+    <w:p>
+      <w:pPr>
+        <w:pStyle w:val="Normal"/>
+        <w:bidi w:val="0"/>
+        <w:jc w:val="start"/>
+        <w:rPr>
+          <w:lang w:val="de-DE"/>
+        </w:rPr>
+      </w:pPr>
+      <w:r>
+        <w:rPr>
+          <w:lang w:val="de-DE"/>
+        </w:rPr>
+        <w:t xml:space="preserve">Sechstes Niveau, vierte Woche, </w:t>
+      </w:r>
+      <w:r>
+        <w:rPr>
+          <w:lang w:val="de-DE"/>
+        </w:rPr>
+        <w:t>Mittwoch</w:t>
+      </w:r>
+      <w:r>
+        <w:rPr>
+          <w:lang w:val="de-DE"/>
+        </w:rPr>
+        <w:t xml:space="preserve"> den </w:t>
+      </w:r>
+      <w:r>
+        <w:rPr>
+          <w:lang w:val="de-DE"/>
+        </w:rPr>
+        <w:t>11</w:t>
+      </w:r>
+      <w:r>
+        <w:rPr>
+          <w:lang w:val="de-DE"/>
+        </w:rPr>
+        <w:t>.03.26</w:t>
+      </w:r>
+    </w:p>
+    <w:p>
+      <w:pPr>
+        <w:pStyle w:val="Normal"/>
+        <w:bidi w:val="0"/>
+        <w:jc w:val="start"/>
+        <w:rPr>
+          <w:lang w:val="de-DE"/>
+        </w:rPr>
+      </w:pPr>
+      <w:r>
+        <w:rPr/>
+      </w:r>
+    </w:p>
+    <w:p>
+      <w:pPr>
+        <w:pStyle w:val="Normal"/>
+        <w:bidi w:val="0"/>
+        <w:jc w:val="start"/>
+        <w:rPr>
+          <w:lang w:val="de-DE"/>
+        </w:rPr>
+      </w:pPr>
+      <w:r>
+        <w:rPr>
+          <w:lang w:val="de-DE"/>
+        </w:rPr>
+        <w:t>15‘ Haben Mariana und Juan schon ihre Bücher gelesen? Was Interessantes haben sie dabei gelernt? Gibt es neue Vokabeln, die sie gelernt haben? Wenn schon, welche?</w:t>
+      </w:r>
+    </w:p>
+    <w:p>
+      <w:pPr>
+        <w:pStyle w:val="Normal"/>
+        <w:bidi w:val="0"/>
+        <w:jc w:val="start"/>
+        <w:rPr>
+          <w:lang w:val="de-DE"/>
+        </w:rPr>
+      </w:pPr>
+      <w:r>
+        <w:rPr/>
+      </w:r>
+    </w:p>
+    <w:p>
+      <w:pPr>
+        <w:pStyle w:val="Normal"/>
+        <w:bidi w:val="0"/>
+        <w:jc w:val="start"/>
+        <w:rPr>
+          <w:lang w:val="de-DE"/>
+        </w:rPr>
+      </w:pPr>
+      <w:r>
+        <w:rPr>
+          <w:lang w:val="de-DE"/>
+        </w:rPr>
+        <w:t>20‘ Gedächtnisleistung</w:t>
+      </w:r>
+    </w:p>
+    <w:p>
+      <w:pPr>
+        <w:pStyle w:val="Normal"/>
+        <w:bidi w:val="0"/>
+        <w:jc w:val="start"/>
+        <w:rPr>
+          <w:lang w:val="de-DE"/>
+        </w:rPr>
+      </w:pPr>
+      <w:r>
+        <w:rPr>
+          <w:lang w:val="de-DE"/>
+        </w:rPr>
+        <w:t>10a Woran können Sie sich noch erinnern? Notieren Sie</w:t>
+      </w:r>
+    </w:p>
+    <w:p>
+      <w:pPr>
+        <w:pStyle w:val="Normal"/>
+        <w:bidi w:val="0"/>
+        <w:jc w:val="start"/>
+        <w:rPr>
+          <w:lang w:val="de-DE"/>
+        </w:rPr>
+      </w:pPr>
+      <w:r>
+        <w:rPr>
+          <w:lang w:val="de-DE"/>
+        </w:rPr>
+        <w:t>10b Sprechen Sie in Gruppen über Ihre Antworten in 10a. Warum können Sie sich an manche Dinge gut erinnern und an andere nicht?</w:t>
+      </w:r>
+    </w:p>
+    <w:p>
+      <w:pPr>
+        <w:pStyle w:val="Normal"/>
+        <w:bidi w:val="0"/>
+        <w:jc w:val="start"/>
+        <w:rPr>
+          <w:lang w:val="de-DE"/>
+        </w:rPr>
+      </w:pPr>
+      <w:r>
+        <w:rPr/>
+      </w:r>
+    </w:p>
+    <w:p>
+      <w:pPr>
+        <w:pStyle w:val="Normal"/>
+        <w:bidi w:val="0"/>
+        <w:jc w:val="start"/>
+        <w:rPr>
+          <w:lang w:val="de-DE"/>
+        </w:rPr>
+      </w:pPr>
+      <w:r>
+        <w:rPr/>
+      </w:r>
+    </w:p>
+    <w:p>
+      <w:pPr>
+        <w:pStyle w:val="Normal"/>
+        <w:bidi w:val="0"/>
+        <w:jc w:val="start"/>
+        <w:rPr>
+          <w:lang w:val="de-DE"/>
+        </w:rPr>
+      </w:pPr>
+      <w:r>
+        <w:rPr/>
+      </w:r>
+    </w:p>
+    <w:p>
+      <w:pPr>
+        <w:pStyle w:val="Normal"/>
+        <w:bidi w:val="0"/>
+        <w:jc w:val="start"/>
+        <w:rPr>
+          <w:lang w:val="de-DE"/>
+        </w:rPr>
+      </w:pPr>
+      <w:r>
+        <w:rPr>
+          <w:lang w:val="de-DE"/>
+        </w:rPr>
+        <w:t>30‘ Hörverstehen</w:t>
+      </w:r>
+    </w:p>
+    <w:p>
+      <w:pPr>
+        <w:pStyle w:val="Normal"/>
+        <w:bidi w:val="0"/>
+        <w:jc w:val="start"/>
+        <w:rPr>
+          <w:lang w:val="de-DE"/>
+        </w:rPr>
+      </w:pPr>
+      <w:r>
+        <w:rPr>
+          <w:lang w:val="de-DE"/>
+        </w:rPr>
+        <w:t>11a Lesen Sie die Programmankündigung. Was ist das Thema? Wer ist im Studio?</w:t>
+      </w:r>
+    </w:p>
+    <w:p>
+      <w:pPr>
+        <w:pStyle w:val="Normal"/>
+        <w:bidi w:val="0"/>
+        <w:jc w:val="start"/>
+        <w:rPr>
+          <w:lang w:val="de-DE"/>
+        </w:rPr>
+      </w:pPr>
+      <w:r>
+        <mc:AlternateContent>
+          <mc:Choice Requires="wps">
+            <w:drawing>
+              <wp:anchor behindDoc="0" distT="0" distB="0" distL="0" distR="0" simplePos="0" locked="0" layoutInCell="1" allowOverlap="1" relativeHeight="2">
+                <wp:simplePos x="0" y="0"/>
+                <wp:positionH relativeFrom="column">
+                  <wp:posOffset>88265</wp:posOffset>
+                </wp:positionH>
+                <wp:positionV relativeFrom="paragraph">
+                  <wp:posOffset>170180</wp:posOffset>
+                </wp:positionV>
+                <wp:extent cx="586740" cy="586740"/>
+                <wp:effectExtent l="0" t="0" r="0" b="0"/>
+                <wp:wrapNone/>
+                <wp:docPr id="1" name="Media object 1"/>
+                <a:graphic xmlns:a="http://schemas.openxmlformats.org/drawingml/2006/main">
+                  <a:graphicData uri="http://schemas.microsoft.com/office/word/2010/wordprocessingShape"/>
+                </a:graphic>
+              </wp:anchor>
+            </w:drawing>
+          </mc:Choice>
+          <mc:Fallback>
+            <w:pict/>
+          </mc:Fallback>
+        </mc:AlternateContent>
+      </w:r>
+      <w:r>
+        <w:rPr>
+          <w:lang w:val="de-DE"/>
+        </w:rPr>
+        <w:t xml:space="preserve">11b Hören Sie die </w:t>
+      </w:r>
+      <w:hyperlink r:id="rId2">
+        <w:r>
+          <w:rPr>
+            <w:rStyle w:val="Hyperlink"/>
+            <w:lang w:val="de-DE"/>
+          </w:rPr>
+          <w:t>Radiosendung</w:t>
+        </w:r>
+      </w:hyperlink>
+      <w:r>
+        <w:rPr>
+          <w:lang w:val="de-DE"/>
+        </w:rPr>
+        <w:t>. In Welcher Reihenfolge sprechen die Personen über die Themen?</w:t>
+      </w:r>
+    </w:p>
+    <w:p>
+      <w:pPr>
+        <w:pStyle w:val="Normal"/>
+        <w:bidi w:val="0"/>
+        <w:jc w:val="start"/>
+        <w:rPr>
+          <w:lang w:val="de-DE"/>
+        </w:rPr>
+      </w:pPr>
+      <w:r>
+        <w:rPr/>
+      </w:r>
+    </w:p>
+    <w:p>
+      <w:pPr>
+        <w:pStyle w:val="Normal"/>
+        <w:bidi w:val="0"/>
+        <w:jc w:val="start"/>
+        <w:rPr>
+          <w:lang w:val="de-DE"/>
+        </w:rPr>
+      </w:pPr>
+      <w:r>
+        <w:rPr/>
+      </w:r>
+    </w:p>
+    <w:p>
+      <w:pPr>
+        <w:pStyle w:val="Normal"/>
+        <w:bidi w:val="0"/>
+        <w:jc w:val="start"/>
+        <w:rPr>
+          <w:lang w:val="de-DE"/>
+        </w:rPr>
+      </w:pPr>
+      <w:r>
+        <w:rPr/>
+      </w:r>
+    </w:p>
+    <w:p>
+      <w:pPr>
+        <w:pStyle w:val="Normal"/>
+        <w:bidi w:val="0"/>
+        <w:jc w:val="start"/>
+        <w:rPr>
+          <w:lang w:val="de-DE"/>
+        </w:rPr>
+      </w:pPr>
+      <w:r>
+        <w:rPr>
+          <w:lang w:val="de-DE"/>
+        </w:rPr>
+        <w:t>11c Lesen Sie die Aussagen und hören Sie die Radiosendung noch einmal. Wer sagt das? Notieren Sie.</w:t>
+      </w:r>
+    </w:p>
+    <w:p>
+      <w:pPr>
+        <w:pStyle w:val="Normal"/>
+        <w:bidi w:val="0"/>
+        <w:jc w:val="start"/>
+        <w:rPr>
+          <w:lang w:val="de-DE"/>
+        </w:rPr>
+      </w:pPr>
+      <w:r>
+        <w:rPr/>
+      </w:r>
+    </w:p>
+    <w:p>
+      <w:pPr>
+        <w:pStyle w:val="Normal"/>
+        <w:bidi w:val="0"/>
+        <w:jc w:val="start"/>
+        <w:rPr>
+          <w:lang w:val="de-DE"/>
+        </w:rPr>
+      </w:pPr>
+      <w:r>
+        <w:rPr>
+          <w:lang w:val="de-DE"/>
+        </w:rPr>
+        <w:t>30‘ Schreiben</w:t>
+      </w:r>
+    </w:p>
+    <w:p>
+      <w:pPr>
+        <w:pStyle w:val="Normal"/>
+        <w:bidi w:val="0"/>
+        <w:jc w:val="start"/>
+        <w:rPr>
+          <w:lang w:val="de-DE"/>
+        </w:rPr>
+      </w:pPr>
+      <w:r>
+        <w:rPr>
+          <w:lang w:val="de-DE"/>
+        </w:rPr>
+        <w:t>12a Welche deutschen Wörter können Sie sich schlecht Merken? Wählen Sie schwierige Wörter und schreiben Sie damit eine kurze, ungewöhnliche Geschichte.</w:t>
+      </w:r>
+    </w:p>
+    <w:p>
+      <w:pPr>
+        <w:pStyle w:val="Normal"/>
+        <w:bidi w:val="0"/>
+        <w:jc w:val="start"/>
+        <w:rPr>
+          <w:lang w:val="de-DE"/>
+        </w:rPr>
+      </w:pPr>
+      <w:r>
+        <w:rPr/>
+      </w:r>
+    </w:p>
+    <w:p>
+      <w:pPr>
+        <w:pStyle w:val="Normal"/>
+        <w:bidi w:val="0"/>
+        <w:jc w:val="start"/>
+        <w:rPr>
+          <w:lang w:val="de-DE"/>
+        </w:rPr>
+      </w:pPr>
+      <w:r>
+        <w:rPr>
+          <w:lang w:val="de-DE"/>
+        </w:rPr>
+        <w:t>10‘ Welche Lerntipps kennen Sie noch?</w:t>
+      </w:r>
+    </w:p>
+    <w:p>
+      <w:pPr>
+        <w:pStyle w:val="Normal"/>
+        <w:bidi w:val="0"/>
+        <w:jc w:val="start"/>
+        <w:rPr>
+          <w:lang w:val="de-DE"/>
+        </w:rPr>
+      </w:pPr>
+      <w:r>
+        <w:rPr>
+          <w:lang w:val="de-DE"/>
+        </w:rPr>
+        <w:t>15‘ Lektüre: Mit allen Sinnen. Wenn die KT nicht fertig damit werden können sie zu Hause den Text lesen.</w:t>
+      </w:r>
+    </w:p>
+    <w:p>
+      <w:pPr>
+        <w:pStyle w:val="Normal"/>
+        <w:bidi w:val="0"/>
+        <w:jc w:val="start"/>
+        <w:rPr>
+          <w:lang w:val="de-DE"/>
+        </w:rPr>
+      </w:pPr>
+      <w:r>
+        <w:rPr/>
       </w:r>
     </w:p>
     <w:p>
@@ -4576,6 +5009,13 @@
     <w:name w:val="Hyperlink"/>
     <w:rPr>
       <w:color w:val="000080"/>
+      <w:u w:val="single"/>
+    </w:rPr>
+  </w:style>
+  <w:style w:type="character" w:styleId="FollowedHyperlink">
+    <w:name w:val="FollowedHyperlink"/>
+    <w:rPr>
+      <w:color w:val="800000"/>
       <w:u w:val="single"/>
     </w:rPr>
   </w:style>

</xml_diff>

<commit_message>
planes de miércoles completados
</commit_message>
<xml_diff>
--- a/planesDeClaseSegundo.docx
+++ b/planesDeClaseSegundo.docx
@@ -109,13 +109,7 @@
         <w:rPr>
           <w:lang w:val="de-DE"/>
         </w:rPr>
-        <w:t>b) Berichten Sie über Lena und Wladimir.</w:t>
-      </w:r>
-      <w:r>
-        <w:rPr>
-          <w:lang w:val="de-DE"/>
-        </w:rPr>
-        <w:t>o do</w:t>
+        <w:t>b) Berichten Sie über Lena und Wladimir.o do</w:t>
       </w:r>
     </w:p>
     <w:p>
@@ -615,21 +609,281 @@
         <w:rPr>
           <w:lang w:val="de-DE"/>
         </w:rPr>
-      </w:r>
-    </w:p>
-    <w:p>
-      <w:pPr>
-        <w:pStyle w:val="Normal"/>
-        <w:bidi w:val="0"/>
-        <w:jc w:val="start"/>
-        <w:rPr>
-          <w:lang w:val="de-DE"/>
-        </w:rPr>
-      </w:pPr>
-      <w:r>
-        <w:rPr>
-          <w:lang w:val="de-DE"/>
-        </w:rPr>
+        <w:t>******************************************</w:t>
+      </w:r>
+    </w:p>
+    <w:p>
+      <w:pPr>
+        <w:pStyle w:val="Normal"/>
+        <w:bidi w:val="0"/>
+        <w:jc w:val="start"/>
+        <w:rPr>
+          <w:lang w:val="de-DE"/>
+        </w:rPr>
+      </w:pPr>
+      <w:r>
+        <w:rPr>
+          <w:lang w:val="de-DE"/>
+        </w:rPr>
+        <w:t>Viertes</w:t>
+      </w:r>
+      <w:r>
+        <w:rPr>
+          <w:lang w:val="de-DE"/>
+        </w:rPr>
+        <w:t xml:space="preserve"> Niveau, </w:t>
+      </w:r>
+      <w:r>
+        <w:rPr>
+          <w:lang w:val="de-DE"/>
+        </w:rPr>
+        <w:t>fünfte</w:t>
+      </w:r>
+      <w:r>
+        <w:rPr>
+          <w:lang w:val="de-DE"/>
+        </w:rPr>
+        <w:t xml:space="preserve"> Woche, Mittwoch den 11.03.26</w:t>
+      </w:r>
+    </w:p>
+    <w:p>
+      <w:pPr>
+        <w:pStyle w:val="Normal"/>
+        <w:bidi w:val="0"/>
+        <w:jc w:val="start"/>
+        <w:rPr>
+          <w:lang w:val="de-DE"/>
+        </w:rPr>
+      </w:pPr>
+      <w:r>
+        <w:rPr/>
+      </w:r>
+    </w:p>
+    <w:p>
+      <w:pPr>
+        <w:pStyle w:val="Normal"/>
+        <w:bidi w:val="0"/>
+        <w:jc w:val="start"/>
+        <w:rPr>
+          <w:lang w:val="de-DE"/>
+        </w:rPr>
+      </w:pPr>
+      <w:r>
+        <w:rPr>
+          <w:lang w:val="de-DE"/>
+        </w:rPr>
+        <w:t>40‘ Die KT beantworten den Kapiteltest aus Lektion 7. Die Antworten werden später kontrolliert.</w:t>
+      </w:r>
+    </w:p>
+    <w:p>
+      <w:pPr>
+        <w:pStyle w:val="Normal"/>
+        <w:bidi w:val="0"/>
+        <w:jc w:val="start"/>
+        <w:rPr>
+          <w:lang w:val="de-DE"/>
+        </w:rPr>
+      </w:pPr>
+      <w:r>
+        <w:rPr>
+          <w:lang w:val="de-DE"/>
+        </w:rPr>
+        <w:t>20‘ Die KT lösen die Fragen von Kahoot. Haben sie ein gutes Ergebnis gehabt / eine gute Note erzielt? Was Neues haben sie dabei gelernt?</w:t>
+      </w:r>
+    </w:p>
+    <w:p>
+      <w:pPr>
+        <w:pStyle w:val="Normal"/>
+        <w:bidi w:val="0"/>
+        <w:jc w:val="start"/>
+        <w:rPr>
+          <w:lang w:val="de-DE"/>
+        </w:rPr>
+      </w:pPr>
+      <w:r>
+        <w:rPr/>
+      </w:r>
+    </w:p>
+    <w:p>
+      <w:pPr>
+        <w:pStyle w:val="Normal"/>
+        <w:bidi w:val="0"/>
+        <w:jc w:val="start"/>
+        <w:rPr>
+          <w:lang w:val="de-DE"/>
+        </w:rPr>
+      </w:pPr>
+      <w:r>
+        <w:rPr/>
+      </w:r>
+    </w:p>
+    <w:p>
+      <w:pPr>
+        <w:pStyle w:val="Normal"/>
+        <w:bidi w:val="0"/>
+        <w:jc w:val="start"/>
+        <w:rPr>
+          <w:lang w:val="de-DE"/>
+        </w:rPr>
+      </w:pPr>
+      <w:r>
+        <w:rPr/>
+      </w:r>
+    </w:p>
+    <w:p>
+      <w:pPr>
+        <w:pStyle w:val="Normal"/>
+        <w:bidi w:val="0"/>
+        <w:jc w:val="start"/>
+        <w:rPr>
+          <w:lang w:val="de-DE"/>
+        </w:rPr>
+      </w:pPr>
+      <w:r>
+        <w:rPr/>
+      </w:r>
+    </w:p>
+    <w:p>
+      <w:pPr>
+        <w:pStyle w:val="Normal"/>
+        <w:bidi w:val="0"/>
+        <w:jc w:val="start"/>
+        <w:rPr>
+          <w:lang w:val="de-DE"/>
+        </w:rPr>
+      </w:pPr>
+      <w:r>
+        <w:rPr>
+          <w:lang w:val="de-DE"/>
+        </w:rPr>
+        <w:t>----</w:t>
+      </w:r>
+    </w:p>
+    <w:p>
+      <w:pPr>
+        <w:pStyle w:val="Normal"/>
+        <w:bidi w:val="0"/>
+        <w:jc w:val="start"/>
+        <w:rPr>
+          <w:lang w:val="de-DE"/>
+        </w:rPr>
+      </w:pPr>
+      <w:r>
+        <w:rPr>
+          <w:lang w:val="de-DE"/>
+        </w:rPr>
+        <w:t>Einleitung in die neue Lektion (Lektion 8)</w:t>
+      </w:r>
+    </w:p>
+    <w:p>
+      <w:pPr>
+        <w:pStyle w:val="Normal"/>
+        <w:bidi w:val="0"/>
+        <w:jc w:val="start"/>
+        <w:rPr>
+          <w:lang w:val="de-DE"/>
+        </w:rPr>
+      </w:pPr>
+      <w:r>
+        <w:rPr>
+          <w:lang w:val="de-DE"/>
+        </w:rPr>
+      </w:r>
+    </w:p>
+    <w:p>
+      <w:pPr>
+        <w:pStyle w:val="Normal"/>
+        <w:bidi w:val="0"/>
+        <w:jc w:val="start"/>
+        <w:rPr>
+          <w:lang w:val="de-DE"/>
+        </w:rPr>
+      </w:pPr>
+      <w:r>
+        <w:rPr>
+          <w:lang w:val="de-DE"/>
+        </w:rPr>
+        <w:t>15‘ Sehen Sie die Fotos an. Kann man das leicht lernen oder ist das schwierig? Was meinen Sie?</w:t>
+      </w:r>
+    </w:p>
+    <w:p>
+      <w:pPr>
+        <w:pStyle w:val="Normal"/>
+        <w:bidi w:val="0"/>
+        <w:jc w:val="start"/>
+        <w:rPr>
+          <w:lang w:val="de-DE"/>
+        </w:rPr>
+      </w:pPr>
+      <w:r>
+        <w:rPr>
+          <w:lang w:val="de-DE"/>
+        </w:rPr>
+        <w:t>15‘ Lesen Sie die Texte. Was lernen die Personen? Machen Sie eine Tabelle.</w:t>
+      </w:r>
+    </w:p>
+    <w:p>
+      <w:pPr>
+        <w:pStyle w:val="Normal"/>
+        <w:bidi w:val="0"/>
+        <w:jc w:val="start"/>
+        <w:rPr>
+          <w:lang w:val="de-DE"/>
+        </w:rPr>
+      </w:pPr>
+      <w:r>
+        <w:rPr>
+          <w:lang w:val="de-DE"/>
+        </w:rPr>
+        <w:t>20‘ Hörverstehen:</w:t>
+      </w:r>
+    </w:p>
+    <w:p>
+      <w:pPr>
+        <w:pStyle w:val="Normal"/>
+        <w:bidi w:val="0"/>
+        <w:jc w:val="start"/>
+        <w:rPr>
+          <w:lang w:val="de-DE"/>
+        </w:rPr>
+      </w:pPr>
+      <w:r>
+        <w:rPr>
+          <w:lang w:val="de-DE"/>
+        </w:rPr>
+        <w:t>Und die anderen Personen? Hören Sie und ergänzen Sie die Informationen in die Tabelle.</w:t>
+      </w:r>
+    </w:p>
+    <w:p>
+      <w:pPr>
+        <w:pStyle w:val="Normal"/>
+        <w:bidi w:val="0"/>
+        <w:jc w:val="start"/>
+        <w:rPr>
+          <w:lang w:val="de-DE"/>
+        </w:rPr>
+      </w:pPr>
+      <w:r>
+        <w:rPr>
+          <w:lang w:val="de-DE"/>
+        </w:rPr>
+        <w:t>10‘ Mündlicher Ausdruck:</w:t>
+      </w:r>
+    </w:p>
+    <w:p>
+      <w:pPr>
+        <w:pStyle w:val="Normal"/>
+        <w:bidi w:val="0"/>
+        <w:jc w:val="start"/>
+        <w:rPr>
+          <w:lang w:val="de-DE"/>
+        </w:rPr>
+      </w:pPr>
+      <w:r>
+        <w:rPr>
+          <w:lang w:val="de-DE"/>
+        </w:rPr>
+        <w:t>Sprechen Sie zu zweit. Machen Sie Notizen und berichten Sie im Kurs von Ihrem Partner / Ihrer Partnerin.</w:t>
       </w:r>
     </w:p>
     <w:p>

</xml_diff>

<commit_message>
cambios a los planes de clase para el viernes
</commit_message>
<xml_diff>
--- a/planesDeClaseSegundo.docx
+++ b/planesDeClaseSegundo.docx
@@ -1,7 +1,626 @@
 
 <file path=word/document.xml><?xml version="1.0" encoding="utf-8"?>
-<w:document xmlns:o="urn:schemas-microsoft-com:office:office" xmlns:r="http://schemas.openxmlformats.org/officeDocument/2006/relationships" xmlns:v="urn:schemas-microsoft-com:vml" xmlns:w="http://schemas.openxmlformats.org/wordprocessingml/2006/main" xmlns:w10="urn:schemas-microsoft-com:office:word" xmlns:wp="http://schemas.openxmlformats.org/drawingml/2006/wordprocessingDrawing" xmlns:pic="http://schemas.openxmlformats.org/drawingml/2006/picture" xmlns:wps="http://schemas.microsoft.com/office/word/2010/wordprocessingShape" xmlns:wpg="http://schemas.microsoft.com/office/word/2010/wordprocessingGroup" xmlns:mc="http://schemas.openxmlformats.org/markup-compatibility/2006" xmlns:wp14="http://schemas.microsoft.com/office/word/2010/wordprocessingDrawing" xmlns:w14="http://schemas.microsoft.com/office/word/2010/wordml" xmlns:w15="http://schemas.microsoft.com/office/word/2012/wordml" mc:Ignorable="w14 wp14 w15">
+<w:document xmlns:o="urn:schemas-microsoft-com:office:office" xmlns:r="http://schemas.openxmlformats.org/officeDocument/2006/relationships" xmlns:v="urn:schemas-microsoft-com:vml" xmlns:w="http://schemas.openxmlformats.org/wordprocessingml/2006/main" xmlns:w10="urn:schemas-microsoft-com:office:word" xmlns:wp="http://schemas.openxmlformats.org/drawingml/2006/wordprocessingDrawing" xmlns:wps="http://schemas.microsoft.com/office/word/2010/wordprocessingShape" xmlns:wpg="http://schemas.microsoft.com/office/word/2010/wordprocessingGroup" xmlns:mc="http://schemas.openxmlformats.org/markup-compatibility/2006" xmlns:wp14="http://schemas.microsoft.com/office/word/2010/wordprocessingDrawing" xmlns:w14="http://schemas.microsoft.com/office/word/2010/wordml" xmlns:w15="http://schemas.microsoft.com/office/word/2012/wordml" mc:Ignorable="w14 wp14 w15">
   <w:body>
+    <w:p>
+      <w:pPr>
+        <w:pStyle w:val="Normal"/>
+        <w:bidi w:val="0"/>
+        <w:jc w:val="start"/>
+        <w:rPr>
+          <w:lang w:val="de-DE"/>
+        </w:rPr>
+      </w:pPr>
+      <w:r>
+        <w:rPr>
+          <w:lang w:val="de-DE"/>
+        </w:rPr>
+        <w:t>Zweites Niveau, fünfte Woche, Freitag den 13.03.26</w:t>
+      </w:r>
+    </w:p>
+    <w:p>
+      <w:pPr>
+        <w:pStyle w:val="Normal"/>
+        <w:bidi w:val="0"/>
+        <w:jc w:val="start"/>
+        <w:rPr>
+          <w:lang w:val="de-DE"/>
+        </w:rPr>
+      </w:pPr>
+      <w:r>
+        <w:rPr>
+          <w:lang w:val="de-DE"/>
+        </w:rPr>
+      </w:r>
+    </w:p>
+    <w:p>
+      <w:pPr>
+        <w:pStyle w:val="Normal"/>
+        <w:bidi w:val="0"/>
+        <w:jc w:val="start"/>
+        <w:rPr>
+          <w:lang w:val="de-DE"/>
+        </w:rPr>
+      </w:pPr>
+      <w:r>
+        <w:rPr>
+          <w:lang w:val="de-DE"/>
+        </w:rPr>
+        <w:t>20‘ Taller: cooperación con la Universidad de Hannover. Se explica el proyecto.</w:t>
+      </w:r>
+    </w:p>
+    <w:p>
+      <w:pPr>
+        <w:pStyle w:val="Normal"/>
+        <w:bidi w:val="0"/>
+        <w:jc w:val="start"/>
+        <w:rPr>
+          <w:lang w:val="de-DE"/>
+        </w:rPr>
+      </w:pPr>
+      <w:r>
+        <w:rPr>
+          <w:lang w:val="de-DE"/>
+        </w:rPr>
+        <w:t>40‘ Escribir una carta para los compañeros de Hannover.</w:t>
+      </w:r>
+    </w:p>
+    <w:p>
+      <w:pPr>
+        <w:pStyle w:val="Normal"/>
+        <w:bidi w:val="0"/>
+        <w:jc w:val="start"/>
+        <w:rPr>
+          <w:lang w:val="de-DE"/>
+        </w:rPr>
+      </w:pPr>
+      <w:r>
+        <w:rPr>
+          <w:lang w:val="de-DE"/>
+        </w:rPr>
+        <w:t>----</w:t>
+      </w:r>
+    </w:p>
+    <w:p>
+      <w:pPr>
+        <w:pStyle w:val="Normal"/>
+        <w:bidi w:val="0"/>
+        <w:jc w:val="start"/>
+        <w:rPr>
+          <w:lang w:val="de-DE"/>
+        </w:rPr>
+      </w:pPr>
+      <w:r>
+        <w:rPr>
+          <w:lang w:val="de-DE"/>
+        </w:rPr>
+        <w:t xml:space="preserve">30‘ Was bin ich? </w:t>
+      </w:r>
+    </w:p>
+    <w:p>
+      <w:pPr>
+        <w:pStyle w:val="Normal"/>
+        <w:bidi w:val="0"/>
+        <w:jc w:val="start"/>
+        <w:rPr>
+          <w:lang w:val="de-DE"/>
+        </w:rPr>
+      </w:pPr>
+      <w:r>
+        <w:rPr>
+          <w:lang w:val="de-DE"/>
+        </w:rPr>
+        <w:t>a) Berufe, Tätigkeiten, Arbeitsorte. Sammeln Sie im Kurs.</w:t>
+      </w:r>
+    </w:p>
+    <w:p>
+      <w:pPr>
+        <w:pStyle w:val="Normal"/>
+        <w:bidi w:val="0"/>
+        <w:jc w:val="start"/>
+        <w:rPr>
+          <w:lang w:val="de-DE"/>
+        </w:rPr>
+      </w:pPr>
+      <w:r>
+        <w:rPr>
+          <w:lang w:val="de-DE"/>
+        </w:rPr>
+        <w:t xml:space="preserve">b) Schreiben Sie einen Beruf auf einen Zettel. Der Partner rät den Beruf. Sie antworten mit </w:t>
+      </w:r>
+      <w:r>
+        <w:rPr>
+          <w:i/>
+          <w:iCs/>
+          <w:lang w:val="de-DE"/>
+        </w:rPr>
+        <w:t>Ja</w:t>
+      </w:r>
+      <w:r>
+        <w:rPr>
+          <w:lang w:val="de-DE"/>
+        </w:rPr>
+        <w:t xml:space="preserve"> oder </w:t>
+      </w:r>
+      <w:r>
+        <w:rPr>
+          <w:i/>
+          <w:iCs/>
+          <w:lang w:val="de-DE"/>
+        </w:rPr>
+        <w:t>Nein</w:t>
+      </w:r>
+      <w:r>
+        <w:rPr>
+          <w:lang w:val="de-DE"/>
+        </w:rPr>
+        <w:t>.</w:t>
+      </w:r>
+    </w:p>
+    <w:p>
+      <w:pPr>
+        <w:pStyle w:val="Normal"/>
+        <w:bidi w:val="0"/>
+        <w:jc w:val="start"/>
+        <w:rPr>
+          <w:lang w:val="de-DE"/>
+        </w:rPr>
+      </w:pPr>
+      <w:r>
+        <w:rPr>
+          <w:lang w:val="de-DE"/>
+        </w:rPr>
+        <w:t>20‘ Ich habe ein Praktikum gemacht.</w:t>
+      </w:r>
+    </w:p>
+    <w:p>
+      <w:pPr>
+        <w:pStyle w:val="Normal"/>
+        <w:bidi w:val="0"/>
+        <w:jc w:val="start"/>
+        <w:rPr>
+          <w:lang w:val="de-DE"/>
+        </w:rPr>
+      </w:pPr>
+      <w:r>
+        <w:rPr>
+          <w:lang w:val="de-DE"/>
+        </w:rPr>
+        <w:t>Sammeln Sie die Partizip-II-Formen in den Berufsportäts in 2a) und ergänzen Sie die Tabelle.</w:t>
+      </w:r>
+    </w:p>
+    <w:p>
+      <w:pPr>
+        <w:pStyle w:val="Normal"/>
+        <w:bidi w:val="0"/>
+        <w:jc w:val="start"/>
+        <w:rPr>
+          <w:lang w:val="de-DE"/>
+        </w:rPr>
+      </w:pPr>
+      <w:r>
+        <w:rPr>
+          <w:lang w:val="de-DE"/>
+        </w:rPr>
+        <w:t>******************************************</w:t>
+      </w:r>
+    </w:p>
+    <w:p>
+      <w:pPr>
+        <w:pStyle w:val="Normal"/>
+        <w:bidi w:val="0"/>
+        <w:jc w:val="start"/>
+        <w:rPr>
+          <w:lang w:val="de-DE"/>
+        </w:rPr>
+      </w:pPr>
+      <w:r>
+        <w:rPr>
+          <w:lang w:val="de-DE"/>
+        </w:rPr>
+        <w:t>Sechstes Niveau, fünfte Woche, Freitag den 13.03.26</w:t>
+      </w:r>
+    </w:p>
+    <w:p>
+      <w:pPr>
+        <w:pStyle w:val="Normal"/>
+        <w:bidi w:val="0"/>
+        <w:jc w:val="start"/>
+        <w:rPr>
+          <w:lang w:val="de-DE"/>
+        </w:rPr>
+      </w:pPr>
+      <w:r>
+        <w:rPr>
+          <w:lang w:val="de-DE"/>
+        </w:rPr>
+      </w:r>
+    </w:p>
+    <w:p>
+      <w:pPr>
+        <w:pStyle w:val="Normal"/>
+        <w:bidi w:val="0"/>
+        <w:jc w:val="start"/>
+        <w:rPr>
+          <w:lang w:val="de-DE"/>
+        </w:rPr>
+      </w:pPr>
+      <w:r>
+        <w:rPr>
+          <w:lang w:val="de-DE"/>
+        </w:rPr>
+        <w:t>20‘ Sobre qué les gustaría escribirle a sus compañeros de Hannover</w:t>
+      </w:r>
+    </w:p>
+    <w:p>
+      <w:pPr>
+        <w:pStyle w:val="Normal"/>
+        <w:bidi w:val="0"/>
+        <w:jc w:val="start"/>
+        <w:rPr>
+          <w:lang w:val="de-DE"/>
+        </w:rPr>
+      </w:pPr>
+      <w:r>
+        <w:rPr>
+          <w:lang w:val="de-DE"/>
+        </w:rPr>
+        <w:t>30‘ Los alumnos escriben un correo para el proyecto de Hannover.</w:t>
+      </w:r>
+    </w:p>
+    <w:p>
+      <w:pPr>
+        <w:pStyle w:val="Normal"/>
+        <w:bidi w:val="0"/>
+        <w:jc w:val="start"/>
+        <w:rPr>
+          <w:lang w:val="de-DE"/>
+        </w:rPr>
+      </w:pPr>
+      <w:r>
+        <w:rPr>
+          <w:lang w:val="de-DE"/>
+        </w:rPr>
+        <w:t>10‘ Los alumnos revisan y corrigen las cartas para los compañeros de Hannover.</w:t>
+      </w:r>
+    </w:p>
+    <w:p>
+      <w:pPr>
+        <w:pStyle w:val="Normal"/>
+        <w:bidi w:val="0"/>
+        <w:jc w:val="start"/>
+        <w:rPr>
+          <w:lang w:val="de-DE"/>
+        </w:rPr>
+      </w:pPr>
+      <w:r>
+        <w:rPr>
+          <w:lang w:val="de-DE"/>
+        </w:rPr>
+        <w:t>---</w:t>
+      </w:r>
+    </w:p>
+    <w:p>
+      <w:pPr>
+        <w:pStyle w:val="Normal"/>
+        <w:bidi w:val="0"/>
+        <w:jc w:val="start"/>
+        <w:rPr>
+          <w:lang w:val="de-DE"/>
+        </w:rPr>
+      </w:pPr>
+      <w:r>
+        <w:rPr>
+          <w:lang w:val="de-DE"/>
+        </w:rPr>
+        <w:t>10‘ Erinnern sich die KT an die Wörter, die sie in der Fantasie-Geschichte miteinbezogen haben?</w:t>
+      </w:r>
+    </w:p>
+    <w:p>
+      <w:pPr>
+        <w:pStyle w:val="Normal"/>
+        <w:bidi w:val="0"/>
+        <w:jc w:val="start"/>
+        <w:rPr>
+          <w:lang w:val="de-DE"/>
+        </w:rPr>
+      </w:pPr>
+      <w:r>
+        <w:rPr>
+          <w:lang w:val="de-DE"/>
+        </w:rPr>
+        <w:t>10‘ Die KT lesen nochmals Ihre Fantasie-Texte vor. Die anderen könne Fragen stellen</w:t>
+      </w:r>
+    </w:p>
+    <w:p>
+      <w:pPr>
+        <w:pStyle w:val="Normal"/>
+        <w:bidi w:val="0"/>
+        <w:jc w:val="start"/>
+        <w:rPr>
+          <w:lang w:val="de-DE"/>
+        </w:rPr>
+      </w:pPr>
+      <w:r>
+        <w:rPr>
+          <w:lang w:val="de-DE"/>
+        </w:rPr>
+        <w:t>30‘ Welche Lerntipps kennen Sie noch? Arbeiten Sie in Gruppen, recherchieren und sammeln Sie Tipps. Bilden Sie dann neue Gruppen mit Personen aus den anderen Gruppen und berichten Sie sich gegenseitig.</w:t>
+      </w:r>
+    </w:p>
+    <w:p>
+      <w:pPr>
+        <w:pStyle w:val="Normal"/>
+        <w:bidi w:val="0"/>
+        <w:jc w:val="start"/>
+        <w:rPr>
+          <w:lang w:val="de-DE"/>
+        </w:rPr>
+      </w:pPr>
+      <w:r>
+        <w:rPr>
+          <w:lang w:val="de-DE"/>
+        </w:rPr>
+        <w:t>15‘ Lektüre: Mit allen Sinnen. Wenn die KT nicht fertig damit werden können sie zu Hause den Text lesen.</w:t>
+      </w:r>
+    </w:p>
+    <w:p>
+      <w:pPr>
+        <w:pStyle w:val="Normal"/>
+        <w:bidi w:val="0"/>
+        <w:jc w:val="start"/>
+        <w:rPr>
+          <w:lang w:val="de-DE"/>
+        </w:rPr>
+      </w:pPr>
+      <w:r>
+        <w:rPr>
+          <w:lang w:val="de-DE"/>
+        </w:rPr>
+        <w:t>******************************************</w:t>
+      </w:r>
+    </w:p>
+    <w:p>
+      <w:pPr>
+        <w:pStyle w:val="Normal"/>
+        <w:bidi w:val="0"/>
+        <w:jc w:val="start"/>
+        <w:rPr>
+          <w:lang w:val="de-DE"/>
+        </w:rPr>
+      </w:pPr>
+      <w:r>
+        <w:rPr>
+          <w:lang w:val="de-DE"/>
+        </w:rPr>
+        <w:t>Viertes Niveau, fünfte Woche, Freitag den 13.03.26</w:t>
+      </w:r>
+    </w:p>
+    <w:p>
+      <w:pPr>
+        <w:pStyle w:val="Normal"/>
+        <w:bidi w:val="0"/>
+        <w:jc w:val="start"/>
+        <w:rPr>
+          <w:lang w:val="de-DE"/>
+        </w:rPr>
+      </w:pPr>
+      <w:r>
+        <w:rPr>
+          <w:lang w:val="de-DE"/>
+        </w:rPr>
+        <w:t>20‘ Das Konzept von dem Projekt mit der Uni-Hannover wird präsentiert. Hat Sophie Fragen zum Thema?</w:t>
+      </w:r>
+    </w:p>
+    <w:p>
+      <w:pPr>
+        <w:pStyle w:val="Normal"/>
+        <w:bidi w:val="0"/>
+        <w:jc w:val="start"/>
+        <w:rPr>
+          <w:lang w:val="de-DE"/>
+        </w:rPr>
+      </w:pPr>
+      <w:r>
+        <w:rPr>
+          <w:lang w:val="de-DE"/>
+        </w:rPr>
+        <w:t xml:space="preserve">40‘ Die Kursteilnehmer schreiben einen ersten Brief für ihren möglichen Partner. </w:t>
+      </w:r>
+      <w:r>
+        <w:rPr>
+          <w:lang w:val="de-DE"/>
+        </w:rPr>
+        <w:t>Am Ende dieses Prozesses tauschen Sie Ihren Text mit einem Partner aus, damit er oder sie es korrigiert.</w:t>
+      </w:r>
+    </w:p>
+    <w:p>
+      <w:pPr>
+        <w:pStyle w:val="Normal"/>
+        <w:bidi w:val="0"/>
+        <w:jc w:val="start"/>
+        <w:rPr>
+          <w:lang w:val="de-DE"/>
+        </w:rPr>
+      </w:pPr>
+      <w:r>
+        <w:rPr>
+          <w:lang w:val="de-DE"/>
+        </w:rPr>
+        <w:t>----</w:t>
+      </w:r>
+    </w:p>
+    <w:p>
+      <w:pPr>
+        <w:pStyle w:val="Normal"/>
+        <w:bidi w:val="0"/>
+        <w:jc w:val="start"/>
+        <w:rPr>
+          <w:lang w:val="de-DE"/>
+        </w:rPr>
+      </w:pPr>
+      <w:r>
+        <w:rPr>
+          <w:lang w:val="de-DE"/>
+        </w:rPr>
+        <w:t>Einleitung in die neue Lektion (Lektion 8)</w:t>
+      </w:r>
+    </w:p>
+    <w:p>
+      <w:pPr>
+        <w:pStyle w:val="Normal"/>
+        <w:bidi w:val="0"/>
+        <w:jc w:val="start"/>
+        <w:rPr>
+          <w:lang w:val="de-DE"/>
+        </w:rPr>
+      </w:pPr>
+      <w:r>
+        <w:rPr>
+          <w:lang w:val="de-DE"/>
+        </w:rPr>
+      </w:r>
+    </w:p>
+    <w:p>
+      <w:pPr>
+        <w:pStyle w:val="Normal"/>
+        <w:bidi w:val="0"/>
+        <w:jc w:val="start"/>
+        <w:rPr>
+          <w:lang w:val="de-DE"/>
+        </w:rPr>
+      </w:pPr>
+      <w:r>
+        <w:rPr>
+          <w:lang w:val="de-DE"/>
+        </w:rPr>
+        <w:t>15‘ Sehen Sie die Fotos an. Kann man das leicht lernen oder ist das schwierig? Was meinen Sie?</w:t>
+      </w:r>
+    </w:p>
+    <w:p>
+      <w:pPr>
+        <w:pStyle w:val="Normal"/>
+        <w:bidi w:val="0"/>
+        <w:jc w:val="start"/>
+        <w:rPr>
+          <w:lang w:val="de-DE"/>
+        </w:rPr>
+      </w:pPr>
+      <w:r>
+        <w:rPr>
+          <w:lang w:val="de-DE"/>
+        </w:rPr>
+        <w:t>15‘ Lesen Sie die Texte. Was lernen die Personen? Machen Sie eine Tabelle.</w:t>
+      </w:r>
+    </w:p>
+    <w:p>
+      <w:pPr>
+        <w:pStyle w:val="Normal"/>
+        <w:bidi w:val="0"/>
+        <w:jc w:val="start"/>
+        <w:rPr>
+          <w:lang w:val="de-DE"/>
+        </w:rPr>
+      </w:pPr>
+      <w:r>
+        <w:rPr>
+          <w:lang w:val="de-DE"/>
+        </w:rPr>
+        <w:t>20‘ Hörverstehen:</w:t>
+      </w:r>
+    </w:p>
+    <w:p>
+      <w:pPr>
+        <w:pStyle w:val="Normal"/>
+        <w:bidi w:val="0"/>
+        <w:jc w:val="start"/>
+        <w:rPr>
+          <w:lang w:val="de-DE"/>
+        </w:rPr>
+      </w:pPr>
+      <w:r>
+        <w:rPr>
+          <w:lang w:val="de-DE"/>
+        </w:rPr>
+        <w:t>Und die anderen Personen? Hören Sie und ergänzen Sie die Informationen in die Tabelle.</w:t>
+      </w:r>
+    </w:p>
+    <w:p>
+      <w:pPr>
+        <w:pStyle w:val="Normal"/>
+        <w:bidi w:val="0"/>
+        <w:jc w:val="start"/>
+        <w:rPr>
+          <w:lang w:val="de-DE"/>
+        </w:rPr>
+      </w:pPr>
+      <w:r>
+        <w:rPr>
+          <w:lang w:val="de-DE"/>
+        </w:rPr>
+        <w:t>10‘ Mündlicher Ausdruck:</w:t>
+      </w:r>
+    </w:p>
+    <w:p>
+      <w:pPr>
+        <w:pStyle w:val="Normal"/>
+        <w:bidi w:val="0"/>
+        <w:jc w:val="start"/>
+        <w:rPr>
+          <w:lang w:val="de-DE"/>
+        </w:rPr>
+      </w:pPr>
+      <w:r>
+        <w:rPr/>
+        <w:t>Sprechen Sie zu zweit. Machen Sie Notizen und berichten Sie im Kurs von Ihrem Partner / Ihrer Partnerin.</w:t>
+      </w:r>
+    </w:p>
+    <w:p>
+      <w:pPr>
+        <w:pStyle w:val="Normal"/>
+        <w:bidi w:val="0"/>
+        <w:jc w:val="start"/>
+        <w:rPr>
+          <w:lang w:val="de-DE"/>
+        </w:rPr>
+      </w:pPr>
+      <w:r>
+        <w:rPr>
+          <w:lang w:val="de-DE"/>
+        </w:rPr>
+      </w:r>
+    </w:p>
+    <w:p>
+      <w:pPr>
+        <w:pStyle w:val="Normal"/>
+        <w:bidi w:val="0"/>
+        <w:jc w:val="start"/>
+        <w:rPr>
+          <w:lang w:val="de-DE"/>
+        </w:rPr>
+      </w:pPr>
+      <w:r>
+        <w:rPr>
+          <w:lang w:val="de-DE"/>
+        </w:rPr>
+        <w:t>******************************************</w:t>
+      </w:r>
+    </w:p>
+    <w:p>
+      <w:pPr>
+        <w:pStyle w:val="Normal"/>
+        <w:bidi w:val="0"/>
+        <w:jc w:val="start"/>
+        <w:rPr>
+          <w:lang w:val="de-DE"/>
+        </w:rPr>
+      </w:pPr>
+      <w:r>
+        <w:rPr>
+          <w:lang w:val="de-DE"/>
+        </w:rPr>
+      </w:r>
+    </w:p>
     <w:p>
       <w:pPr>
         <w:pStyle w:val="Normal"/>
@@ -5134,12 +5753,12 @@
         <w:bidi w:val="0"/>
         <w:jc w:val="start"/>
         <w:rPr>
-          <w:lang w:val="de-DE"/>
-        </w:rPr>
-      </w:pPr>
-      <w:r>
-        <w:rPr>
-          <w:lang w:val="de-DE"/>
+          <w:lang w:val="de-DE" w:eastAsia="zh-CN" w:bidi="hi-IN"/>
+        </w:rPr>
+      </w:pPr>
+      <w:r>
+        <w:rPr>
+          <w:lang w:val="de-DE" w:eastAsia="zh-CN" w:bidi="hi-IN"/>
         </w:rPr>
         <w:t>Können</w:t>
       </w:r>
@@ -5240,7 +5859,7 @@
     </w:rPr>
   </w:style>
   <w:style w:type="paragraph" w:styleId="Caption">
-    <w:name w:val="caption"/>
+    <w:name w:val="Caption"/>
     <w:basedOn w:val="Normal"/>
     <w:qFormat/>
     <w:pPr>

</xml_diff>

<commit_message>
Se agregan nuevas líneas
</commit_message>
<xml_diff>
--- a/planesDeClaseSegundo.docx
+++ b/planesDeClaseSegundo.docx
@@ -46,7 +46,13 @@
         <w:rPr>
           <w:lang w:val="de-DE"/>
         </w:rPr>
-        <w:t>Dieser hier ist der erste Unterricht dieser Woche.</w:t>
+        <w:t xml:space="preserve">Dieser hier ist der erste Unterricht dieser Woche. </w:t>
+      </w:r>
+      <w:r>
+        <w:rPr>
+          <w:lang w:val="de-DE"/>
+        </w:rPr>
+        <w:t>Wir brauchen nur weitere 16 Stunden zu arbeiten.</w:t>
       </w:r>
     </w:p>
     <w:p>

</xml_diff>

<commit_message>
Agregados al plan de clase de segundo
</commit_message>
<xml_diff>
--- a/planesDeClaseSegundo.docx
+++ b/planesDeClaseSegundo.docx
@@ -140,7 +140,22 @@
         <w:rPr>
           <w:lang w:val="de-DE"/>
         </w:rPr>
-        <w:t>- Sehen Sie die Videos. Verbinden Sie die Informationen über Rebecca oder Ben</w:t>
+        <w:t xml:space="preserve">- Sehen Sie die </w:t>
+      </w:r>
+      <w:hyperlink r:id="rId2">
+        <w:r>
+          <w:rPr>
+            <w:rStyle w:val="Hyperlink"/>
+            <w:lang w:val="de-DE"/>
+          </w:rPr>
+          <w:t>Videos</w:t>
+        </w:r>
+      </w:hyperlink>
+      <w:r>
+        <w:rPr>
+          <w:lang w:val="de-DE"/>
+        </w:rPr>
+        <w:t>. Verbinden Sie die Informationen über Rebecca oder Ben</w:t>
       </w:r>
     </w:p>
     <w:p>
@@ -262,274 +277,274 @@
         </w:rPr>
       </w:pPr>
       <w:r>
+        <w:rPr>
+          <w:lang w:val="de-DE"/>
+        </w:rPr>
+      </w:r>
+    </w:p>
+    <w:p>
+      <w:pPr>
+        <w:pStyle w:val="Normal"/>
+        <w:bidi w:val="0"/>
+        <w:jc w:val="start"/>
+        <w:rPr>
+          <w:lang w:val="de-DE"/>
+        </w:rPr>
+      </w:pPr>
+      <w:r>
+        <w:rPr>
+          <w:lang w:val="de-DE"/>
+        </w:rPr>
+        <w:t>******************************************</w:t>
+      </w:r>
+    </w:p>
+    <w:p>
+      <w:pPr>
+        <w:pStyle w:val="Normal"/>
+        <w:bidi w:val="0"/>
+        <w:jc w:val="start"/>
+        <w:rPr>
+          <w:lang w:val="de-DE"/>
+        </w:rPr>
+      </w:pPr>
+      <w:r>
+        <w:rPr>
+          <w:lang w:val="de-DE"/>
+        </w:rPr>
+      </w:r>
+    </w:p>
+    <w:p>
+      <w:pPr>
+        <w:pStyle w:val="Normal"/>
+        <w:bidi w:val="0"/>
+        <w:jc w:val="start"/>
+        <w:rPr>
+          <w:lang w:val="de-DE"/>
+        </w:rPr>
+      </w:pPr>
+      <w:r>
+        <w:rPr>
+          <w:lang w:val="de-DE"/>
+        </w:rPr>
+        <w:t>Sechstes Niveau, sechste Woche, Freitag den 20.03.26</w:t>
+      </w:r>
+    </w:p>
+    <w:p>
+      <w:pPr>
+        <w:pStyle w:val="Normal"/>
+        <w:bidi w:val="0"/>
+        <w:jc w:val="start"/>
+        <w:rPr>
+          <w:lang w:val="de-DE"/>
+        </w:rPr>
+      </w:pPr>
+      <w:r>
+        <w:rPr>
+          <w:lang w:val="de-DE"/>
+        </w:rPr>
+      </w:r>
+    </w:p>
+    <w:p>
+      <w:pPr>
+        <w:pStyle w:val="Normal"/>
+        <w:bidi w:val="0"/>
+        <w:jc w:val="start"/>
+        <w:rPr>
+          <w:lang w:val="de-DE"/>
+        </w:rPr>
+      </w:pPr>
+      <w:r>
+        <w:rPr>
+          <w:lang w:val="de-DE"/>
+        </w:rPr>
+        <w:t>20‘ Die Kursteilnehmer tauschen ihre Rezensionen aus und lesen sie. Welche haben sie am besten gefunden?</w:t>
+      </w:r>
+    </w:p>
+    <w:p>
+      <w:pPr>
+        <w:pStyle w:val="Normal"/>
+        <w:bidi w:val="0"/>
+        <w:jc w:val="start"/>
+        <w:rPr>
+          <w:lang w:val="de-DE"/>
+        </w:rPr>
+      </w:pPr>
+      <w:r>
+        <w:rPr>
+          <w:lang w:val="de-DE"/>
+        </w:rPr>
+        <w:t>10‘ Die KT laden ihre Rezensionen auf unsere Classroom-Webseite auf.</w:t>
+      </w:r>
+    </w:p>
+    <w:p>
+      <w:pPr>
+        <w:pStyle w:val="Normal"/>
+        <w:bidi w:val="0"/>
+        <w:jc w:val="start"/>
+        <w:rPr>
+          <w:lang w:val="de-DE"/>
+        </w:rPr>
+      </w:pPr>
+      <w:r>
+        <w:rPr>
+          <w:lang w:val="de-DE"/>
+        </w:rPr>
+        <w:t>10‘ Haben Sie die Videos weiter gesehen? Was Interessantes haben sie herausgefunden?</w:t>
+      </w:r>
+    </w:p>
+    <w:p>
+      <w:pPr>
+        <w:pStyle w:val="Normal"/>
+        <w:bidi w:val="0"/>
+        <w:jc w:val="start"/>
+        <w:rPr>
+          <w:lang w:val="de-DE"/>
+        </w:rPr>
+      </w:pPr>
+      <w:r>
+        <w:rPr>
+          <w:lang w:val="de-DE"/>
+        </w:rPr>
+        <w:t>60‘ Fit für Lektion 9?</w:t>
+      </w:r>
+    </w:p>
+    <w:p>
+      <w:pPr>
+        <w:pStyle w:val="Normal"/>
+        <w:bidi w:val="0"/>
+        <w:jc w:val="start"/>
+        <w:rPr>
+          <w:lang w:val="de-DE"/>
+        </w:rPr>
+      </w:pPr>
+      <w:r>
+        <w:rPr>
+          <w:lang w:val="de-DE"/>
+        </w:rPr>
+        <w:t>- Die KT lesen „Kurz und klar“ und bewerten die Themen nach Beherschungsgrad.</w:t>
+      </w:r>
+    </w:p>
+    <w:p>
+      <w:pPr>
+        <w:pStyle w:val="Normal"/>
+        <w:bidi w:val="0"/>
+        <w:jc w:val="start"/>
+        <w:rPr>
+          <w:lang w:val="de-DE"/>
+        </w:rPr>
+      </w:pPr>
+      <w:r>
+        <w:rPr>
+          <w:lang w:val="de-DE"/>
+        </w:rPr>
+        <w:t>- Die KT machen die Übungen zu Lektion 8.</w:t>
+      </w:r>
+    </w:p>
+    <w:p>
+      <w:pPr>
+        <w:pStyle w:val="Normal"/>
+        <w:bidi w:val="0"/>
+        <w:jc w:val="start"/>
+        <w:rPr>
+          <w:lang w:val="de-DE"/>
+        </w:rPr>
+      </w:pPr>
+      <w:r>
+        <w:rPr>
+          <w:lang w:val="de-DE"/>
+        </w:rPr>
+        <w:t>20‘ Kahoot für Lektion 8.</w:t>
+      </w:r>
+    </w:p>
+    <w:p>
+      <w:pPr>
+        <w:pStyle w:val="Normal"/>
+        <w:bidi w:val="0"/>
+        <w:jc w:val="start"/>
+        <w:rPr>
+          <w:lang w:val="de-DE"/>
+        </w:rPr>
+      </w:pPr>
+      <w:r>
+        <w:rPr>
+          <w:lang w:val="de-DE"/>
+        </w:rPr>
+        <w:t>Zweites Niveau, sechste Woche, Mittwoch den 18.03.26</w:t>
+      </w:r>
+    </w:p>
+    <w:p>
+      <w:pPr>
+        <w:pStyle w:val="Normal"/>
+        <w:bidi w:val="0"/>
+        <w:jc w:val="start"/>
+        <w:rPr>
+          <w:lang w:val="de-DE"/>
+        </w:rPr>
+      </w:pPr>
+      <w:r>
+        <w:rPr>
+          <w:lang w:val="de-DE"/>
+        </w:rPr>
+      </w:r>
+    </w:p>
+    <w:p>
+      <w:pPr>
+        <w:pStyle w:val="Normal"/>
+        <w:bidi w:val="0"/>
+        <w:jc w:val="start"/>
+        <w:rPr>
+          <w:lang w:val="de-DE"/>
+        </w:rPr>
+      </w:pPr>
+      <w:r>
+        <w:rPr>
+          <w:lang w:val="de-DE"/>
+        </w:rPr>
+        <w:t>******************************************</w:t>
+      </w:r>
+    </w:p>
+    <w:p>
+      <w:pPr>
+        <w:pStyle w:val="Normal"/>
+        <w:bidi w:val="0"/>
+        <w:jc w:val="start"/>
+        <w:rPr>
+          <w:lang w:val="de-DE"/>
+        </w:rPr>
+      </w:pPr>
+      <w:r>
+        <w:rPr>
+          <w:lang w:val="de-DE"/>
+        </w:rPr>
+      </w:r>
+    </w:p>
+    <w:p>
+      <w:pPr>
+        <w:pStyle w:val="Normal"/>
+        <w:bidi w:val="0"/>
+        <w:jc w:val="start"/>
+        <w:rPr>
+          <w:lang w:val="de-DE"/>
+        </w:rPr>
+      </w:pPr>
+      <w:r>
         <w:rPr/>
-      </w:r>
-    </w:p>
-    <w:p>
-      <w:pPr>
-        <w:pStyle w:val="Normal"/>
-        <w:bidi w:val="0"/>
-        <w:jc w:val="start"/>
-        <w:rPr>
-          <w:lang w:val="de-DE"/>
-        </w:rPr>
-      </w:pPr>
-      <w:r>
-        <w:rPr>
-          <w:lang w:val="de-DE"/>
-        </w:rPr>
-        <w:t>******************************************</w:t>
-      </w:r>
-    </w:p>
-    <w:p>
-      <w:pPr>
-        <w:pStyle w:val="Normal"/>
-        <w:bidi w:val="0"/>
-        <w:jc w:val="start"/>
-        <w:rPr>
-          <w:lang w:val="de-DE"/>
-        </w:rPr>
-      </w:pPr>
-      <w:r>
-        <w:rPr>
-          <w:lang w:val="de-DE"/>
-        </w:rPr>
-      </w:r>
-    </w:p>
-    <w:p>
-      <w:pPr>
-        <w:pStyle w:val="Normal"/>
-        <w:bidi w:val="0"/>
-        <w:jc w:val="start"/>
-        <w:rPr>
-          <w:lang w:val="de-DE"/>
-        </w:rPr>
-      </w:pPr>
-      <w:r>
-        <w:rPr>
-          <w:lang w:val="de-DE"/>
-        </w:rPr>
-        <w:t>Sechstes Niveau, sechste Woche, Freitag den 20.03.26</w:t>
-      </w:r>
-    </w:p>
-    <w:p>
-      <w:pPr>
-        <w:pStyle w:val="Normal"/>
-        <w:bidi w:val="0"/>
-        <w:jc w:val="start"/>
-        <w:rPr>
-          <w:lang w:val="de-DE"/>
-        </w:rPr>
-      </w:pPr>
-      <w:r>
-        <w:rPr>
-          <w:lang w:val="de-DE"/>
-        </w:rPr>
-      </w:r>
-    </w:p>
-    <w:p>
-      <w:pPr>
-        <w:pStyle w:val="Normal"/>
-        <w:bidi w:val="0"/>
-        <w:jc w:val="start"/>
-        <w:rPr>
-          <w:lang w:val="de-DE"/>
-        </w:rPr>
-      </w:pPr>
-      <w:r>
-        <w:rPr>
-          <w:lang w:val="de-DE"/>
-        </w:rPr>
-        <w:t>20‘ Die Kursteilnehmer tauschen ihre Rezensionen aus und lesen sie. Welche haben sie am besten gefunden?</w:t>
-      </w:r>
-    </w:p>
-    <w:p>
-      <w:pPr>
-        <w:pStyle w:val="Normal"/>
-        <w:bidi w:val="0"/>
-        <w:jc w:val="start"/>
-        <w:rPr>
-          <w:lang w:val="de-DE"/>
-        </w:rPr>
-      </w:pPr>
-      <w:r>
-        <w:rPr>
-          <w:lang w:val="de-DE"/>
-        </w:rPr>
-        <w:t>10‘ Die KT laden ihre Rezensionen auf unsere Classroom-Webseite auf.</w:t>
-      </w:r>
-    </w:p>
-    <w:p>
-      <w:pPr>
-        <w:pStyle w:val="Normal"/>
-        <w:bidi w:val="0"/>
-        <w:jc w:val="start"/>
-        <w:rPr>
-          <w:lang w:val="de-DE"/>
-        </w:rPr>
-      </w:pPr>
-      <w:r>
-        <w:rPr>
-          <w:lang w:val="de-DE"/>
-        </w:rPr>
-        <w:t>10‘ Haben Sie die Videos weiter gesehen? Was Interessantes haben sie herausgefunden?</w:t>
-      </w:r>
-    </w:p>
-    <w:p>
-      <w:pPr>
-        <w:pStyle w:val="Normal"/>
-        <w:bidi w:val="0"/>
-        <w:jc w:val="start"/>
-        <w:rPr>
-          <w:lang w:val="de-DE"/>
-        </w:rPr>
-      </w:pPr>
-      <w:r>
-        <w:rPr>
-          <w:lang w:val="de-DE"/>
-        </w:rPr>
-        <w:t>60‘ Fit für Lektion 9?</w:t>
-      </w:r>
-    </w:p>
-    <w:p>
-      <w:pPr>
-        <w:pStyle w:val="Normal"/>
-        <w:bidi w:val="0"/>
-        <w:jc w:val="start"/>
-        <w:rPr>
-          <w:lang w:val="de-DE"/>
-        </w:rPr>
-      </w:pPr>
-      <w:r>
-        <w:rPr>
-          <w:lang w:val="de-DE"/>
-        </w:rPr>
-        <w:t>- Die KT lesen „Kurz und klar“ und bewerten die Themen nach Beherschungsgrad.</w:t>
-      </w:r>
-    </w:p>
-    <w:p>
-      <w:pPr>
-        <w:pStyle w:val="Normal"/>
-        <w:bidi w:val="0"/>
-        <w:jc w:val="start"/>
-        <w:rPr>
-          <w:lang w:val="de-DE"/>
-        </w:rPr>
-      </w:pPr>
-      <w:r>
-        <w:rPr>
-          <w:lang w:val="de-DE"/>
-        </w:rPr>
-        <w:t>- Die KT machen die Übungen zu Lektion 8.</w:t>
-      </w:r>
-    </w:p>
-    <w:p>
-      <w:pPr>
-        <w:pStyle w:val="Normal"/>
-        <w:bidi w:val="0"/>
-        <w:jc w:val="start"/>
-        <w:rPr>
-          <w:lang w:val="de-DE"/>
-        </w:rPr>
-      </w:pPr>
-      <w:r>
-        <w:rPr>
-          <w:lang w:val="de-DE"/>
-        </w:rPr>
-        <w:t>20‘ Kahoot für Lektion 8.</w:t>
-      </w:r>
-    </w:p>
-    <w:p>
-      <w:pPr>
-        <w:pStyle w:val="Normal"/>
-        <w:bidi w:val="0"/>
-        <w:jc w:val="start"/>
-        <w:rPr>
-          <w:lang w:val="de-DE"/>
-        </w:rPr>
-      </w:pPr>
-      <w:r>
-        <w:rPr>
-          <w:lang w:val="de-DE"/>
-        </w:rPr>
-        <w:t>Zweites Niveau, sechste Woche, Mittwoch den 18.03.26</w:t>
-      </w:r>
-    </w:p>
-    <w:p>
-      <w:pPr>
-        <w:pStyle w:val="Normal"/>
-        <w:bidi w:val="0"/>
-        <w:jc w:val="start"/>
-        <w:rPr>
-          <w:lang w:val="de-DE"/>
-        </w:rPr>
-      </w:pPr>
-      <w:r>
-        <w:rPr>
-          <w:lang w:val="de-DE"/>
-        </w:rPr>
-      </w:r>
-    </w:p>
-    <w:p>
-      <w:pPr>
-        <w:pStyle w:val="Normal"/>
-        <w:bidi w:val="0"/>
-        <w:jc w:val="start"/>
-        <w:rPr>
-          <w:lang w:val="de-DE"/>
-        </w:rPr>
-      </w:pPr>
-      <w:r>
-        <w:rPr>
-          <w:lang w:val="de-DE"/>
-        </w:rPr>
-        <w:t>******************************************</w:t>
-      </w:r>
-    </w:p>
-    <w:p>
-      <w:pPr>
-        <w:pStyle w:val="Normal"/>
-        <w:bidi w:val="0"/>
-        <w:jc w:val="start"/>
-        <w:rPr>
-          <w:lang w:val="de-DE"/>
-        </w:rPr>
-      </w:pPr>
-      <w:r>
-        <w:rPr>
-          <w:lang w:val="de-DE"/>
-        </w:rPr>
-      </w:r>
-    </w:p>
-    <w:p>
-      <w:pPr>
-        <w:pStyle w:val="Normal"/>
-        <w:bidi w:val="0"/>
-        <w:jc w:val="start"/>
-        <w:rPr>
-          <w:lang w:val="de-DE"/>
-        </w:rPr>
-      </w:pPr>
-      <w:r>
-        <w:rPr/>
-        <w:t xml:space="preserve">Viertes </w:t>
-      </w:r>
-      <w:r>
-        <w:rPr/>
-        <w:t>Niveau, sechste Woche, Freitag den 20.03.26</w:t>
-      </w:r>
-    </w:p>
-    <w:p>
-      <w:pPr>
-        <w:pStyle w:val="Normal"/>
-        <w:bidi w:val="0"/>
-        <w:jc w:val="start"/>
-        <w:rPr>
-          <w:lang w:val="de-DE"/>
-        </w:rPr>
-      </w:pPr>
-      <w:r>
-        <w:rPr/>
+        <w:t>Viertes Niveau, sechste Woche, Freitag den 20.03.26</w:t>
+      </w:r>
+    </w:p>
+    <w:p>
+      <w:pPr>
+        <w:pStyle w:val="Normal"/>
+        <w:bidi w:val="0"/>
+        <w:jc w:val="start"/>
+        <w:rPr>
+          <w:lang w:val="de-DE"/>
+        </w:rPr>
+      </w:pPr>
+      <w:r>
+        <w:rPr>
+          <w:lang w:val="de-DE"/>
+        </w:rPr>
       </w:r>
     </w:p>
     <w:p>
@@ -2242,7 +2257,7 @@
         </w:rPr>
         <w:t xml:space="preserve">11b Hören Sie die </w:t>
       </w:r>
-      <w:hyperlink r:id="rId2">
+      <w:hyperlink r:id="rId3">
         <w:r>
           <w:rPr>
             <w:rStyle w:val="Hyperlink"/>

</xml_diff>

<commit_message>
Clases de lunes 23 de marzo
</commit_message>
<xml_diff>
--- a/planesDeClaseSegundo.docx
+++ b/planesDeClaseSegundo.docx
@@ -1,6 +1,6 @@
 
 <file path=word/document.xml><?xml version="1.0" encoding="utf-8"?>
-<w:document xmlns:o="urn:schemas-microsoft-com:office:office" xmlns:r="http://schemas.openxmlformats.org/officeDocument/2006/relationships" xmlns:v="urn:schemas-microsoft-com:vml" xmlns:w="http://schemas.openxmlformats.org/wordprocessingml/2006/main" xmlns:w10="urn:schemas-microsoft-com:office:word" xmlns:wp="http://schemas.openxmlformats.org/drawingml/2006/wordprocessingDrawing" xmlns:wps="http://schemas.microsoft.com/office/word/2010/wordprocessingShape" xmlns:wpg="http://schemas.microsoft.com/office/word/2010/wordprocessingGroup" xmlns:mc="http://schemas.openxmlformats.org/markup-compatibility/2006" xmlns:wp14="http://schemas.microsoft.com/office/word/2010/wordprocessingDrawing" xmlns:w14="http://schemas.microsoft.com/office/word/2010/wordml" xmlns:w15="http://schemas.microsoft.com/office/word/2012/wordml" mc:Ignorable="w14 wp14 w15">
+<w:document xmlns:o="urn:schemas-microsoft-com:office:office" xmlns:r="http://schemas.openxmlformats.org/officeDocument/2006/relationships" xmlns:v="urn:schemas-microsoft-com:vml" xmlns:w="http://schemas.openxmlformats.org/wordprocessingml/2006/main" xmlns:w10="urn:schemas-microsoft-com:office:word" xmlns:wp="http://schemas.openxmlformats.org/drawingml/2006/wordprocessingDrawing" xmlns:pic="http://schemas.openxmlformats.org/drawingml/2006/picture" xmlns:wps="http://schemas.microsoft.com/office/word/2010/wordprocessingShape" xmlns:wpg="http://schemas.microsoft.com/office/word/2010/wordprocessingGroup" xmlns:mc="http://schemas.openxmlformats.org/markup-compatibility/2006" xmlns:wp14="http://schemas.microsoft.com/office/word/2010/wordprocessingDrawing" xmlns:w14="http://schemas.microsoft.com/office/word/2010/wordml" xmlns:w15="http://schemas.microsoft.com/office/word/2012/wordml" mc:Ignorable="w14 wp14 w15">
   <w:body>
     <w:p>
       <w:pPr>
@@ -15,6 +15,324 @@
         <w:rPr>
           <w:lang w:val="de-DE"/>
         </w:rPr>
+        <w:t>******************************************</w:t>
+      </w:r>
+    </w:p>
+    <w:p>
+      <w:pPr>
+        <w:pStyle w:val="Normal"/>
+        <w:bidi w:val="0"/>
+        <w:jc w:val="start"/>
+        <w:rPr>
+          <w:lang w:val="de-DE"/>
+        </w:rPr>
+      </w:pPr>
+      <w:r>
+        <w:rPr>
+          <w:lang w:val="de-DE"/>
+        </w:rPr>
+      </w:r>
+    </w:p>
+    <w:p>
+      <w:pPr>
+        <w:pStyle w:val="Normal"/>
+        <w:bidi w:val="0"/>
+        <w:jc w:val="start"/>
+        <w:rPr>
+          <w:lang w:val="de-DE"/>
+        </w:rPr>
+      </w:pPr>
+      <w:r>
+        <w:rPr/>
+        <w:t>Zweites Niveau, sechste Woche, Montag den 23.03.26</w:t>
+      </w:r>
+    </w:p>
+    <w:p>
+      <w:pPr>
+        <w:pStyle w:val="Normal"/>
+        <w:bidi w:val="0"/>
+        <w:jc w:val="start"/>
+        <w:rPr>
+          <w:lang w:val="de-DE"/>
+        </w:rPr>
+      </w:pPr>
+      <w:r>
+        <w:rPr>
+          <w:lang w:val="de-DE"/>
+        </w:rPr>
+      </w:r>
+    </w:p>
+    <w:p>
+      <w:pPr>
+        <w:pStyle w:val="Normal"/>
+        <w:bidi w:val="0"/>
+        <w:jc w:val="start"/>
+        <w:rPr>
+          <w:lang w:val="de-DE"/>
+        </w:rPr>
+      </w:pPr>
+      <w:r>
+        <w:rPr/>
+        <w:t xml:space="preserve">30‘ Die Übungen, die die KT als Wiederholung von Lektion 11 gemacht haben werden </w:t>
+      </w:r>
+      <w:r>
+        <w:rPr>
+          <w:lang w:val="de-DE"/>
+        </w:rPr>
+        <w:t>gecheckt. Haben Sie noch Fragen?</w:t>
+      </w:r>
+    </w:p>
+    <w:p>
+      <w:pPr>
+        <w:pStyle w:val="Normal"/>
+        <w:bidi w:val="0"/>
+        <w:jc w:val="start"/>
+        <w:rPr>
+          <w:lang w:val="de-DE"/>
+        </w:rPr>
+      </w:pPr>
+      <w:r>
+        <w:rPr>
+          <w:lang w:val="de-DE"/>
+        </w:rPr>
+        <w:t>3</w:t>
+      </w:r>
+      <w:r>
+        <w:rPr>
+          <w:lang w:val="de-DE"/>
+        </w:rPr>
+        <w:t>0‘ Lebensmittel:</w:t>
+      </w:r>
+    </w:p>
+    <w:p>
+      <w:pPr>
+        <w:pStyle w:val="Normal"/>
+        <w:bidi w:val="0"/>
+        <w:jc w:val="start"/>
+        <w:rPr>
+          <w:lang w:val="de-DE"/>
+        </w:rPr>
+      </w:pPr>
+      <w:r>
+        <w:rPr>
+          <w:lang w:val="de-DE"/>
+        </w:rPr>
+        <w:t xml:space="preserve">- </w:t>
+      </w:r>
+      <w:r>
+        <w:rPr>
+          <w:lang w:val="de-DE"/>
+        </w:rPr>
+        <w:t>Ordnen Sie die Lebensmittel zu</w:t>
+      </w:r>
+    </w:p>
+    <w:p>
+      <w:pPr>
+        <w:pStyle w:val="Normal"/>
+        <w:bidi w:val="0"/>
+        <w:jc w:val="start"/>
+        <w:rPr>
+          <w:lang w:val="de-DE"/>
+        </w:rPr>
+      </w:pPr>
+      <w:r>
+        <w:rPr>
+          <w:lang w:val="de-DE"/>
+        </w:rPr>
+        <w:t xml:space="preserve">- </w:t>
+      </w:r>
+      <w:r>
+        <w:rPr>
+          <w:lang w:val="de-DE"/>
+        </w:rPr>
+        <w:t>Ergänzen Sie weitere Lebensmittel aus den Einheiten 3 und 4.</w:t>
+      </w:r>
+    </w:p>
+    <w:p>
+      <w:pPr>
+        <w:pStyle w:val="Normal"/>
+        <w:bidi w:val="0"/>
+        <w:jc w:val="start"/>
+        <w:rPr>
+          <w:lang w:val="de-DE"/>
+        </w:rPr>
+      </w:pPr>
+      <w:r>
+        <w:rPr>
+          <w:lang w:val="de-DE"/>
+        </w:rPr>
+        <w:t>10‘ Paprika mag ich nicht. Kommentieren Sie: „Eier mag ich nicht.“ / „Ich mag keine Gemüse.“</w:t>
+      </w:r>
+    </w:p>
+    <w:p>
+      <w:pPr>
+        <w:pStyle w:val="Normal"/>
+        <w:bidi w:val="0"/>
+        <w:jc w:val="start"/>
+        <w:rPr>
+          <w:lang w:val="de-DE"/>
+        </w:rPr>
+      </w:pPr>
+      <w:r>
+        <w:rPr>
+          <w:lang w:val="de-DE"/>
+        </w:rPr>
+        <w:t>15‘ Gruppenarbeit. Eine Einkaufsliste schreiben. Was brauchen Sie?</w:t>
+      </w:r>
+    </w:p>
+    <w:p>
+      <w:pPr>
+        <w:pStyle w:val="Normal"/>
+        <w:bidi w:val="0"/>
+        <w:jc w:val="start"/>
+        <w:rPr>
+          <w:lang w:val="de-DE"/>
+        </w:rPr>
+      </w:pPr>
+      <w:r>
+        <w:rPr>
+          <w:lang w:val="de-DE"/>
+        </w:rPr>
+        <w:t>10‘ Wechselspiel. Im Supermarkt. „Hast du schon?“ Ja, das habe ich schon / Nein, das habe ich noch nicht.</w:t>
+      </w:r>
+    </w:p>
+    <w:p>
+      <w:pPr>
+        <w:pStyle w:val="Normal"/>
+        <w:bidi w:val="0"/>
+        <w:jc w:val="start"/>
+        <w:rPr>
+          <w:lang w:val="de-DE"/>
+        </w:rPr>
+      </w:pPr>
+      <w:r>
+        <w:rPr>
+          <w:lang w:val="de-DE"/>
+        </w:rPr>
+        <w:t>20‘ Lektüre: Schoppen ohne schleppen.</w:t>
+      </w:r>
+    </w:p>
+    <w:p>
+      <w:pPr>
+        <w:pStyle w:val="Normal"/>
+        <w:bidi w:val="0"/>
+        <w:jc w:val="start"/>
+        <w:rPr>
+          <w:lang w:val="de-DE"/>
+        </w:rPr>
+      </w:pPr>
+      <w:r>
+        <w:rPr>
+          <w:lang w:val="de-DE"/>
+        </w:rPr>
+        <w:t>15‘ Wir sehen uns Videos von Personen beim Schoppen an.</w:t>
+      </w:r>
+    </w:p>
+    <w:p>
+      <w:pPr>
+        <w:pStyle w:val="Normal"/>
+        <w:bidi w:val="0"/>
+        <w:jc w:val="start"/>
+        <w:rPr>
+          <w:lang w:val="de-DE"/>
+        </w:rPr>
+      </w:pPr>
+      <w:r>
+        <w:rPr>
+          <w:lang w:val="de-DE"/>
+        </w:rPr>
+        <w:t>HAG: Vokabeln Lernen</w:t>
+      </w:r>
+    </w:p>
+    <w:p>
+      <w:pPr>
+        <w:pStyle w:val="Normal"/>
+        <w:bidi w:val="0"/>
+        <w:jc w:val="start"/>
+        <w:rPr>
+          <w:lang w:val="de-DE"/>
+        </w:rPr>
+      </w:pPr>
+      <w:r>
+        <w:rPr>
+          <w:lang w:val="de-DE"/>
+        </w:rPr>
+      </w:r>
+    </w:p>
+    <w:p>
+      <w:pPr>
+        <w:pStyle w:val="Normal"/>
+        <w:bidi w:val="0"/>
+        <w:jc w:val="start"/>
+        <w:rPr>
+          <w:lang w:val="de-DE"/>
+        </w:rPr>
+      </w:pPr>
+      <w:r>
+        <w:rPr>
+          <w:lang w:val="de-DE"/>
+        </w:rPr>
+        <w:t>******************************************</w:t>
+      </w:r>
+    </w:p>
+    <w:p>
+      <w:pPr>
+        <w:pStyle w:val="Normal"/>
+        <w:bidi w:val="0"/>
+        <w:jc w:val="start"/>
+        <w:rPr>
+          <w:lang w:val="de-DE"/>
+        </w:rPr>
+      </w:pPr>
+      <w:r>
+        <w:rPr>
+          <w:lang w:val="de-DE"/>
+        </w:rPr>
+      </w:r>
+    </w:p>
+    <w:p>
+      <w:pPr>
+        <w:pStyle w:val="Normal"/>
+        <w:bidi w:val="0"/>
+        <w:jc w:val="start"/>
+        <w:rPr>
+          <w:lang w:val="de-DE"/>
+        </w:rPr>
+      </w:pPr>
+      <w:r>
+        <w:rPr/>
+        <w:t>Sechstes</w:t>
+      </w:r>
+      <w:r>
+        <w:rPr/>
+        <w:t xml:space="preserve"> Niveau, sechste Woche, Montag den 23.03.26</w:t>
+      </w:r>
+    </w:p>
+    <w:p>
+      <w:pPr>
+        <w:pStyle w:val="Normal"/>
+        <w:bidi w:val="0"/>
+        <w:jc w:val="start"/>
+        <w:rPr>
+          <w:lang w:val="de-DE"/>
+        </w:rPr>
+      </w:pPr>
+      <w:r>
+        <w:rPr/>
+      </w:r>
+    </w:p>
+    <w:p>
+      <w:pPr>
+        <w:pStyle w:val="Normal"/>
+        <w:bidi w:val="0"/>
+        <w:jc w:val="start"/>
+        <w:rPr>
+          <w:lang w:val="de-DE"/>
+        </w:rPr>
+      </w:pPr>
+      <w:r>
+        <w:rPr/>
+        <w:t>10‘ Begrüßungen. Haben die KT die Themen wiederholt, bei denen sie voriges Mal</w:t>
       </w:r>
     </w:p>
     <w:p>
@@ -7072,7 +7390,7 @@
     </w:rPr>
   </w:style>
   <w:style w:type="paragraph" w:styleId="Caption">
-    <w:name w:val="Caption"/>
+    <w:name w:val="caption"/>
     <w:basedOn w:val="Normal"/>
     <w:qFormat/>
     <w:pPr>

</xml_diff>

<commit_message>
Nuevos apuntes a planes de clase 23 de marzo
</commit_message>
<xml_diff>
--- a/planesDeClaseSegundo.docx
+++ b/planesDeClaseSegundo.docx
@@ -1,6 +1,6 @@
 
 <file path=word/document.xml><?xml version="1.0" encoding="utf-8"?>
-<w:document xmlns:o="urn:schemas-microsoft-com:office:office" xmlns:r="http://schemas.openxmlformats.org/officeDocument/2006/relationships" xmlns:v="urn:schemas-microsoft-com:vml" xmlns:w="http://schemas.openxmlformats.org/wordprocessingml/2006/main" xmlns:w10="urn:schemas-microsoft-com:office:word" xmlns:wp="http://schemas.openxmlformats.org/drawingml/2006/wordprocessingDrawing" xmlns:pic="http://schemas.openxmlformats.org/drawingml/2006/picture" xmlns:wps="http://schemas.microsoft.com/office/word/2010/wordprocessingShape" xmlns:wpg="http://schemas.microsoft.com/office/word/2010/wordprocessingGroup" xmlns:mc="http://schemas.openxmlformats.org/markup-compatibility/2006" xmlns:wp14="http://schemas.microsoft.com/office/word/2010/wordprocessingDrawing" xmlns:w14="http://schemas.microsoft.com/office/word/2010/wordml" xmlns:w15="http://schemas.microsoft.com/office/word/2012/wordml" mc:Ignorable="w14 wp14 w15">
+<w:document xmlns:o="urn:schemas-microsoft-com:office:office" xmlns:r="http://schemas.openxmlformats.org/officeDocument/2006/relationships" xmlns:v="urn:schemas-microsoft-com:vml" xmlns:w="http://schemas.openxmlformats.org/wordprocessingml/2006/main" xmlns:w10="urn:schemas-microsoft-com:office:word" xmlns:wp="http://schemas.openxmlformats.org/drawingml/2006/wordprocessingDrawing" xmlns:wps="http://schemas.microsoft.com/office/word/2010/wordprocessingShape" xmlns:wpg="http://schemas.microsoft.com/office/word/2010/wordprocessingGroup" xmlns:mc="http://schemas.openxmlformats.org/markup-compatibility/2006" xmlns:wp14="http://schemas.microsoft.com/office/word/2010/wordprocessingDrawing" xmlns:w14="http://schemas.microsoft.com/office/word/2010/wordml" xmlns:w15="http://schemas.microsoft.com/office/word/2012/wordml" mc:Ignorable="w14 wp14 w15">
   <w:body>
     <w:p>
       <w:pPr>
@@ -95,57 +95,39 @@
         <w:rPr>
           <w:lang w:val="de-DE"/>
         </w:rPr>
-        <w:t>3</w:t>
-      </w:r>
-      <w:r>
-        <w:rPr>
-          <w:lang w:val="de-DE"/>
-        </w:rPr>
-        <w:t>0‘ Lebensmittel:</w:t>
-      </w:r>
-    </w:p>
-    <w:p>
-      <w:pPr>
-        <w:pStyle w:val="Normal"/>
-        <w:bidi w:val="0"/>
-        <w:jc w:val="start"/>
-        <w:rPr>
-          <w:lang w:val="de-DE"/>
-        </w:rPr>
-      </w:pPr>
-      <w:r>
-        <w:rPr>
-          <w:lang w:val="de-DE"/>
-        </w:rPr>
-        <w:t xml:space="preserve">- </w:t>
-      </w:r>
-      <w:r>
-        <w:rPr>
-          <w:lang w:val="de-DE"/>
-        </w:rPr>
-        <w:t>Ordnen Sie die Lebensmittel zu</w:t>
-      </w:r>
-    </w:p>
-    <w:p>
-      <w:pPr>
-        <w:pStyle w:val="Normal"/>
-        <w:bidi w:val="0"/>
-        <w:jc w:val="start"/>
-        <w:rPr>
-          <w:lang w:val="de-DE"/>
-        </w:rPr>
-      </w:pPr>
-      <w:r>
-        <w:rPr>
-          <w:lang w:val="de-DE"/>
-        </w:rPr>
-        <w:t xml:space="preserve">- </w:t>
-      </w:r>
-      <w:r>
-        <w:rPr>
-          <w:lang w:val="de-DE"/>
-        </w:rPr>
-        <w:t>Ergänzen Sie weitere Lebensmittel aus den Einheiten 3 und 4.</w:t>
+        <w:t>30‘ Lebensmittel:</w:t>
+      </w:r>
+    </w:p>
+    <w:p>
+      <w:pPr>
+        <w:pStyle w:val="Normal"/>
+        <w:bidi w:val="0"/>
+        <w:jc w:val="start"/>
+        <w:rPr>
+          <w:lang w:val="de-DE"/>
+        </w:rPr>
+      </w:pPr>
+      <w:r>
+        <w:rPr>
+          <w:lang w:val="de-DE"/>
+        </w:rPr>
+        <w:t>- Ordnen Sie die Lebensmittel zu</w:t>
+      </w:r>
+    </w:p>
+    <w:p>
+      <w:pPr>
+        <w:pStyle w:val="Normal"/>
+        <w:bidi w:val="0"/>
+        <w:jc w:val="start"/>
+        <w:rPr>
+          <w:lang w:val="de-DE"/>
+        </w:rPr>
+      </w:pPr>
+      <w:r>
+        <w:rPr>
+          <w:lang w:val="de-DE"/>
+        </w:rPr>
+        <w:t>- Ergänzen Sie weitere Lebensmittel aus den Einheiten 3 und 4.</w:t>
       </w:r>
     </w:p>
     <w:p>
@@ -301,24 +283,22 @@
       </w:pPr>
       <w:r>
         <w:rPr/>
-        <w:t>Sechstes</w:t>
-      </w:r>
-      <w:r>
-        <w:rPr/>
-        <w:t xml:space="preserve"> Niveau, sechste Woche, Montag den 23.03.26</w:t>
-      </w:r>
-    </w:p>
-    <w:p>
-      <w:pPr>
-        <w:pStyle w:val="Normal"/>
-        <w:bidi w:val="0"/>
-        <w:jc w:val="start"/>
-        <w:rPr>
-          <w:lang w:val="de-DE"/>
-        </w:rPr>
-      </w:pPr>
-      <w:r>
-        <w:rPr/>
+        <w:t>Sechstes Niveau, sechste Woche, Montag den 23.03.26</w:t>
+      </w:r>
+    </w:p>
+    <w:p>
+      <w:pPr>
+        <w:pStyle w:val="Normal"/>
+        <w:bidi w:val="0"/>
+        <w:jc w:val="start"/>
+        <w:rPr>
+          <w:lang w:val="de-DE"/>
+        </w:rPr>
+      </w:pPr>
+      <w:r>
+        <w:rPr>
+          <w:lang w:val="de-DE"/>
+        </w:rPr>
       </w:r>
     </w:p>
     <w:p>
@@ -334,6 +314,168 @@
         <w:rPr/>
         <w:t>10‘ Begrüßungen. Haben die KT die Themen wiederholt, bei denen sie voriges Mal</w:t>
       </w:r>
+      <w:r>
+        <w:rPr>
+          <w:lang w:val="de-DE"/>
+        </w:rPr>
+        <w:t xml:space="preserve"> </w:t>
+      </w:r>
+      <w:r>
+        <w:rPr>
+          <w:lang w:val="de-DE"/>
+        </w:rPr>
+        <w:t>Probleme hatten?</w:t>
+      </w:r>
+    </w:p>
+    <w:p>
+      <w:pPr>
+        <w:pStyle w:val="Normal"/>
+        <w:bidi w:val="0"/>
+        <w:jc w:val="start"/>
+        <w:rPr>
+          <w:lang w:val="de-DE"/>
+        </w:rPr>
+      </w:pPr>
+      <w:r>
+        <w:rPr/>
+      </w:r>
+    </w:p>
+    <w:p>
+      <w:pPr>
+        <w:pStyle w:val="Normal"/>
+        <w:bidi w:val="0"/>
+        <w:jc w:val="start"/>
+        <w:rPr>
+          <w:lang w:val="de-DE"/>
+        </w:rPr>
+      </w:pPr>
+      <w:r>
+        <w:rPr>
+          <w:lang w:val="de-DE"/>
+        </w:rPr>
+        <w:t>Einleitung in Lektion 9 „Kunststücke“.</w:t>
+      </w:r>
+    </w:p>
+    <w:p>
+      <w:pPr>
+        <w:pStyle w:val="Normal"/>
+        <w:bidi w:val="0"/>
+        <w:jc w:val="start"/>
+        <w:rPr>
+          <w:lang w:val="de-DE"/>
+        </w:rPr>
+      </w:pPr>
+      <w:r>
+        <w:rPr>
+          <w:lang w:val="de-DE"/>
+        </w:rPr>
+        <w:t>10‘</w:t>
+      </w:r>
+      <w:r>
+        <w:rPr>
+          <w:lang w:val="de-DE"/>
+        </w:rPr>
+        <w:t>- Kunst und Kultur in Innsbruck. Sehen Sie die Fotos an. Was gefällt Ihnen am besten? Was gefällt Ihnen nicht? Warum?</w:t>
+      </w:r>
+    </w:p>
+    <w:p>
+      <w:pPr>
+        <w:pStyle w:val="Normal"/>
+        <w:bidi w:val="0"/>
+        <w:jc w:val="start"/>
+        <w:rPr>
+          <w:lang w:val="de-DE"/>
+        </w:rPr>
+      </w:pPr>
+      <w:r>
+        <w:rPr>
+          <w:lang w:val="de-DE"/>
+        </w:rPr>
+        <w:t>20‘</w:t>
+      </w:r>
+      <w:r>
+        <w:rPr>
+          <w:lang w:val="de-DE"/>
+        </w:rPr>
+        <w:t xml:space="preserve"> Arbeiten Sie zu fünft. Jeder liest einen Eintrag aus Marias Kunstblog. Was für ein Kunstwerk ist das?</w:t>
+      </w:r>
+    </w:p>
+    <w:p>
+      <w:pPr>
+        <w:pStyle w:val="Normal"/>
+        <w:bidi w:val="0"/>
+        <w:jc w:val="start"/>
+        <w:rPr>
+          <w:lang w:val="de-DE"/>
+        </w:rPr>
+      </w:pPr>
+      <w:r>
+        <w:rPr>
+          <w:lang w:val="de-DE"/>
+        </w:rPr>
+        <w:t>20‘ Hören Sie eine Radioumfrage. Was gefällt den Personen besonders gut und warum? Notieren Sie</w:t>
+      </w:r>
+    </w:p>
+    <w:p>
+      <w:pPr>
+        <w:pStyle w:val="Normal"/>
+        <w:bidi w:val="0"/>
+        <w:jc w:val="start"/>
+        <w:rPr>
+          <w:lang w:val="de-DE"/>
+        </w:rPr>
+      </w:pPr>
+      <w:r>
+        <w:rPr>
+          <w:lang w:val="de-DE"/>
+        </w:rPr>
+        <w:t>30‘ Recherchieren Sie ein weiteres Kunstobjekt in Innsbruck oder einer anderen Stadt in Österreich und stellen Sie es kurz vor.</w:t>
+      </w:r>
+    </w:p>
+    <w:p>
+      <w:pPr>
+        <w:pStyle w:val="Normal"/>
+        <w:bidi w:val="0"/>
+        <w:jc w:val="start"/>
+        <w:rPr>
+          <w:lang w:val="de-DE"/>
+        </w:rPr>
+      </w:pPr>
+      <w:r>
+        <w:rPr>
+          <w:lang w:val="de-DE"/>
+        </w:rPr>
+        <w:t>20‘ Sind sie heute schon Kunst begegnet? Was haben Sie auf dem Weg zum Kurs gesehen (Gebäude, Graffiti, Statuen ...)? Schreiben Sie einen kurzen Text.</w:t>
+      </w:r>
+    </w:p>
+    <w:p>
+      <w:pPr>
+        <w:pStyle w:val="Normal"/>
+        <w:bidi w:val="0"/>
+        <w:jc w:val="start"/>
+        <w:rPr>
+          <w:lang w:val="de-DE"/>
+        </w:rPr>
+      </w:pPr>
+      <w:r>
+        <w:rPr>
+          <w:lang w:val="de-DE"/>
+        </w:rPr>
+        <w:t>10‘ Welche neuen Vokabeln haben wir heute gelernt?</w:t>
+      </w:r>
+    </w:p>
+    <w:p>
+      <w:pPr>
+        <w:pStyle w:val="Normal"/>
+        <w:bidi w:val="0"/>
+        <w:jc w:val="start"/>
+        <w:rPr>
+          <w:lang w:val="de-DE"/>
+        </w:rPr>
+      </w:pPr>
+      <w:r>
+        <w:rPr/>
+      </w:r>
     </w:p>
     <w:p>
       <w:pPr>
@@ -364,6 +506,55 @@
         <w:rPr>
           <w:lang w:val="de-DE"/>
         </w:rPr>
+        <w:t xml:space="preserve">Viertes </w:t>
+      </w:r>
+      <w:r>
+        <w:rPr>
+          <w:lang w:val="de-DE"/>
+        </w:rPr>
+        <w:t>Niveau, sechste Woche, Montag den 23.03.26</w:t>
+      </w:r>
+    </w:p>
+    <w:p>
+      <w:pPr>
+        <w:pStyle w:val="Normal"/>
+        <w:bidi w:val="0"/>
+        <w:jc w:val="start"/>
+        <w:rPr>
+          <w:lang w:val="de-DE"/>
+        </w:rPr>
+      </w:pPr>
+      <w:r>
+        <w:rPr/>
+      </w:r>
+    </w:p>
+    <w:p>
+      <w:pPr>
+        <w:pStyle w:val="Normal"/>
+        <w:bidi w:val="0"/>
+        <w:jc w:val="start"/>
+        <w:rPr>
+          <w:lang w:val="de-DE"/>
+        </w:rPr>
+      </w:pPr>
+      <w:r>
+        <w:rPr/>
+      </w:r>
+    </w:p>
+    <w:p>
+      <w:pPr>
+        <w:pStyle w:val="Normal"/>
+        <w:bidi w:val="0"/>
+        <w:jc w:val="start"/>
+        <w:rPr>
+          <w:lang w:val="de-DE"/>
+        </w:rPr>
+      </w:pPr>
+      <w:r>
+        <w:rPr>
+          <w:lang w:val="de-DE"/>
+        </w:rPr>
+        <w:t>******************************************</w:t>
       </w:r>
     </w:p>
     <w:p>
@@ -7390,7 +7581,7 @@
     </w:rPr>
   </w:style>
   <w:style w:type="paragraph" w:styleId="Caption">
-    <w:name w:val="caption"/>
+    <w:name w:val="Caption"/>
     <w:basedOn w:val="Normal"/>
     <w:qFormat/>
     <w:pPr>

</xml_diff>

<commit_message>
Nuevos planes de clase del 25 de marzo
</commit_message>
<xml_diff>
--- a/planesDeClaseSegundo.docx
+++ b/planesDeClaseSegundo.docx
@@ -31,6 +31,678 @@
         <w:rPr>
           <w:lang w:val="de-DE"/>
         </w:rPr>
+        <w:t xml:space="preserve">Zweites Niveau, sechste Woche, </w:t>
+      </w:r>
+      <w:r>
+        <w:rPr>
+          <w:lang w:val="de-DE"/>
+        </w:rPr>
+        <w:t>Mittwoch</w:t>
+      </w:r>
+      <w:r>
+        <w:rPr>
+          <w:lang w:val="de-DE"/>
+        </w:rPr>
+        <w:t xml:space="preserve"> den 2</w:t>
+      </w:r>
+      <w:r>
+        <w:rPr>
+          <w:lang w:val="de-DE"/>
+        </w:rPr>
+        <w:t>5</w:t>
+      </w:r>
+      <w:r>
+        <w:rPr>
+          <w:lang w:val="de-DE"/>
+        </w:rPr>
+        <w:t>.03.26</w:t>
+      </w:r>
+    </w:p>
+    <w:p>
+      <w:pPr>
+        <w:pStyle w:val="Normal"/>
+        <w:bidi w:val="0"/>
+        <w:jc w:val="start"/>
+        <w:rPr>
+          <w:lang w:val="de-DE"/>
+        </w:rPr>
+      </w:pPr>
+      <w:r>
+        <w:rPr/>
+      </w:r>
+    </w:p>
+    <w:p>
+      <w:pPr>
+        <w:pStyle w:val="Normal"/>
+        <w:bidi w:val="0"/>
+        <w:jc w:val="start"/>
+        <w:rPr>
+          <w:lang w:val="de-DE"/>
+        </w:rPr>
+      </w:pPr>
+      <w:r>
+        <w:rPr>
+          <w:lang w:val="de-DE"/>
+        </w:rPr>
+        <w:t>10‘ Was haben wir voriges Mal im Unterricht gehabt? Was für Vokabeln und Strukturen haben wir gelernt?</w:t>
+      </w:r>
+    </w:p>
+    <w:p>
+      <w:pPr>
+        <w:pStyle w:val="Normal"/>
+        <w:bidi w:val="0"/>
+        <w:jc w:val="start"/>
+        <w:rPr>
+          <w:lang w:val="de-DE"/>
+        </w:rPr>
+      </w:pPr>
+      <w:r>
+        <w:rPr>
+          <w:lang w:val="de-DE"/>
+        </w:rPr>
+        <w:t>10‘ Erinnern sie sich noch an Eva? Was ist mit ihr bisher passiert?</w:t>
+      </w:r>
+    </w:p>
+    <w:p>
+      <w:pPr>
+        <w:pStyle w:val="Normal"/>
+        <w:bidi w:val="0"/>
+        <w:jc w:val="start"/>
+        <w:rPr>
+          <w:lang w:val="de-DE"/>
+        </w:rPr>
+      </w:pPr>
+      <w:r>
+        <w:rPr>
+          <w:lang w:val="de-DE"/>
+        </w:rPr>
+        <w:t>20‘ Die KT lesen die weiteren 5 Kapiteln und bereiten eine Mini-Präsentation vor. Was glauben sie? Was wird später mit ihr passieren?</w:t>
+      </w:r>
+    </w:p>
+    <w:p>
+      <w:pPr>
+        <w:pStyle w:val="Normal"/>
+        <w:bidi w:val="0"/>
+        <w:jc w:val="start"/>
+        <w:rPr>
+          <w:lang w:val="de-DE"/>
+        </w:rPr>
+      </w:pPr>
+      <w:r>
+        <w:rPr/>
+      </w:r>
+    </w:p>
+    <w:p>
+      <w:pPr>
+        <w:pStyle w:val="Normal"/>
+        <w:bidi w:val="0"/>
+        <w:jc w:val="start"/>
+        <w:rPr>
+          <w:lang w:val="de-DE"/>
+        </w:rPr>
+      </w:pPr>
+      <w:r>
+        <w:rPr>
+          <w:lang w:val="de-DE"/>
+        </w:rPr>
+        <w:t>Auf dem Markt</w:t>
+      </w:r>
+    </w:p>
+    <w:p>
+      <w:pPr>
+        <w:pStyle w:val="Normal"/>
+        <w:bidi w:val="0"/>
+        <w:jc w:val="start"/>
+        <w:rPr>
+          <w:lang w:val="de-DE"/>
+        </w:rPr>
+      </w:pPr>
+      <w:r>
+        <w:rPr>
+          <w:lang w:val="de-DE"/>
+        </w:rPr>
+        <w:t>10‘ Welche Lebensmittel mögen Sie? Was kosten sie? Notieren Sie.</w:t>
+      </w:r>
+    </w:p>
+    <w:p>
+      <w:pPr>
+        <w:pStyle w:val="Normal"/>
+        <w:bidi w:val="0"/>
+        <w:jc w:val="start"/>
+        <w:rPr>
+          <w:lang w:val="de-DE"/>
+        </w:rPr>
+      </w:pPr>
+      <w:r>
+        <w:rPr>
+          <w:lang w:val="de-DE"/>
+        </w:rPr>
+        <w:t>5‘ Ein Wort, viele Sprachen</w:t>
+      </w:r>
+    </w:p>
+    <w:p>
+      <w:pPr>
+        <w:pStyle w:val="Normal"/>
+        <w:bidi w:val="0"/>
+        <w:jc w:val="start"/>
+        <w:rPr>
+          <w:lang w:val="de-DE"/>
+        </w:rPr>
+      </w:pPr>
+      <w:r>
+        <w:rPr>
+          <w:lang w:val="de-DE"/>
+        </w:rPr>
+        <w:t>15‘ Was kauft Lina? Sehen Sie das Video. Welche Einkaufsliste passt? Kreuzen Sie an.</w:t>
+      </w:r>
+    </w:p>
+    <w:p>
+      <w:pPr>
+        <w:pStyle w:val="Normal"/>
+        <w:bidi w:val="0"/>
+        <w:jc w:val="start"/>
+        <w:rPr>
+          <w:lang w:val="de-DE"/>
+        </w:rPr>
+      </w:pPr>
+      <w:r>
+        <w:rPr>
+          <w:lang w:val="de-DE"/>
+        </w:rPr>
+        <w:t>Einkaufen</w:t>
+      </w:r>
+    </w:p>
+    <w:p>
+      <w:pPr>
+        <w:pStyle w:val="Normal"/>
+        <w:bidi w:val="0"/>
+        <w:jc w:val="start"/>
+        <w:rPr>
+          <w:lang w:val="de-DE"/>
+        </w:rPr>
+      </w:pPr>
+      <w:r>
+        <w:rPr>
+          <w:lang w:val="de-DE"/>
+        </w:rPr>
+        <w:t>20‘ Üben Sie Einkaufsdialoge. Die Dialoggrafik hilft.</w:t>
+      </w:r>
+    </w:p>
+    <w:p>
+      <w:pPr>
+        <w:pStyle w:val="Normal"/>
+        <w:bidi w:val="0"/>
+        <w:jc w:val="start"/>
+        <w:rPr>
+          <w:lang w:val="de-DE"/>
+        </w:rPr>
+      </w:pPr>
+      <w:r>
+        <w:rPr>
+          <w:lang w:val="de-DE"/>
+        </w:rPr>
+        <w:t>10‘ Fragen, Wünsche und Antworten. Wer sagt was? Kreuzen Sie an.</w:t>
+      </w:r>
+    </w:p>
+    <w:p>
+      <w:pPr>
+        <w:pStyle w:val="Normal"/>
+        <w:bidi w:val="0"/>
+        <w:jc w:val="start"/>
+        <w:rPr>
+          <w:lang w:val="de-DE"/>
+        </w:rPr>
+      </w:pPr>
+      <w:r>
+        <w:rPr>
+          <w:lang w:val="de-DE"/>
+        </w:rPr>
+        <w:t>10‘ Video: Loriot beim Einkaufen.</w:t>
+      </w:r>
+    </w:p>
+    <w:p>
+      <w:pPr>
+        <w:pStyle w:val="Normal"/>
+        <w:bidi w:val="0"/>
+        <w:jc w:val="start"/>
+        <w:rPr>
+          <w:lang w:val="de-DE"/>
+        </w:rPr>
+      </w:pPr>
+      <w:r>
+        <w:rPr/>
+      </w:r>
+    </w:p>
+    <w:p>
+      <w:pPr>
+        <w:pStyle w:val="Normal"/>
+        <w:bidi w:val="0"/>
+        <w:jc w:val="start"/>
+        <w:rPr>
+          <w:lang w:val="de-DE"/>
+        </w:rPr>
+      </w:pPr>
+      <w:r>
+        <w:rPr>
+          <w:lang w:val="de-DE"/>
+        </w:rPr>
+        <w:t>******************************************</w:t>
+      </w:r>
+    </w:p>
+    <w:p>
+      <w:pPr>
+        <w:pStyle w:val="Normal"/>
+        <w:bidi w:val="0"/>
+        <w:jc w:val="start"/>
+        <w:rPr>
+          <w:lang w:val="de-DE"/>
+        </w:rPr>
+      </w:pPr>
+      <w:r>
+        <w:rPr>
+          <w:lang w:val="de-DE"/>
+        </w:rPr>
+        <w:t>Sechstes</w:t>
+      </w:r>
+      <w:r>
+        <w:rPr>
+          <w:lang w:val="de-DE"/>
+        </w:rPr>
+        <w:t xml:space="preserve"> Niveau, sechste Woche, Mittwoch den 25.03.26</w:t>
+      </w:r>
+    </w:p>
+    <w:p>
+      <w:pPr>
+        <w:pStyle w:val="Normal"/>
+        <w:bidi w:val="0"/>
+        <w:jc w:val="start"/>
+        <w:rPr>
+          <w:lang w:val="de-DE"/>
+        </w:rPr>
+      </w:pPr>
+      <w:r>
+        <w:rPr/>
+      </w:r>
+    </w:p>
+    <w:p>
+      <w:pPr>
+        <w:pStyle w:val="Normal"/>
+        <w:bidi w:val="0"/>
+        <w:jc w:val="start"/>
+        <w:rPr>
+          <w:lang w:val="de-DE"/>
+        </w:rPr>
+      </w:pPr>
+      <w:r>
+        <w:rPr>
+          <w:lang w:val="de-DE"/>
+        </w:rPr>
+        <w:t>10‘ Was war das Thema von den letzten Unterricht? An welche Wörter können sie sich noch erinnern? Wie sagt man, wenn etwas nicht seine Sache ist?</w:t>
+      </w:r>
+    </w:p>
+    <w:p>
+      <w:pPr>
+        <w:pStyle w:val="Normal"/>
+        <w:bidi w:val="0"/>
+        <w:jc w:val="start"/>
+        <w:rPr>
+          <w:lang w:val="de-DE"/>
+        </w:rPr>
+      </w:pPr>
+      <w:r>
+        <w:rPr/>
+      </w:r>
+    </w:p>
+    <w:p>
+      <w:pPr>
+        <w:pStyle w:val="Normal"/>
+        <w:bidi w:val="0"/>
+        <w:jc w:val="start"/>
+        <w:rPr>
+          <w:lang w:val="de-DE"/>
+        </w:rPr>
+      </w:pPr>
+      <w:r>
+        <w:rPr>
+          <w:lang w:val="de-DE"/>
+        </w:rPr>
+        <w:t>Wahre Kunstwerke</w:t>
+      </w:r>
+    </w:p>
+    <w:p>
+      <w:pPr>
+        <w:pStyle w:val="Normal"/>
+        <w:bidi w:val="0"/>
+        <w:jc w:val="start"/>
+        <w:rPr>
+          <w:lang w:val="de-DE"/>
+        </w:rPr>
+      </w:pPr>
+      <w:r>
+        <w:rPr>
+          <w:lang w:val="de-DE"/>
+        </w:rPr>
+        <w:t>10‘ Zeitungstexte zum Thema „Kunst“. Lesen Sie die Überschriften. Worum könnte es in den Texten gehen? Vermuten Sie.</w:t>
+      </w:r>
+    </w:p>
+    <w:p>
+      <w:pPr>
+        <w:pStyle w:val="Normal"/>
+        <w:bidi w:val="0"/>
+        <w:jc w:val="start"/>
+        <w:rPr>
+          <w:lang w:val="de-DE"/>
+        </w:rPr>
+      </w:pPr>
+      <w:r>
+        <w:rPr/>
+      </w:r>
+    </w:p>
+    <w:p>
+      <w:pPr>
+        <w:pStyle w:val="Normal"/>
+        <w:bidi w:val="0"/>
+        <w:jc w:val="start"/>
+        <w:rPr>
+          <w:lang w:val="de-DE"/>
+        </w:rPr>
+      </w:pPr>
+      <w:r>
+        <w:rPr>
+          <w:lang w:val="de-DE"/>
+        </w:rPr>
+        <w:t xml:space="preserve"> </w:t>
+      </w:r>
+      <w:r>
+        <w:rPr>
+          <w:lang w:val="de-DE"/>
+        </w:rPr>
+        <w:t>20‘ Arbeiten Sie in Gruppen. Jede Gruppe liest einen Text, sucht die passende Überschrift in 3a und formuliert drei Fragen zum Text. Eine andere Gruppe notiert die Antworten.</w:t>
+      </w:r>
+    </w:p>
+    <w:p>
+      <w:pPr>
+        <w:pStyle w:val="Normal"/>
+        <w:bidi w:val="0"/>
+        <w:jc w:val="start"/>
+        <w:rPr>
+          <w:lang w:val="de-DE"/>
+        </w:rPr>
+      </w:pPr>
+      <w:r>
+        <w:rPr/>
+      </w:r>
+    </w:p>
+    <w:p>
+      <w:pPr>
+        <w:pStyle w:val="Normal"/>
+        <w:bidi w:val="0"/>
+        <w:jc w:val="start"/>
+        <w:rPr>
+          <w:lang w:val="de-DE"/>
+        </w:rPr>
+      </w:pPr>
+      <w:r>
+        <w:rPr>
+          <w:lang w:val="de-DE"/>
+        </w:rPr>
+        <w:t>10‘ Welchen Text haben Sie noch nicht gelesen? Finden Sie im Kurs eine Person, die Sie über diesen Text informiert. Fragen Sie nach.</w:t>
+      </w:r>
+    </w:p>
+    <w:p>
+      <w:pPr>
+        <w:pStyle w:val="Normal"/>
+        <w:bidi w:val="0"/>
+        <w:jc w:val="start"/>
+        <w:rPr>
+          <w:lang w:val="de-DE"/>
+        </w:rPr>
+      </w:pPr>
+      <w:r>
+        <w:rPr/>
+      </w:r>
+    </w:p>
+    <w:p>
+      <w:pPr>
+        <w:pStyle w:val="Normal"/>
+        <w:bidi w:val="0"/>
+        <w:jc w:val="start"/>
+        <w:rPr>
+          <w:lang w:val="de-DE"/>
+        </w:rPr>
+      </w:pPr>
+      <w:r>
+        <w:rPr>
+          <w:lang w:val="de-DE"/>
+        </w:rPr>
+        <w:t xml:space="preserve">Grammatik: Stellung von </w:t>
+      </w:r>
+      <w:r>
+        <w:rPr>
+          <w:i/>
+          <w:iCs/>
+          <w:lang w:val="de-DE"/>
+        </w:rPr>
+        <w:t>nicht</w:t>
+      </w:r>
+      <w:r>
+        <w:rPr>
+          <w:i w:val="false"/>
+          <w:iCs w:val="false"/>
+          <w:lang w:val="de-DE"/>
+        </w:rPr>
+        <w:t xml:space="preserve"> im Satz</w:t>
+      </w:r>
+    </w:p>
+    <w:p>
+      <w:pPr>
+        <w:pStyle w:val="Normal"/>
+        <w:bidi w:val="0"/>
+        <w:jc w:val="start"/>
+        <w:rPr>
+          <w:lang w:val="de-DE"/>
+        </w:rPr>
+      </w:pPr>
+      <w:r>
+        <w:rPr>
+          <w:lang w:val="de-DE"/>
+        </w:rPr>
+        <w:t>20‘ Lesen Sie die Regeln und die Sätze in A-F. Was passt zusammen? Ordnen Sie zu.</w:t>
+      </w:r>
+    </w:p>
+    <w:p>
+      <w:pPr>
+        <w:pStyle w:val="Normal"/>
+        <w:bidi w:val="0"/>
+        <w:jc w:val="start"/>
+        <w:rPr>
+          <w:lang w:val="de-DE"/>
+        </w:rPr>
+      </w:pPr>
+      <w:r>
+        <w:rPr/>
+      </w:r>
+    </w:p>
+    <w:p>
+      <w:pPr>
+        <w:pStyle w:val="Normal"/>
+        <w:bidi w:val="0"/>
+        <w:jc w:val="start"/>
+        <w:rPr>
+          <w:lang w:val="de-DE"/>
+        </w:rPr>
+      </w:pPr>
+      <w:r>
+        <w:rPr>
+          <w:lang w:val="de-DE"/>
+        </w:rPr>
+        <w:t>20‘ Verneinen Sie den ganzen Satz.</w:t>
+      </w:r>
+    </w:p>
+    <w:p>
+      <w:pPr>
+        <w:pStyle w:val="Normal"/>
+        <w:bidi w:val="0"/>
+        <w:jc w:val="start"/>
+        <w:rPr>
+          <w:lang w:val="de-DE"/>
+        </w:rPr>
+      </w:pPr>
+      <w:r>
+        <w:rPr/>
+      </w:r>
+    </w:p>
+    <w:p>
+      <w:pPr>
+        <w:pStyle w:val="Normal"/>
+        <w:bidi w:val="0"/>
+        <w:jc w:val="start"/>
+        <w:rPr>
+          <w:lang w:val="de-DE"/>
+        </w:rPr>
+      </w:pPr>
+      <w:r>
+        <w:rPr>
+          <w:lang w:val="de-DE"/>
+        </w:rPr>
+        <w:t>30‘ Lebendige Sätze.</w:t>
+      </w:r>
+    </w:p>
+    <w:p>
+      <w:pPr>
+        <w:pStyle w:val="Normal"/>
+        <w:bidi w:val="0"/>
+        <w:jc w:val="start"/>
+        <w:rPr>
+          <w:lang w:val="de-DE"/>
+        </w:rPr>
+      </w:pPr>
+      <w:r>
+        <w:rPr/>
+      </w:r>
+    </w:p>
+    <w:p>
+      <w:pPr>
+        <w:pStyle w:val="Normal"/>
+        <w:bidi w:val="0"/>
+        <w:jc w:val="start"/>
+        <w:rPr>
+          <w:lang w:val="de-DE"/>
+        </w:rPr>
+      </w:pPr>
+      <w:r>
+        <w:rPr>
+          <w:lang w:val="de-DE"/>
+        </w:rPr>
+        <w:t>******************************************</w:t>
+      </w:r>
+    </w:p>
+    <w:p>
+      <w:pPr>
+        <w:pStyle w:val="Normal"/>
+        <w:bidi w:val="0"/>
+        <w:jc w:val="start"/>
+        <w:rPr>
+          <w:lang w:val="de-DE"/>
+        </w:rPr>
+      </w:pPr>
+      <w:r>
+        <w:rPr>
+          <w:lang w:val="de-DE"/>
+        </w:rPr>
+        <w:t>Viertes</w:t>
+      </w:r>
+      <w:r>
+        <w:rPr>
+          <w:lang w:val="de-DE"/>
+        </w:rPr>
+        <w:t xml:space="preserve"> Niveau, sechste Woche, Mittwoch den 25.03.26</w:t>
+      </w:r>
+    </w:p>
+    <w:p>
+      <w:pPr>
+        <w:pStyle w:val="Normal"/>
+        <w:bidi w:val="0"/>
+        <w:jc w:val="start"/>
+        <w:rPr>
+          <w:lang w:val="de-DE"/>
+        </w:rPr>
+      </w:pPr>
+      <w:r>
+        <w:rPr/>
+      </w:r>
+    </w:p>
+    <w:p>
+      <w:pPr>
+        <w:pStyle w:val="Normal"/>
+        <w:bidi w:val="0"/>
+        <w:jc w:val="start"/>
+        <w:rPr>
+          <w:lang w:val="de-DE"/>
+        </w:rPr>
+      </w:pPr>
+      <w:r>
+        <w:rPr>
+          <w:lang w:val="de-DE"/>
+        </w:rPr>
+        <w:t>Beruf Sprache</w:t>
+      </w:r>
+    </w:p>
+    <w:p>
+      <w:pPr>
+        <w:pStyle w:val="Normal"/>
+        <w:bidi w:val="0"/>
+        <w:jc w:val="start"/>
+        <w:rPr>
+          <w:lang w:val="de-DE"/>
+        </w:rPr>
+      </w:pPr>
+      <w:r>
+        <w:rPr/>
+      </w:r>
+    </w:p>
+    <w:p>
+      <w:pPr>
+        <w:pStyle w:val="Normal"/>
+        <w:bidi w:val="0"/>
+        <w:jc w:val="start"/>
+        <w:rPr>
+          <w:lang w:val="de-DE"/>
+        </w:rPr>
+      </w:pPr>
+      <w:r>
+        <w:rPr/>
+      </w:r>
+    </w:p>
+    <w:p>
+      <w:pPr>
+        <w:pStyle w:val="Normal"/>
+        <w:bidi w:val="0"/>
+        <w:jc w:val="start"/>
+        <w:rPr>
+          <w:lang w:val="de-DE"/>
+        </w:rPr>
+      </w:pPr>
+      <w:r>
+        <w:rPr>
+          <w:lang w:val="de-DE"/>
+        </w:rPr>
+        <w:t>******************************************</w:t>
+      </w:r>
+    </w:p>
+    <w:p>
+      <w:pPr>
+        <w:pStyle w:val="Normal"/>
+        <w:bidi w:val="0"/>
+        <w:jc w:val="start"/>
+        <w:rPr>
+          <w:lang w:val="de-DE"/>
+        </w:rPr>
+      </w:pPr>
+      <w:r>
+        <w:rPr>
+          <w:lang w:val="de-DE"/>
+        </w:rPr>
       </w:r>
     </w:p>
     <w:p>
@@ -318,26 +990,22 @@
         <w:rPr>
           <w:lang w:val="de-DE"/>
         </w:rPr>
-        <w:t xml:space="preserve"> </w:t>
-      </w:r>
-      <w:r>
-        <w:rPr>
-          <w:lang w:val="de-DE"/>
-        </w:rPr>
-        <w:t>Probleme hatten?</w:t>
-      </w:r>
-    </w:p>
-    <w:p>
-      <w:pPr>
-        <w:pStyle w:val="Normal"/>
-        <w:bidi w:val="0"/>
-        <w:jc w:val="start"/>
-        <w:rPr>
-          <w:lang w:val="de-DE"/>
-        </w:rPr>
-      </w:pPr>
-      <w:r>
-        <w:rPr/>
+        <w:t xml:space="preserve"> Probleme hatten?</w:t>
+      </w:r>
+    </w:p>
+    <w:p>
+      <w:pPr>
+        <w:pStyle w:val="Normal"/>
+        <w:bidi w:val="0"/>
+        <w:jc w:val="start"/>
+        <w:rPr>
+          <w:lang w:val="de-DE"/>
+        </w:rPr>
+      </w:pPr>
+      <w:r>
+        <w:rPr>
+          <w:lang w:val="de-DE"/>
+        </w:rPr>
       </w:r>
     </w:p>
     <w:p>
@@ -369,35 +1037,23 @@
         <w:rPr>
           <w:lang w:val="de-DE"/>
         </w:rPr>
-        <w:t>10‘</w:t>
-      </w:r>
-      <w:r>
-        <w:rPr>
-          <w:lang w:val="de-DE"/>
-        </w:rPr>
-        <w:t>- Kunst und Kultur in Innsbruck. Sehen Sie die Fotos an. Was gefällt Ihnen am besten? Was gefällt Ihnen nicht? Warum?</w:t>
-      </w:r>
-    </w:p>
-    <w:p>
-      <w:pPr>
-        <w:pStyle w:val="Normal"/>
-        <w:bidi w:val="0"/>
-        <w:jc w:val="start"/>
-        <w:rPr>
-          <w:lang w:val="de-DE"/>
-        </w:rPr>
-      </w:pPr>
-      <w:r>
-        <w:rPr>
-          <w:lang w:val="de-DE"/>
-        </w:rPr>
-        <w:t>20‘</w:t>
-      </w:r>
-      <w:r>
-        <w:rPr>
-          <w:lang w:val="de-DE"/>
-        </w:rPr>
-        <w:t xml:space="preserve"> Arbeiten Sie zu fünft. Jeder liest einen Eintrag aus Marias Kunstblog. Was für ein Kunstwerk ist das?</w:t>
+        <w:t>10‘- Kunst und Kultur in Innsbruck. Sehen Sie die Fotos an. Was gefällt Ihnen am besten? Was gefällt Ihnen nicht? Warum?</w:t>
+      </w:r>
+    </w:p>
+    <w:p>
+      <w:pPr>
+        <w:pStyle w:val="Normal"/>
+        <w:bidi w:val="0"/>
+        <w:jc w:val="start"/>
+        <w:rPr>
+          <w:lang w:val="de-DE"/>
+        </w:rPr>
+      </w:pPr>
+      <w:r>
+        <w:rPr>
+          <w:lang w:val="de-DE"/>
+        </w:rPr>
+        <w:t>20‘ Arbeiten Sie zu fünft. Jeder liest einen Eintrag aus Marias Kunstblog. Was für ein Kunstwerk ist das?</w:t>
       </w:r>
     </w:p>
     <w:p>
@@ -474,7 +1130,9 @@
         </w:rPr>
       </w:pPr>
       <w:r>
-        <w:rPr/>
+        <w:rPr>
+          <w:lang w:val="de-DE"/>
+        </w:rPr>
       </w:r>
     </w:p>
     <w:p>
@@ -506,38 +1164,22 @@
         <w:rPr>
           <w:lang w:val="de-DE"/>
         </w:rPr>
-        <w:t xml:space="preserve">Viertes </w:t>
-      </w:r>
-      <w:r>
-        <w:rPr>
-          <w:lang w:val="de-DE"/>
-        </w:rPr>
-        <w:t xml:space="preserve">Niveau, </w:t>
-      </w:r>
-      <w:r>
-        <w:rPr>
-          <w:lang w:val="de-DE"/>
-        </w:rPr>
-        <w:t>siebte</w:t>
-      </w:r>
-      <w:r>
-        <w:rPr>
-          <w:lang w:val="de-DE"/>
-        </w:rPr>
-        <w:t xml:space="preserve"> Woche, Montag den 23.03.26</w:t>
-      </w:r>
-    </w:p>
-    <w:p>
-      <w:pPr>
-        <w:pStyle w:val="Normal"/>
-        <w:bidi w:val="0"/>
-        <w:jc w:val="start"/>
-        <w:rPr>
-          <w:lang w:val="de-DE"/>
-        </w:rPr>
-      </w:pPr>
-      <w:r>
-        <w:rPr/>
+        <w:t>Viertes Niveau, siebte Woche, Montag den 23.03.26</w:t>
+      </w:r>
+    </w:p>
+    <w:p>
+      <w:pPr>
+        <w:pStyle w:val="Normal"/>
+        <w:bidi w:val="0"/>
+        <w:jc w:val="start"/>
+        <w:rPr>
+          <w:lang w:val="de-DE"/>
+        </w:rPr>
+      </w:pPr>
+      <w:r>
+        <w:rPr>
+          <w:lang w:val="de-DE"/>
+        </w:rPr>
       </w:r>
     </w:p>
     <w:p>

</xml_diff>

<commit_message>
Toda la clase de segundo del 27 de marzo 2026
</commit_message>
<xml_diff>
--- a/planesDeClaseSegundo.docx
+++ b/planesDeClaseSegundo.docx
@@ -2,6 +2,295 @@
 <file path=word/document.xml><?xml version="1.0" encoding="utf-8"?>
 <w:document xmlns:o="urn:schemas-microsoft-com:office:office" xmlns:r="http://schemas.openxmlformats.org/officeDocument/2006/relationships" xmlns:v="urn:schemas-microsoft-com:vml" xmlns:w="http://schemas.openxmlformats.org/wordprocessingml/2006/main" xmlns:w10="urn:schemas-microsoft-com:office:word" xmlns:wp="http://schemas.openxmlformats.org/drawingml/2006/wordprocessingDrawing" xmlns:wps="http://schemas.microsoft.com/office/word/2010/wordprocessingShape" xmlns:wpg="http://schemas.microsoft.com/office/word/2010/wordprocessingGroup" xmlns:mc="http://schemas.openxmlformats.org/markup-compatibility/2006" xmlns:wp14="http://schemas.microsoft.com/office/word/2010/wordprocessingDrawing" xmlns:w14="http://schemas.microsoft.com/office/word/2010/wordml" xmlns:w15="http://schemas.microsoft.com/office/word/2012/wordml" mc:Ignorable="w14 wp14 w15">
   <w:body>
+    <w:p>
+      <w:pPr>
+        <w:pStyle w:val="Normal"/>
+        <w:bidi w:val="0"/>
+        <w:jc w:val="start"/>
+        <w:rPr>
+          <w:lang w:val="de-DE"/>
+        </w:rPr>
+      </w:pPr>
+      <w:r>
+        <w:rPr>
+          <w:lang w:val="de-DE"/>
+        </w:rPr>
+        <w:t>******************************************</w:t>
+      </w:r>
+    </w:p>
+    <w:p>
+      <w:pPr>
+        <w:pStyle w:val="Normal"/>
+        <w:bidi w:val="0"/>
+        <w:jc w:val="start"/>
+        <w:rPr>
+          <w:lang w:val="de-DE"/>
+        </w:rPr>
+      </w:pPr>
+      <w:r>
+        <w:rPr>
+          <w:lang w:val="de-DE"/>
+        </w:rPr>
+        <w:t xml:space="preserve">Zweites Niveau, sechste Woche, </w:t>
+      </w:r>
+      <w:r>
+        <w:rPr>
+          <w:lang w:val="de-DE"/>
+        </w:rPr>
+        <w:t xml:space="preserve">Freitag </w:t>
+      </w:r>
+      <w:r>
+        <w:rPr>
+          <w:lang w:val="de-DE"/>
+        </w:rPr>
+        <w:t>den 2</w:t>
+      </w:r>
+      <w:r>
+        <w:rPr>
+          <w:lang w:val="de-DE"/>
+        </w:rPr>
+        <w:t>7</w:t>
+      </w:r>
+      <w:r>
+        <w:rPr>
+          <w:lang w:val="de-DE"/>
+        </w:rPr>
+        <w:t>.03.26</w:t>
+      </w:r>
+    </w:p>
+    <w:p>
+      <w:pPr>
+        <w:pStyle w:val="Normal"/>
+        <w:bidi w:val="0"/>
+        <w:jc w:val="start"/>
+        <w:rPr>
+          <w:lang w:val="de-DE"/>
+        </w:rPr>
+      </w:pPr>
+      <w:r>
+        <w:rPr/>
+      </w:r>
+    </w:p>
+    <w:p>
+      <w:pPr>
+        <w:pStyle w:val="Normal"/>
+        <w:bidi w:val="0"/>
+        <w:jc w:val="start"/>
+        <w:rPr>
+          <w:lang w:val="de-DE"/>
+        </w:rPr>
+      </w:pPr>
+      <w:r>
+        <w:rPr>
+          <w:lang w:val="de-DE"/>
+        </w:rPr>
+        <w:t>10‘ Begrüßungen. Aktives Abrufen: „Was haben Sie gestern gemacht? Wissen Sie noch?“</w:t>
+      </w:r>
+    </w:p>
+    <w:p>
+      <w:pPr>
+        <w:pStyle w:val="Normal"/>
+        <w:bidi w:val="0"/>
+        <w:jc w:val="start"/>
+        <w:rPr>
+          <w:lang w:val="de-DE"/>
+        </w:rPr>
+      </w:pPr>
+      <w:r>
+        <w:rPr/>
+      </w:r>
+    </w:p>
+    <w:p>
+      <w:pPr>
+        <w:pStyle w:val="Normal"/>
+        <w:bidi w:val="0"/>
+        <w:jc w:val="start"/>
+        <w:rPr>
+          <w:lang w:val="de-DE"/>
+        </w:rPr>
+      </w:pPr>
+      <w:r>
+        <w:rPr>
+          <w:lang w:val="de-DE"/>
+        </w:rPr>
+        <w:t>10‘ Aktives Abrufen: Ohne auf ihre Notizen zu gucken schreiben die Kursteilnehmer alle Phrasen, die man als Kunde beim Einkaufen anwenden kann. Was für Phrasen kann man als Verkäuferin benutzen?</w:t>
+      </w:r>
+    </w:p>
+    <w:p>
+      <w:pPr>
+        <w:pStyle w:val="Normal"/>
+        <w:bidi w:val="0"/>
+        <w:jc w:val="start"/>
+        <w:rPr>
+          <w:lang w:val="de-DE"/>
+        </w:rPr>
+      </w:pPr>
+      <w:r>
+        <w:rPr/>
+      </w:r>
+    </w:p>
+    <w:p>
+      <w:pPr>
+        <w:pStyle w:val="Normal"/>
+        <w:bidi w:val="0"/>
+        <w:jc w:val="start"/>
+        <w:rPr>
+          <w:lang w:val="de-DE"/>
+        </w:rPr>
+      </w:pPr>
+      <w:r>
+        <w:rPr>
+          <w:lang w:val="de-DE"/>
+        </w:rPr>
+        <w:t>10‘ Aktives Abrufen: Was braucht man, wenn man Pfannkuchen für eine Familie mit vier Mitgliedern vorbereiten möchte? Versuch, dass die Kursteilnehmer dabei die Behälter und die richtigen Maßeinheiten verwenden.</w:t>
+      </w:r>
+    </w:p>
+    <w:p>
+      <w:pPr>
+        <w:pStyle w:val="Normal"/>
+        <w:bidi w:val="0"/>
+        <w:jc w:val="start"/>
+        <w:rPr>
+          <w:lang w:val="de-DE"/>
+        </w:rPr>
+      </w:pPr>
+      <w:r>
+        <w:rPr/>
+      </w:r>
+    </w:p>
+    <w:p>
+      <w:pPr>
+        <w:pStyle w:val="Normal"/>
+        <w:bidi w:val="0"/>
+        <w:jc w:val="start"/>
+        <w:rPr>
+          <w:lang w:val="de-DE"/>
+        </w:rPr>
+      </w:pPr>
+      <w:r>
+        <w:rPr/>
+        <w:t>10‘ Possessivpronomen. Können Sie erklären, wie das ganze Paradigma aussieht, ohne dass sie auf ihre Notizen schauen?</w:t>
+      </w:r>
+    </w:p>
+    <w:p>
+      <w:pPr>
+        <w:pStyle w:val="Normal"/>
+        <w:bidi w:val="0"/>
+        <w:jc w:val="start"/>
+        <w:rPr>
+          <w:lang w:val="de-DE"/>
+        </w:rPr>
+      </w:pPr>
+      <w:r>
+        <w:rPr/>
+      </w:r>
+    </w:p>
+    <w:p>
+      <w:pPr>
+        <w:pStyle w:val="Normal"/>
+        <w:bidi w:val="0"/>
+        <w:jc w:val="start"/>
+        <w:rPr>
+          <w:lang w:val="de-DE"/>
+        </w:rPr>
+      </w:pPr>
+      <w:r>
+        <w:rPr>
+          <w:lang w:val="de-DE"/>
+        </w:rPr>
+        <w:t>------</w:t>
+      </w:r>
+    </w:p>
+    <w:p>
+      <w:pPr>
+        <w:pStyle w:val="Normal"/>
+        <w:bidi w:val="0"/>
+        <w:jc w:val="start"/>
+        <w:rPr>
+          <w:lang w:val="de-DE"/>
+        </w:rPr>
+      </w:pPr>
+      <w:r>
+        <w:rPr>
+          <w:lang w:val="de-DE"/>
+        </w:rPr>
+        <w:t>40‘ Seite 163</w:t>
+      </w:r>
+    </w:p>
+    <w:p>
+      <w:pPr>
+        <w:pStyle w:val="Normal"/>
+        <w:bidi w:val="0"/>
+        <w:jc w:val="start"/>
+        <w:rPr>
+          <w:lang w:val="de-DE"/>
+        </w:rPr>
+      </w:pPr>
+      <w:r>
+        <w:rPr>
+          <w:lang w:val="de-DE"/>
+        </w:rPr>
+        <w:t>------</w:t>
+      </w:r>
+    </w:p>
+    <w:p>
+      <w:pPr>
+        <w:pStyle w:val="Normal"/>
+        <w:bidi w:val="0"/>
+        <w:jc w:val="start"/>
+        <w:rPr>
+          <w:lang w:val="de-DE"/>
+        </w:rPr>
+      </w:pPr>
+      <w:r>
+        <w:rPr>
+          <w:lang w:val="de-DE"/>
+        </w:rPr>
+        <w:t>40‘ Seite 165</w:t>
+      </w:r>
+    </w:p>
+    <w:p>
+      <w:pPr>
+        <w:pStyle w:val="Normal"/>
+        <w:bidi w:val="0"/>
+        <w:jc w:val="start"/>
+        <w:rPr>
+          <w:lang w:val="de-DE"/>
+        </w:rPr>
+      </w:pPr>
+      <w:r>
+        <w:rPr/>
+      </w:r>
+    </w:p>
+    <w:p>
+      <w:pPr>
+        <w:pStyle w:val="Normal"/>
+        <w:bidi w:val="0"/>
+        <w:jc w:val="start"/>
+        <w:rPr>
+          <w:lang w:val="de-DE"/>
+        </w:rPr>
+      </w:pPr>
+      <w:r>
+        <w:rPr>
+          <w:lang w:val="de-DE"/>
+        </w:rPr>
+        <w:t>HAG: Seie 164 und die Übungen am Ende der Lektion</w:t>
+      </w:r>
+    </w:p>
+    <w:p>
+      <w:pPr>
+        <w:pStyle w:val="Normal"/>
+        <w:bidi w:val="0"/>
+        <w:jc w:val="start"/>
+        <w:rPr>
+          <w:lang w:val="de-DE"/>
+        </w:rPr>
+      </w:pPr>
+      <w:r>
+        <w:rPr/>
+      </w:r>
+    </w:p>
     <w:p>
       <w:pPr>
         <w:pStyle w:val="Normal"/>

</xml_diff>

<commit_message>
Todo sexto planeado para viernes 27 de marzo
</commit_message>
<xml_diff>
--- a/planesDeClaseSegundo.docx
+++ b/planesDeClaseSegundo.docx
@@ -31,44 +31,22 @@
         <w:rPr>
           <w:lang w:val="de-DE"/>
         </w:rPr>
-        <w:t xml:space="preserve">Zweites Niveau, sechste Woche, </w:t>
-      </w:r>
-      <w:r>
-        <w:rPr>
-          <w:lang w:val="de-DE"/>
-        </w:rPr>
-        <w:t xml:space="preserve">Freitag </w:t>
-      </w:r>
-      <w:r>
-        <w:rPr>
-          <w:lang w:val="de-DE"/>
-        </w:rPr>
-        <w:t>den 2</w:t>
-      </w:r>
-      <w:r>
-        <w:rPr>
-          <w:lang w:val="de-DE"/>
-        </w:rPr>
-        <w:t>7</w:t>
-      </w:r>
-      <w:r>
-        <w:rPr>
-          <w:lang w:val="de-DE"/>
-        </w:rPr>
-        <w:t>.03.26</w:t>
-      </w:r>
-    </w:p>
-    <w:p>
-      <w:pPr>
-        <w:pStyle w:val="Normal"/>
-        <w:bidi w:val="0"/>
-        <w:jc w:val="start"/>
-        <w:rPr>
-          <w:lang w:val="de-DE"/>
-        </w:rPr>
-      </w:pPr>
-      <w:r>
-        <w:rPr/>
+        <w:t>Zweites Niveau, sechste Woche, Freitag den 27.03.26</w:t>
+      </w:r>
+    </w:p>
+    <w:p>
+      <w:pPr>
+        <w:pStyle w:val="Normal"/>
+        <w:bidi w:val="0"/>
+        <w:jc w:val="start"/>
+        <w:rPr>
+          <w:lang w:val="de-DE"/>
+        </w:rPr>
+      </w:pPr>
+      <w:r>
+        <w:rPr>
+          <w:lang w:val="de-DE"/>
+        </w:rPr>
       </w:r>
     </w:p>
     <w:p>
@@ -97,7 +75,9 @@
         </w:rPr>
       </w:pPr>
       <w:r>
-        <w:rPr/>
+        <w:rPr>
+          <w:lang w:val="de-DE"/>
+        </w:rPr>
       </w:r>
     </w:p>
     <w:p>
@@ -126,7 +106,9 @@
         </w:rPr>
       </w:pPr>
       <w:r>
-        <w:rPr/>
+        <w:rPr>
+          <w:lang w:val="de-DE"/>
+        </w:rPr>
       </w:r>
     </w:p>
     <w:p>
@@ -155,7 +137,9 @@
         </w:rPr>
       </w:pPr>
       <w:r>
-        <w:rPr/>
+        <w:rPr>
+          <w:lang w:val="de-DE"/>
+        </w:rPr>
       </w:r>
     </w:p>
     <w:p>
@@ -182,6 +166,216 @@
         </w:rPr>
       </w:pPr>
       <w:r>
+        <w:rPr>
+          <w:lang w:val="de-DE"/>
+        </w:rPr>
+      </w:r>
+    </w:p>
+    <w:p>
+      <w:pPr>
+        <w:pStyle w:val="Normal"/>
+        <w:bidi w:val="0"/>
+        <w:jc w:val="start"/>
+        <w:rPr>
+          <w:lang w:val="de-DE"/>
+        </w:rPr>
+      </w:pPr>
+      <w:r>
+        <w:rPr>
+          <w:lang w:val="de-DE"/>
+        </w:rPr>
+        <w:t>------</w:t>
+      </w:r>
+    </w:p>
+    <w:p>
+      <w:pPr>
+        <w:pStyle w:val="Normal"/>
+        <w:bidi w:val="0"/>
+        <w:jc w:val="start"/>
+        <w:rPr>
+          <w:lang w:val="de-DE"/>
+        </w:rPr>
+      </w:pPr>
+      <w:r>
+        <w:rPr>
+          <w:lang w:val="de-DE"/>
+        </w:rPr>
+        <w:t>40‘ Seite 163</w:t>
+      </w:r>
+    </w:p>
+    <w:p>
+      <w:pPr>
+        <w:pStyle w:val="Normal"/>
+        <w:bidi w:val="0"/>
+        <w:jc w:val="start"/>
+        <w:rPr>
+          <w:lang w:val="de-DE"/>
+        </w:rPr>
+      </w:pPr>
+      <w:r>
+        <w:rPr>
+          <w:lang w:val="de-DE"/>
+        </w:rPr>
+        <w:t>------</w:t>
+      </w:r>
+    </w:p>
+    <w:p>
+      <w:pPr>
+        <w:pStyle w:val="Normal"/>
+        <w:bidi w:val="0"/>
+        <w:jc w:val="start"/>
+        <w:rPr>
+          <w:lang w:val="de-DE"/>
+        </w:rPr>
+      </w:pPr>
+      <w:r>
+        <w:rPr>
+          <w:lang w:val="de-DE"/>
+        </w:rPr>
+        <w:t>40‘ Seite 165</w:t>
+      </w:r>
+    </w:p>
+    <w:p>
+      <w:pPr>
+        <w:pStyle w:val="Normal"/>
+        <w:bidi w:val="0"/>
+        <w:jc w:val="start"/>
+        <w:rPr>
+          <w:lang w:val="de-DE"/>
+        </w:rPr>
+      </w:pPr>
+      <w:r>
+        <w:rPr>
+          <w:lang w:val="de-DE"/>
+        </w:rPr>
+      </w:r>
+    </w:p>
+    <w:p>
+      <w:pPr>
+        <w:pStyle w:val="Normal"/>
+        <w:bidi w:val="0"/>
+        <w:jc w:val="start"/>
+        <w:rPr>
+          <w:lang w:val="de-DE"/>
+        </w:rPr>
+      </w:pPr>
+      <w:r>
+        <w:rPr>
+          <w:lang w:val="de-DE"/>
+        </w:rPr>
+        <w:t>HAG: Seie 164 und die Übungen am Ende der Lektion</w:t>
+      </w:r>
+    </w:p>
+    <w:p>
+      <w:pPr>
+        <w:pStyle w:val="Normal"/>
+        <w:bidi w:val="0"/>
+        <w:jc w:val="start"/>
+        <w:rPr>
+          <w:lang w:val="de-DE"/>
+        </w:rPr>
+      </w:pPr>
+      <w:r>
+        <w:rPr>
+          <w:lang w:val="de-DE"/>
+        </w:rPr>
+      </w:r>
+    </w:p>
+    <w:p>
+      <w:pPr>
+        <w:pStyle w:val="Normal"/>
+        <w:bidi w:val="0"/>
+        <w:jc w:val="start"/>
+        <w:rPr>
+          <w:lang w:val="de-DE"/>
+        </w:rPr>
+      </w:pPr>
+      <w:r>
+        <w:rPr>
+          <w:lang w:val="de-DE"/>
+        </w:rPr>
+        <w:t>******************************************</w:t>
+      </w:r>
+    </w:p>
+    <w:p>
+      <w:pPr>
+        <w:pStyle w:val="Normal"/>
+        <w:bidi w:val="0"/>
+        <w:jc w:val="start"/>
+        <w:rPr>
+          <w:lang w:val="de-DE"/>
+        </w:rPr>
+      </w:pPr>
+      <w:r>
+        <w:rPr>
+          <w:lang w:val="de-DE"/>
+        </w:rPr>
+        <w:t>Sechstes Niveau, sechste Woche, Freitag den 27.03.26</w:t>
+      </w:r>
+    </w:p>
+    <w:p>
+      <w:pPr>
+        <w:pStyle w:val="Normal"/>
+        <w:bidi w:val="0"/>
+        <w:jc w:val="start"/>
+        <w:rPr>
+          <w:lang w:val="de-DE"/>
+        </w:rPr>
+      </w:pPr>
+      <w:r>
+        <w:rPr>
+          <w:lang w:val="de-DE"/>
+        </w:rPr>
+      </w:r>
+    </w:p>
+    <w:p>
+      <w:pPr>
+        <w:pStyle w:val="Normal"/>
+        <w:bidi w:val="0"/>
+        <w:jc w:val="start"/>
+        <w:rPr>
+          <w:lang w:val="de-DE"/>
+        </w:rPr>
+      </w:pPr>
+      <w:r>
+        <w:rPr>
+          <w:lang w:val="de-DE"/>
+        </w:rPr>
+        <w:t>20‘ Gib den K</w:t>
+      </w:r>
+      <w:r>
+        <w:rPr>
+          <w:lang w:val="de-DE"/>
+        </w:rPr>
+        <w:t xml:space="preserve">ursteilnehmern eine Kopie mit Übungen zum Thema „Stellung von </w:t>
+      </w:r>
+      <w:r>
+        <w:rPr>
+          <w:i/>
+          <w:iCs/>
+          <w:lang w:val="de-DE"/>
+        </w:rPr>
+        <w:t>nicht</w:t>
+      </w:r>
+      <w:r>
+        <w:rPr>
+          <w:i w:val="false"/>
+          <w:iCs w:val="false"/>
+          <w:lang w:val="de-DE"/>
+        </w:rPr>
+        <w:t xml:space="preserve"> im Satz“</w:t>
+      </w:r>
+    </w:p>
+    <w:p>
+      <w:pPr>
+        <w:pStyle w:val="Normal"/>
+        <w:bidi w:val="0"/>
+        <w:jc w:val="start"/>
+        <w:rPr>
+          <w:lang w:val="de-DE"/>
+        </w:rPr>
+      </w:pPr>
+      <w:r>
         <w:rPr/>
       </w:r>
     </w:p>
@@ -196,99 +390,155 @@
       </w:pPr>
       <w:r>
         <w:rPr>
-          <w:lang w:val="de-DE"/>
-        </w:rPr>
-        <w:t>------</w:t>
-      </w:r>
-    </w:p>
-    <w:p>
-      <w:pPr>
-        <w:pStyle w:val="Normal"/>
-        <w:bidi w:val="0"/>
-        <w:jc w:val="start"/>
-        <w:rPr>
-          <w:lang w:val="de-DE"/>
-        </w:rPr>
-      </w:pPr>
-      <w:r>
-        <w:rPr>
-          <w:lang w:val="de-DE"/>
-        </w:rPr>
-        <w:t>40‘ Seite 163</w:t>
-      </w:r>
-    </w:p>
-    <w:p>
-      <w:pPr>
-        <w:pStyle w:val="Normal"/>
-        <w:bidi w:val="0"/>
-        <w:jc w:val="start"/>
-        <w:rPr>
-          <w:lang w:val="de-DE"/>
-        </w:rPr>
-      </w:pPr>
-      <w:r>
-        <w:rPr>
-          <w:lang w:val="de-DE"/>
-        </w:rPr>
-        <w:t>------</w:t>
-      </w:r>
-    </w:p>
-    <w:p>
-      <w:pPr>
-        <w:pStyle w:val="Normal"/>
-        <w:bidi w:val="0"/>
-        <w:jc w:val="start"/>
-        <w:rPr>
-          <w:lang w:val="de-DE"/>
-        </w:rPr>
-      </w:pPr>
-      <w:r>
-        <w:rPr>
-          <w:lang w:val="de-DE"/>
-        </w:rPr>
-        <w:t>40‘ Seite 165</w:t>
-      </w:r>
-    </w:p>
-    <w:p>
-      <w:pPr>
-        <w:pStyle w:val="Normal"/>
-        <w:bidi w:val="0"/>
-        <w:jc w:val="start"/>
-        <w:rPr>
-          <w:lang w:val="de-DE"/>
-        </w:rPr>
-      </w:pPr>
-      <w:r>
-        <w:rPr/>
-      </w:r>
-    </w:p>
-    <w:p>
-      <w:pPr>
-        <w:pStyle w:val="Normal"/>
-        <w:bidi w:val="0"/>
-        <w:jc w:val="start"/>
-        <w:rPr>
-          <w:lang w:val="de-DE"/>
-        </w:rPr>
-      </w:pPr>
-      <w:r>
-        <w:rPr>
-          <w:lang w:val="de-DE"/>
-        </w:rPr>
-        <w:t>HAG: Seie 164 und die Übungen am Ende der Lektion</w:t>
-      </w:r>
-    </w:p>
-    <w:p>
-      <w:pPr>
-        <w:pStyle w:val="Normal"/>
-        <w:bidi w:val="0"/>
-        <w:jc w:val="start"/>
-        <w:rPr>
-          <w:lang w:val="de-DE"/>
-        </w:rPr>
-      </w:pPr>
-      <w:r>
-        <w:rPr/>
+          <w:i w:val="false"/>
+          <w:iCs w:val="false"/>
+          <w:lang w:val="de-DE"/>
+        </w:rPr>
+        <w:t>5‘ Sehen Sie das Bild an. Wie gefällt es Ihnen? Wie könnte es heißen?</w:t>
+      </w:r>
+    </w:p>
+    <w:p>
+      <w:pPr>
+        <w:pStyle w:val="Normal"/>
+        <w:bidi w:val="0"/>
+        <w:jc w:val="start"/>
+        <w:rPr>
+          <w:lang w:val="de-DE"/>
+        </w:rPr>
+      </w:pPr>
+      <w:r>
+        <w:rPr>
+          <w:i w:val="false"/>
+          <w:iCs w:val="false"/>
+          <w:lang w:val="de-DE"/>
+        </w:rPr>
+        <w:t>10‘ Hören Sie drei Gespräche über ein Kunstwerk. Wie vielen Personen gefällt das Bild?</w:t>
+      </w:r>
+    </w:p>
+    <w:p>
+      <w:pPr>
+        <w:pStyle w:val="Normal"/>
+        <w:bidi w:val="0"/>
+        <w:jc w:val="start"/>
+        <w:rPr>
+          <w:lang w:val="de-DE"/>
+        </w:rPr>
+      </w:pPr>
+      <w:r>
+        <w:rPr>
+          <w:i w:val="false"/>
+          <w:iCs w:val="false"/>
+          <w:lang w:val="de-DE"/>
+        </w:rPr>
+        <w:t>10‘ Hören Sie noch einmal. Was drücken die Sätze aus? Notieren Sie.</w:t>
+      </w:r>
+    </w:p>
+    <w:p>
+      <w:pPr>
+        <w:pStyle w:val="Normal"/>
+        <w:bidi w:val="0"/>
+        <w:jc w:val="start"/>
+        <w:rPr>
+          <w:lang w:val="de-DE"/>
+        </w:rPr>
+      </w:pPr>
+      <w:r>
+        <w:rPr>
+          <w:i w:val="false"/>
+          <w:iCs w:val="false"/>
+          <w:lang w:val="de-DE"/>
+        </w:rPr>
+        <w:t>10‘ Lesen Sie die Sätze. Wie ändern die markieren Wörter den Satz? Ordnen Sie die Wörter in eine Tabelle.</w:t>
+      </w:r>
+    </w:p>
+    <w:p>
+      <w:pPr>
+        <w:pStyle w:val="Normal"/>
+        <w:bidi w:val="0"/>
+        <w:jc w:val="start"/>
+        <w:rPr>
+          <w:lang w:val="de-DE"/>
+        </w:rPr>
+      </w:pPr>
+      <w:r>
+        <w:rPr>
+          <w:i w:val="false"/>
+          <w:iCs w:val="false"/>
+          <w:lang w:val="de-DE"/>
+        </w:rPr>
+        <w:t>25‘ Ausstellung im Kurs: Jeder bringt ein Foto von einem Kunstwerk und hängt es auf. Die KT sprechen über die Kunstwerke. Verwenden Sie die Ausdrücke aus den vorigen Übungen-Sektion</w:t>
+      </w:r>
+    </w:p>
+    <w:p>
+      <w:pPr>
+        <w:pStyle w:val="Normal"/>
+        <w:bidi w:val="0"/>
+        <w:jc w:val="start"/>
+        <w:rPr>
+          <w:lang w:val="de-DE"/>
+        </w:rPr>
+      </w:pPr>
+      <w:r>
+        <w:rPr>
+          <w:i w:val="false"/>
+          <w:iCs w:val="false"/>
+          <w:lang w:val="de-DE"/>
+        </w:rPr>
+        <w:t>----</w:t>
+      </w:r>
+    </w:p>
+    <w:p>
+      <w:pPr>
+        <w:pStyle w:val="Normal"/>
+        <w:bidi w:val="0"/>
+        <w:jc w:val="start"/>
+        <w:rPr>
+          <w:lang w:val="de-DE"/>
+        </w:rPr>
+      </w:pPr>
+      <w:r>
+        <w:rPr>
+          <w:i w:val="false"/>
+          <w:iCs w:val="false"/>
+          <w:lang w:val="de-DE"/>
+        </w:rPr>
+        <w:t>Wir können mehr.</w:t>
+      </w:r>
+    </w:p>
+    <w:p>
+      <w:pPr>
+        <w:pStyle w:val="Normal"/>
+        <w:bidi w:val="0"/>
+        <w:jc w:val="start"/>
+        <w:rPr>
+          <w:lang w:val="de-DE"/>
+        </w:rPr>
+      </w:pPr>
+      <w:r>
+        <w:rPr>
+          <w:i w:val="false"/>
+          <w:iCs w:val="false"/>
+          <w:lang w:val="de-DE"/>
+        </w:rPr>
+        <w:t>20‘ Sind Sie gern kreativ? Haben Sie schon mal Theater gespielt, Bilder gemalt, einen Film gemacht? Erzählen Sie im Kurs.</w:t>
+      </w:r>
+    </w:p>
+    <w:p>
+      <w:pPr>
+        <w:pStyle w:val="Normal"/>
+        <w:bidi w:val="0"/>
+        <w:jc w:val="start"/>
+        <w:rPr>
+          <w:lang w:val="de-DE"/>
+        </w:rPr>
+      </w:pPr>
+      <w:r>
+        <w:rPr>
+          <w:i w:val="false"/>
+          <w:iCs w:val="false"/>
+          <w:lang w:val="de-DE"/>
+        </w:rPr>
+        <w:t>20‘ Lesen Sie das Programm des Bildungszentrums. Sind die Sätze richtig oder falsch? Kreuzen Sie an.</w:t>
       </w:r>
     </w:p>
     <w:p>
@@ -305,6 +555,36 @@
           <w:lang w:val="de-DE"/>
         </w:rPr>
         <w:t>******************************************</w:t>
+      </w:r>
+    </w:p>
+    <w:p>
+      <w:pPr>
+        <w:pStyle w:val="Normal"/>
+        <w:bidi w:val="0"/>
+        <w:jc w:val="start"/>
+        <w:rPr>
+          <w:lang w:val="de-DE"/>
+        </w:rPr>
+      </w:pPr>
+      <w:r>
+        <w:rPr>
+          <w:lang w:val="de-DE"/>
+        </w:rPr>
+      </w:r>
+    </w:p>
+    <w:p>
+      <w:pPr>
+        <w:pStyle w:val="Normal"/>
+        <w:bidi w:val="0"/>
+        <w:jc w:val="start"/>
+        <w:rPr>
+          <w:lang w:val="de-DE"/>
+        </w:rPr>
+      </w:pPr>
+      <w:r>
+        <w:rPr>
+          <w:lang w:val="de-DE"/>
+        </w:rPr>
       </w:r>
     </w:p>
     <w:p>

</xml_diff>

<commit_message>
Ajustes plan de clase de segundo
</commit_message>
<xml_diff>
--- a/planesDeClaseSegundo.docx
+++ b/planesDeClaseSegundo.docx
@@ -341,13 +341,7 @@
         <w:rPr>
           <w:lang w:val="de-DE"/>
         </w:rPr>
-        <w:t>20‘ Gib den K</w:t>
-      </w:r>
-      <w:r>
-        <w:rPr>
-          <w:lang w:val="de-DE"/>
-        </w:rPr>
-        <w:t xml:space="preserve">ursteilnehmern eine Kopie mit Übungen zum Thema „Stellung von </w:t>
+        <w:t xml:space="preserve">20‘ Gib den Kursteilnehmern eine Kopie mit Übungen zum Thema „Stellung von </w:t>
       </w:r>
       <w:r>
         <w:rPr>
@@ -376,7 +370,9 @@
         </w:rPr>
       </w:pPr>
       <w:r>
-        <w:rPr/>
+        <w:rPr>
+          <w:lang w:val="de-DE"/>
+        </w:rPr>
       </w:r>
     </w:p>
     <w:p>

</xml_diff>